<commit_message>
Docs: screenshots in the Insights user guide
25 screenshots of the report engine's screens, each above its topic's steps
with a numbered caption: the editor in both layouts, the views and chart kinds,
comparisons and colours, formulas and shared formulas, parameters, uploads, the
fiscal year, dashboards (editor, free canvas, phone, theme) and Ask for a Report.
docs/tools/capture_insights_shots.py takes them from the /dev playgrounds with
headless Chrome (sample data, no sign-in), cropped to the screen or the dialog.

Co-Authored-By: Claude Opus 5.5 <noreply@anthropic.com>
</commit_message>
<xml_diff>
--- a/docs/manuals/C360_Insights_User_Guide.docx
+++ b/docs/manuals/C360_Insights_User_Guide.docx
@@ -97,7 +97,7 @@
           <w:sz w:val="20"/>
           <w:szCs w:val="20"/>
         </w:rPr>
-        <w:t xml:space="preserve"> are what you see on the screen: a button, a menu item or a field.</w:t>
+        <w:t xml:space="preserve"> are what you see on the screen: a button, a menu item or a field. The screenshots show the screens with sample data.</w:t>
       </w:r>
     </w:p>
     <w:p>
@@ -1576,6 +1576,7 @@
     </w:p>
     <w:p>
       <w:pPr>
+        <w:keepNext/>
         <w:spacing w:after="100"/>
       </w:pPr>
       <w:r>
@@ -1599,6 +1600,220 @@
         <w:t xml:space="preserve">Anyone who can build reports</w:t>
       </w:r>
     </w:p>
+    <w:tbl>
+      <w:tblPr>
+        <w:tblW w:type="dxa" w:w="9870"/>
+        <w:jc w:val="center"/>
+        <w:tblBorders>
+          <w:top w:val="single" w:color="D9DBE3" w:sz="4"/>
+          <w:left w:val="single" w:color="D9DBE3" w:sz="4"/>
+          <w:bottom w:val="single" w:color="D9DBE3" w:sz="4"/>
+          <w:right w:val="single" w:color="D9DBE3" w:sz="4"/>
+          <w:insideH w:val="none"/>
+          <w:insideV w:val="none"/>
+        </w:tblBorders>
+      </w:tblPr>
+      <w:tblGrid>
+        <w:gridCol w:w="9870"/>
+      </w:tblGrid>
+      <w:tr>
+        <w:trPr>
+          <w:cantSplit/>
+        </w:trPr>
+        <w:tc>
+          <w:tcPr>
+            <w:tcW w:type="dxa" w:w="9870"/>
+            <w:tcMar>
+              <w:top w:type="dxa" w:w="40"/>
+              <w:left w:type="dxa" w:w="40"/>
+              <w:bottom w:type="dxa" w:w="40"/>
+              <w:right w:type="dxa" w:w="40"/>
+            </w:tcMar>
+          </w:tcPr>
+          <w:p>
+            <w:pPr>
+              <w:keepNext/>
+              <w:jc w:val="center"/>
+            </w:pPr>
+            <w:r>
+              <w:drawing>
+                <wp:inline distT="0" distB="0" distL="0" distR="0">
+                  <wp:extent cx="6191250" cy="4391025"/>
+                  <wp:effectExtent t="0" r="0" b="0" l="0"/>
+                  <wp:docPr id="1" name="editor-wells" descr="The report editor with Field Wells: the fields on the left, the result in the middle, Rows, Columns, Values and Filters on the right." title="The report editor with Field Wells: the fields on the left, the result in the middle, Rows, Columns, Values and Filters on the right."/>
+                  <wp:cNvGraphicFramePr>
+                    <a:graphicFrameLocks xmlns:a="http://schemas.openxmlformats.org/drawingml/2006/main" noChangeAspect="1"/>
+                  </wp:cNvGraphicFramePr>
+                  <a:graphic xmlns:a="http://schemas.openxmlformats.org/drawingml/2006/main">
+                    <a:graphicData uri="http://schemas.openxmlformats.org/drawingml/2006/picture">
+                      <pic:pic xmlns:pic="http://schemas.openxmlformats.org/drawingml/2006/picture">
+                        <pic:nvPicPr>
+                          <pic:cNvPr id="0" name="" descr=""/>
+                          <pic:cNvPicPr>
+                            <a:picLocks noChangeAspect="1" noChangeArrowheads="1"/>
+                          </pic:cNvPicPr>
+                        </pic:nvPicPr>
+                        <pic:blipFill>
+                          <a:blip r:embed="rId9" cstate="none"/>
+                          <a:srcRect/>
+                          <a:stretch>
+                            <a:fillRect/>
+                          </a:stretch>
+                        </pic:blipFill>
+                        <pic:spPr bwMode="auto">
+                          <a:xfrm>
+                            <a:off x="0" y="0"/>
+                            <a:ext cx="6191250" cy="4391025"/>
+                          </a:xfrm>
+                          <a:prstGeom prst="rect">
+                            <a:avLst/>
+                          </a:prstGeom>
+                        </pic:spPr>
+                      </pic:pic>
+                    </a:graphicData>
+                  </a:graphic>
+                </wp:inline>
+              </w:drawing>
+            </w:r>
+          </w:p>
+        </w:tc>
+      </w:tr>
+    </w:tbl>
+    <w:p>
+      <w:pPr>
+        <w:spacing w:after="200" w:before="80"/>
+        <w:jc w:val="center"/>
+      </w:pPr>
+      <w:r>
+        <w:rPr>
+          <w:rFonts w:ascii="Arial" w:cs="Arial" w:eastAsia="Arial" w:hAnsi="Arial"/>
+          <w:b/>
+          <w:bCs/>
+          <w:color w:val="555B6E"/>
+          <w:sz w:val="17"/>
+          <w:szCs w:val="17"/>
+        </w:rPr>
+        <w:t xml:space="preserve">Figure 1. </w:t>
+      </w:r>
+      <w:r>
+        <w:rPr>
+          <w:rFonts w:ascii="Arial" w:cs="Arial" w:eastAsia="Arial" w:hAnsi="Arial"/>
+          <w:i/>
+          <w:iCs/>
+          <w:color w:val="555B6E"/>
+          <w:sz w:val="17"/>
+          <w:szCs w:val="17"/>
+        </w:rPr>
+        <w:t xml:space="preserve">The report editor with Field Wells: the fields on the left, the result in the middle, Rows, Columns, Values and Filters on the right.</w:t>
+      </w:r>
+    </w:p>
+    <w:tbl>
+      <w:tblPr>
+        <w:tblW w:type="dxa" w:w="9870"/>
+        <w:jc w:val="center"/>
+        <w:tblBorders>
+          <w:top w:val="single" w:color="D9DBE3" w:sz="4"/>
+          <w:left w:val="single" w:color="D9DBE3" w:sz="4"/>
+          <w:bottom w:val="single" w:color="D9DBE3" w:sz="4"/>
+          <w:right w:val="single" w:color="D9DBE3" w:sz="4"/>
+          <w:insideH w:val="none"/>
+          <w:insideV w:val="none"/>
+        </w:tblBorders>
+      </w:tblPr>
+      <w:tblGrid>
+        <w:gridCol w:w="9870"/>
+      </w:tblGrid>
+      <w:tr>
+        <w:trPr>
+          <w:cantSplit/>
+        </w:trPr>
+        <w:tc>
+          <w:tcPr>
+            <w:tcW w:type="dxa" w:w="9870"/>
+            <w:tcMar>
+              <w:top w:type="dxa" w:w="40"/>
+              <w:left w:type="dxa" w:w="40"/>
+              <w:bottom w:type="dxa" w:w="40"/>
+              <w:right w:type="dxa" w:w="40"/>
+            </w:tcMar>
+          </w:tcPr>
+          <w:p>
+            <w:pPr>
+              <w:keepNext/>
+              <w:jc w:val="center"/>
+            </w:pPr>
+            <w:r>
+              <w:drawing>
+                <wp:inline distT="0" distB="0" distL="0" distR="0">
+                  <wp:extent cx="6191250" cy="3800475"/>
+                  <wp:effectExtent t="0" r="0" b="0" l="0"/>
+                  <wp:docPr id="1" name="editor-steps" descr="The same report in the Steps editor: Data, Filter, Summarize, Group By, Sort and Limit, with the result underneath." title="The same report in the Steps editor: Data, Filter, Summarize, Group By, Sort and Limit, with the result underneath."/>
+                  <wp:cNvGraphicFramePr>
+                    <a:graphicFrameLocks xmlns:a="http://schemas.openxmlformats.org/drawingml/2006/main" noChangeAspect="1"/>
+                  </wp:cNvGraphicFramePr>
+                  <a:graphic xmlns:a="http://schemas.openxmlformats.org/drawingml/2006/main">
+                    <a:graphicData uri="http://schemas.openxmlformats.org/drawingml/2006/picture">
+                      <pic:pic xmlns:pic="http://schemas.openxmlformats.org/drawingml/2006/picture">
+                        <pic:nvPicPr>
+                          <pic:cNvPr id="0" name="" descr=""/>
+                          <pic:cNvPicPr>
+                            <a:picLocks noChangeAspect="1" noChangeArrowheads="1"/>
+                          </pic:cNvPicPr>
+                        </pic:nvPicPr>
+                        <pic:blipFill>
+                          <a:blip r:embed="rId10" cstate="none"/>
+                          <a:srcRect/>
+                          <a:stretch>
+                            <a:fillRect/>
+                          </a:stretch>
+                        </pic:blipFill>
+                        <pic:spPr bwMode="auto">
+                          <a:xfrm>
+                            <a:off x="0" y="0"/>
+                            <a:ext cx="6191250" cy="3800475"/>
+                          </a:xfrm>
+                          <a:prstGeom prst="rect">
+                            <a:avLst/>
+                          </a:prstGeom>
+                        </pic:spPr>
+                      </pic:pic>
+                    </a:graphicData>
+                  </a:graphic>
+                </wp:inline>
+              </w:drawing>
+            </w:r>
+          </w:p>
+        </w:tc>
+      </w:tr>
+    </w:tbl>
+    <w:p>
+      <w:pPr>
+        <w:spacing w:after="200" w:before="80"/>
+        <w:jc w:val="center"/>
+      </w:pPr>
+      <w:r>
+        <w:rPr>
+          <w:rFonts w:ascii="Arial" w:cs="Arial" w:eastAsia="Arial" w:hAnsi="Arial"/>
+          <w:b/>
+          <w:bCs/>
+          <w:color w:val="555B6E"/>
+          <w:sz w:val="17"/>
+          <w:szCs w:val="17"/>
+        </w:rPr>
+        <w:t xml:space="preserve">Figure 2. </w:t>
+      </w:r>
+      <w:r>
+        <w:rPr>
+          <w:rFonts w:ascii="Arial" w:cs="Arial" w:eastAsia="Arial" w:hAnsi="Arial"/>
+          <w:i/>
+          <w:iCs/>
+          <w:color w:val="555B6E"/>
+          <w:sz w:val="17"/>
+          <w:szCs w:val="17"/>
+        </w:rPr>
+        <w:t xml:space="preserve">The same report in the Steps editor: Data, Filter, Summarize, Group By, Sort and Limit, with the result underneath.</w:t>
+      </w:r>
+    </w:p>
     <w:p>
       <w:pPr>
         <w:pStyle w:val="ListParagraph"/>
@@ -1936,6 +2151,113 @@
           <w:rFonts w:ascii="Arial" w:cs="Arial" w:eastAsia="Arial" w:hAnsi="Arial"/>
         </w:rPr>
         <w:t xml:space="preserve">The Four Views</w:t>
+      </w:r>
+    </w:p>
+    <w:tbl>
+      <w:tblPr>
+        <w:tblW w:type="dxa" w:w="9870"/>
+        <w:jc w:val="center"/>
+        <w:tblBorders>
+          <w:top w:val="single" w:color="D9DBE3" w:sz="4"/>
+          <w:left w:val="single" w:color="D9DBE3" w:sz="4"/>
+          <w:bottom w:val="single" w:color="D9DBE3" w:sz="4"/>
+          <w:right w:val="single" w:color="D9DBE3" w:sz="4"/>
+          <w:insideH w:val="none"/>
+          <w:insideV w:val="none"/>
+        </w:tblBorders>
+      </w:tblPr>
+      <w:tblGrid>
+        <w:gridCol w:w="9870"/>
+      </w:tblGrid>
+      <w:tr>
+        <w:trPr>
+          <w:cantSplit/>
+        </w:trPr>
+        <w:tc>
+          <w:tcPr>
+            <w:tcW w:type="dxa" w:w="9870"/>
+            <w:tcMar>
+              <w:top w:type="dxa" w:w="40"/>
+              <w:left w:type="dxa" w:w="40"/>
+              <w:bottom w:type="dxa" w:w="40"/>
+              <w:right w:type="dxa" w:w="40"/>
+            </w:tcMar>
+          </w:tcPr>
+          <w:p>
+            <w:pPr>
+              <w:keepNext/>
+              <w:jc w:val="center"/>
+            </w:pPr>
+            <w:r>
+              <w:drawing>
+                <wp:inline distT="0" distB="0" distL="0" distR="0">
+                  <wp:extent cx="6191250" cy="3676650"/>
+                  <wp:effectExtent t="0" r="0" b="0" l="0"/>
+                  <wp:docPr id="1" name="view-pivot" descr="The Pivot view: Sent by month down the side, Channel across, a total on both edges." title="The Pivot view: Sent by month down the side, Channel across, a total on both edges."/>
+                  <wp:cNvGraphicFramePr>
+                    <a:graphicFrameLocks xmlns:a="http://schemas.openxmlformats.org/drawingml/2006/main" noChangeAspect="1"/>
+                  </wp:cNvGraphicFramePr>
+                  <a:graphic xmlns:a="http://schemas.openxmlformats.org/drawingml/2006/main">
+                    <a:graphicData uri="http://schemas.openxmlformats.org/drawingml/2006/picture">
+                      <pic:pic xmlns:pic="http://schemas.openxmlformats.org/drawingml/2006/picture">
+                        <pic:nvPicPr>
+                          <pic:cNvPr id="0" name="" descr=""/>
+                          <pic:cNvPicPr>
+                            <a:picLocks noChangeAspect="1" noChangeArrowheads="1"/>
+                          </pic:cNvPicPr>
+                        </pic:nvPicPr>
+                        <pic:blipFill>
+                          <a:blip r:embed="rId11" cstate="none"/>
+                          <a:srcRect/>
+                          <a:stretch>
+                            <a:fillRect/>
+                          </a:stretch>
+                        </pic:blipFill>
+                        <pic:spPr bwMode="auto">
+                          <a:xfrm>
+                            <a:off x="0" y="0"/>
+                            <a:ext cx="6191250" cy="3676650"/>
+                          </a:xfrm>
+                          <a:prstGeom prst="rect">
+                            <a:avLst/>
+                          </a:prstGeom>
+                        </pic:spPr>
+                      </pic:pic>
+                    </a:graphicData>
+                  </a:graphic>
+                </wp:inline>
+              </w:drawing>
+            </w:r>
+          </w:p>
+        </w:tc>
+      </w:tr>
+    </w:tbl>
+    <w:p>
+      <w:pPr>
+        <w:spacing w:after="200" w:before="80"/>
+        <w:jc w:val="center"/>
+      </w:pPr>
+      <w:r>
+        <w:rPr>
+          <w:rFonts w:ascii="Arial" w:cs="Arial" w:eastAsia="Arial" w:hAnsi="Arial"/>
+          <w:b/>
+          <w:bCs/>
+          <w:color w:val="555B6E"/>
+          <w:sz w:val="17"/>
+          <w:szCs w:val="17"/>
+        </w:rPr>
+        <w:t xml:space="preserve">Figure 3. </w:t>
+      </w:r>
+      <w:r>
+        <w:rPr>
+          <w:rFonts w:ascii="Arial" w:cs="Arial" w:eastAsia="Arial" w:hAnsi="Arial"/>
+          <w:i/>
+          <w:iCs/>
+          <w:color w:val="555B6E"/>
+          <w:sz w:val="17"/>
+          <w:szCs w:val="17"/>
+        </w:rPr>
+        <w:t xml:space="preserve">The Pivot view: Sent by month down the side, Channel across, a total on both edges.</w:t>
       </w:r>
     </w:p>
     <w:p>
@@ -2951,6 +3273,7 @@
     </w:p>
     <w:p>
       <w:pPr>
+        <w:keepNext/>
         <w:spacing w:after="100"/>
       </w:pPr>
       <w:r>
@@ -3125,6 +3448,113 @@
         <w:t xml:space="preserve">Compare a measure with an earlier period</w:t>
       </w:r>
     </w:p>
+    <w:tbl>
+      <w:tblPr>
+        <w:tblW w:type="dxa" w:w="9870"/>
+        <w:jc w:val="center"/>
+        <w:tblBorders>
+          <w:top w:val="single" w:color="D9DBE3" w:sz="4"/>
+          <w:left w:val="single" w:color="D9DBE3" w:sz="4"/>
+          <w:bottom w:val="single" w:color="D9DBE3" w:sz="4"/>
+          <w:right w:val="single" w:color="D9DBE3" w:sz="4"/>
+          <w:insideH w:val="none"/>
+          <w:insideV w:val="none"/>
+        </w:tblBorders>
+      </w:tblPr>
+      <w:tblGrid>
+        <w:gridCol w:w="9870"/>
+      </w:tblGrid>
+      <w:tr>
+        <w:trPr>
+          <w:cantSplit/>
+        </w:trPr>
+        <w:tc>
+          <w:tcPr>
+            <w:tcW w:type="dxa" w:w="9870"/>
+            <w:tcMar>
+              <w:top w:type="dxa" w:w="40"/>
+              <w:left w:type="dxa" w:w="40"/>
+              <w:bottom w:type="dxa" w:w="40"/>
+              <w:right w:type="dxa" w:w="40"/>
+            </w:tcMar>
+          </w:tcPr>
+          <w:p>
+            <w:pPr>
+              <w:keepNext/>
+              <w:jc w:val="center"/>
+            </w:pPr>
+            <w:r>
+              <w:drawing>
+                <wp:inline distT="0" distB="0" distL="0" distR="0">
+                  <wp:extent cx="6191250" cy="3676650"/>
+                  <wp:effectExtent t="0" r="0" b="0" l="0"/>
+                  <wp:docPr id="1" name="compare" descr="Sent Count with Previous Month and Change vs Last Year: each comparison is a column after its measure." title="Sent Count with Previous Month and Change vs Last Year: each comparison is a column after its measure."/>
+                  <wp:cNvGraphicFramePr>
+                    <a:graphicFrameLocks xmlns:a="http://schemas.openxmlformats.org/drawingml/2006/main" noChangeAspect="1"/>
+                  </wp:cNvGraphicFramePr>
+                  <a:graphic xmlns:a="http://schemas.openxmlformats.org/drawingml/2006/main">
+                    <a:graphicData uri="http://schemas.openxmlformats.org/drawingml/2006/picture">
+                      <pic:pic xmlns:pic="http://schemas.openxmlformats.org/drawingml/2006/picture">
+                        <pic:nvPicPr>
+                          <pic:cNvPr id="0" name="" descr=""/>
+                          <pic:cNvPicPr>
+                            <a:picLocks noChangeAspect="1" noChangeArrowheads="1"/>
+                          </pic:cNvPicPr>
+                        </pic:nvPicPr>
+                        <pic:blipFill>
+                          <a:blip r:embed="rId12" cstate="none"/>
+                          <a:srcRect/>
+                          <a:stretch>
+                            <a:fillRect/>
+                          </a:stretch>
+                        </pic:blipFill>
+                        <pic:spPr bwMode="auto">
+                          <a:xfrm>
+                            <a:off x="0" y="0"/>
+                            <a:ext cx="6191250" cy="3676650"/>
+                          </a:xfrm>
+                          <a:prstGeom prst="rect">
+                            <a:avLst/>
+                          </a:prstGeom>
+                        </pic:spPr>
+                      </pic:pic>
+                    </a:graphicData>
+                  </a:graphic>
+                </wp:inline>
+              </w:drawing>
+            </w:r>
+          </w:p>
+        </w:tc>
+      </w:tr>
+    </w:tbl>
+    <w:p>
+      <w:pPr>
+        <w:spacing w:after="200" w:before="80"/>
+        <w:jc w:val="center"/>
+      </w:pPr>
+      <w:r>
+        <w:rPr>
+          <w:rFonts w:ascii="Arial" w:cs="Arial" w:eastAsia="Arial" w:hAnsi="Arial"/>
+          <w:b/>
+          <w:bCs/>
+          <w:color w:val="555B6E"/>
+          <w:sz w:val="17"/>
+          <w:szCs w:val="17"/>
+        </w:rPr>
+        <w:t xml:space="preserve">Figure 4. </w:t>
+      </w:r>
+      <w:r>
+        <w:rPr>
+          <w:rFonts w:ascii="Arial" w:cs="Arial" w:eastAsia="Arial" w:hAnsi="Arial"/>
+          <w:i/>
+          <w:iCs/>
+          <w:color w:val="555B6E"/>
+          <w:sz w:val="17"/>
+          <w:szCs w:val="17"/>
+        </w:rPr>
+        <w:t xml:space="preserve">Sent Count with Previous Month and Change vs Last Year: each comparison is a column after its measure.</w:t>
+      </w:r>
+    </w:p>
     <w:p>
       <w:pPr>
         <w:pStyle w:val="ListParagraph"/>
@@ -3703,6 +4133,7 @@
     </w:p>
     <w:p>
       <w:pPr>
+        <w:keepNext/>
         <w:spacing w:after="100"/>
       </w:pPr>
       <w:r>
@@ -3724,6 +4155,113 @@
           <w:szCs w:val="18"/>
         </w:rPr>
         <w:t xml:space="preserve">Workspace administrators</w:t>
+      </w:r>
+    </w:p>
+    <w:tbl>
+      <w:tblPr>
+        <w:tblW w:type="dxa" w:w="9870"/>
+        <w:jc w:val="center"/>
+        <w:tblBorders>
+          <w:top w:val="single" w:color="D9DBE3" w:sz="4"/>
+          <w:left w:val="single" w:color="D9DBE3" w:sz="4"/>
+          <w:bottom w:val="single" w:color="D9DBE3" w:sz="4"/>
+          <w:right w:val="single" w:color="D9DBE3" w:sz="4"/>
+          <w:insideH w:val="none"/>
+          <w:insideV w:val="none"/>
+        </w:tblBorders>
+      </w:tblPr>
+      <w:tblGrid>
+        <w:gridCol w:w="9870"/>
+      </w:tblGrid>
+      <w:tr>
+        <w:trPr>
+          <w:cantSplit/>
+        </w:trPr>
+        <w:tc>
+          <w:tcPr>
+            <w:tcW w:type="dxa" w:w="9870"/>
+            <w:tcMar>
+              <w:top w:type="dxa" w:w="40"/>
+              <w:left w:type="dxa" w:w="40"/>
+              <w:bottom w:type="dxa" w:w="40"/>
+              <w:right w:type="dxa" w:w="40"/>
+            </w:tcMar>
+          </w:tcPr>
+          <w:p>
+            <w:pPr>
+              <w:keepNext/>
+              <w:jc w:val="center"/>
+            </w:pPr>
+            <w:r>
+              <w:drawing>
+                <wp:inline distT="0" distB="0" distL="0" distR="0">
+                  <wp:extent cx="6191250" cy="1790700"/>
+                  <wp:effectExtent t="0" r="0" b="0" l="0"/>
+                  <wp:docPr id="1" name="fiscal" descr="Settings → Fiscal Year: the month it starts in and how the year is named, with an example." title="Settings → Fiscal Year: the month it starts in and how the year is named, with an example."/>
+                  <wp:cNvGraphicFramePr>
+                    <a:graphicFrameLocks xmlns:a="http://schemas.openxmlformats.org/drawingml/2006/main" noChangeAspect="1"/>
+                  </wp:cNvGraphicFramePr>
+                  <a:graphic xmlns:a="http://schemas.openxmlformats.org/drawingml/2006/main">
+                    <a:graphicData uri="http://schemas.openxmlformats.org/drawingml/2006/picture">
+                      <pic:pic xmlns:pic="http://schemas.openxmlformats.org/drawingml/2006/picture">
+                        <pic:nvPicPr>
+                          <pic:cNvPr id="0" name="" descr=""/>
+                          <pic:cNvPicPr>
+                            <a:picLocks noChangeAspect="1" noChangeArrowheads="1"/>
+                          </pic:cNvPicPr>
+                        </pic:nvPicPr>
+                        <pic:blipFill>
+                          <a:blip r:embed="rId13" cstate="none"/>
+                          <a:srcRect/>
+                          <a:stretch>
+                            <a:fillRect/>
+                          </a:stretch>
+                        </pic:blipFill>
+                        <pic:spPr bwMode="auto">
+                          <a:xfrm>
+                            <a:off x="0" y="0"/>
+                            <a:ext cx="6191250" cy="1790700"/>
+                          </a:xfrm>
+                          <a:prstGeom prst="rect">
+                            <a:avLst/>
+                          </a:prstGeom>
+                        </pic:spPr>
+                      </pic:pic>
+                    </a:graphicData>
+                  </a:graphic>
+                </wp:inline>
+              </w:drawing>
+            </w:r>
+          </w:p>
+        </w:tc>
+      </w:tr>
+    </w:tbl>
+    <w:p>
+      <w:pPr>
+        <w:spacing w:after="200" w:before="80"/>
+        <w:jc w:val="center"/>
+      </w:pPr>
+      <w:r>
+        <w:rPr>
+          <w:rFonts w:ascii="Arial" w:cs="Arial" w:eastAsia="Arial" w:hAnsi="Arial"/>
+          <w:b/>
+          <w:bCs/>
+          <w:color w:val="555B6E"/>
+          <w:sz w:val="17"/>
+          <w:szCs w:val="17"/>
+        </w:rPr>
+        <w:t xml:space="preserve">Figure 5. </w:t>
+      </w:r>
+      <w:r>
+        <w:rPr>
+          <w:rFonts w:ascii="Arial" w:cs="Arial" w:eastAsia="Arial" w:hAnsi="Arial"/>
+          <w:i/>
+          <w:iCs/>
+          <w:color w:val="555B6E"/>
+          <w:sz w:val="17"/>
+          <w:szCs w:val="17"/>
+        </w:rPr>
+        <w:t xml:space="preserve">Settings → Fiscal Year: the month it starts in and how the year is named, with an example.</w:t>
       </w:r>
     </w:p>
     <w:p>
@@ -4315,6 +4853,7 @@
     </w:p>
     <w:p>
       <w:pPr>
+        <w:keepNext/>
         <w:spacing w:after="100"/>
       </w:pPr>
       <w:r>
@@ -4695,6 +5234,113 @@
         <w:t xml:space="preserve">Write a measure formula, such as a rate or a filtered total</w:t>
       </w:r>
     </w:p>
+    <w:tbl>
+      <w:tblPr>
+        <w:tblW w:type="dxa" w:w="9825"/>
+        <w:jc w:val="center"/>
+        <w:tblBorders>
+          <w:top w:val="single" w:color="D9DBE3" w:sz="4"/>
+          <w:left w:val="single" w:color="D9DBE3" w:sz="4"/>
+          <w:bottom w:val="single" w:color="D9DBE3" w:sz="4"/>
+          <w:right w:val="single" w:color="D9DBE3" w:sz="4"/>
+          <w:insideH w:val="none"/>
+          <w:insideV w:val="none"/>
+        </w:tblBorders>
+      </w:tblPr>
+      <w:tblGrid>
+        <w:gridCol w:w="9825"/>
+      </w:tblGrid>
+      <w:tr>
+        <w:trPr>
+          <w:cantSplit/>
+        </w:trPr>
+        <w:tc>
+          <w:tcPr>
+            <w:tcW w:type="dxa" w:w="9825"/>
+            <w:tcMar>
+              <w:top w:type="dxa" w:w="40"/>
+              <w:left w:type="dxa" w:w="40"/>
+              <w:bottom w:type="dxa" w:w="40"/>
+              <w:right w:type="dxa" w:w="40"/>
+            </w:tcMar>
+          </w:tcPr>
+          <w:p>
+            <w:pPr>
+              <w:keepNext/>
+              <w:jc w:val="center"/>
+            </w:pPr>
+            <w:r>
+              <w:drawing>
+                <wp:inline distT="0" distB="0" distL="0" distR="0">
+                  <wp:extent cx="6162675" cy="5334000"/>
+                  <wp:effectExtent t="0" r="0" b="0" l="0"/>
+                  <wp:docPr id="1" name="formula" descr="A measure formula in Custom Fields: the line under it says what it works out; fields and functions to put in sit below." title="A measure formula in Custom Fields: the line under it says what it works out; fields and functions to put in sit below."/>
+                  <wp:cNvGraphicFramePr>
+                    <a:graphicFrameLocks xmlns:a="http://schemas.openxmlformats.org/drawingml/2006/main" noChangeAspect="1"/>
+                  </wp:cNvGraphicFramePr>
+                  <a:graphic xmlns:a="http://schemas.openxmlformats.org/drawingml/2006/main">
+                    <a:graphicData uri="http://schemas.openxmlformats.org/drawingml/2006/picture">
+                      <pic:pic xmlns:pic="http://schemas.openxmlformats.org/drawingml/2006/picture">
+                        <pic:nvPicPr>
+                          <pic:cNvPr id="0" name="" descr=""/>
+                          <pic:cNvPicPr>
+                            <a:picLocks noChangeAspect="1" noChangeArrowheads="1"/>
+                          </pic:cNvPicPr>
+                        </pic:nvPicPr>
+                        <pic:blipFill>
+                          <a:blip r:embed="rId14" cstate="none"/>
+                          <a:srcRect/>
+                          <a:stretch>
+                            <a:fillRect/>
+                          </a:stretch>
+                        </pic:blipFill>
+                        <pic:spPr bwMode="auto">
+                          <a:xfrm>
+                            <a:off x="0" y="0"/>
+                            <a:ext cx="6162675" cy="5334000"/>
+                          </a:xfrm>
+                          <a:prstGeom prst="rect">
+                            <a:avLst/>
+                          </a:prstGeom>
+                        </pic:spPr>
+                      </pic:pic>
+                    </a:graphicData>
+                  </a:graphic>
+                </wp:inline>
+              </w:drawing>
+            </w:r>
+          </w:p>
+        </w:tc>
+      </w:tr>
+    </w:tbl>
+    <w:p>
+      <w:pPr>
+        <w:spacing w:after="200" w:before="80"/>
+        <w:jc w:val="center"/>
+      </w:pPr>
+      <w:r>
+        <w:rPr>
+          <w:rFonts w:ascii="Arial" w:cs="Arial" w:eastAsia="Arial" w:hAnsi="Arial"/>
+          <w:b/>
+          <w:bCs/>
+          <w:color w:val="555B6E"/>
+          <w:sz w:val="17"/>
+          <w:szCs w:val="17"/>
+        </w:rPr>
+        <w:t xml:space="preserve">Figure 6. </w:t>
+      </w:r>
+      <w:r>
+        <w:rPr>
+          <w:rFonts w:ascii="Arial" w:cs="Arial" w:eastAsia="Arial" w:hAnsi="Arial"/>
+          <w:i/>
+          <w:iCs/>
+          <w:color w:val="555B6E"/>
+          <w:sz w:val="17"/>
+          <w:szCs w:val="17"/>
+        </w:rPr>
+        <w:t xml:space="preserve">A measure formula in Custom Fields: the line under it says what it works out; fields and functions to put in sit below.</w:t>
+      </w:r>
+    </w:p>
     <w:p>
       <w:pPr>
         <w:pStyle w:val="ListParagraph"/>
@@ -4942,6 +5588,113 @@
           <w:rFonts w:ascii="Arial" w:cs="Arial" w:eastAsia="Arial" w:hAnsi="Arial"/>
         </w:rPr>
         <w:t xml:space="preserve">Show a share of the total, a rank, year to date or last year in a measure formula</w:t>
+      </w:r>
+    </w:p>
+    <w:tbl>
+      <w:tblPr>
+        <w:tblW w:type="dxa" w:w="8775"/>
+        <w:jc w:val="center"/>
+        <w:tblBorders>
+          <w:top w:val="single" w:color="D9DBE3" w:sz="4"/>
+          <w:left w:val="single" w:color="D9DBE3" w:sz="4"/>
+          <w:bottom w:val="single" w:color="D9DBE3" w:sz="4"/>
+          <w:right w:val="single" w:color="D9DBE3" w:sz="4"/>
+          <w:insideH w:val="none"/>
+          <w:insideV w:val="none"/>
+        </w:tblBorders>
+      </w:tblPr>
+      <w:tblGrid>
+        <w:gridCol w:w="8775"/>
+      </w:tblGrid>
+      <w:tr>
+        <w:trPr>
+          <w:cantSplit/>
+        </w:trPr>
+        <w:tc>
+          <w:tcPr>
+            <w:tcW w:type="dxa" w:w="8775"/>
+            <w:tcMar>
+              <w:top w:type="dxa" w:w="40"/>
+              <w:left w:type="dxa" w:w="40"/>
+              <w:bottom w:type="dxa" w:w="40"/>
+              <w:right w:type="dxa" w:w="40"/>
+            </w:tcMar>
+          </w:tcPr>
+          <w:p>
+            <w:pPr>
+              <w:keepNext/>
+              <w:jc w:val="center"/>
+            </w:pPr>
+            <w:r>
+              <w:drawing>
+                <wp:inline distT="0" distB="0" distL="0" distR="0">
+                  <wp:extent cx="5495925" cy="5334000"/>
+                  <wp:effectExtent t="0" r="0" b="0" l="0"/>
+                  <wp:docPr id="1" name="shared-edit" descr="A share of the total with CALCULATE and ALL. The check says it is worked out over the report's rows." title="A share of the total with CALCULATE and ALL. The check says it is worked out over the report's rows."/>
+                  <wp:cNvGraphicFramePr>
+                    <a:graphicFrameLocks xmlns:a="http://schemas.openxmlformats.org/drawingml/2006/main" noChangeAspect="1"/>
+                  </wp:cNvGraphicFramePr>
+                  <a:graphic xmlns:a="http://schemas.openxmlformats.org/drawingml/2006/main">
+                    <a:graphicData uri="http://schemas.openxmlformats.org/drawingml/2006/picture">
+                      <pic:pic xmlns:pic="http://schemas.openxmlformats.org/drawingml/2006/picture">
+                        <pic:nvPicPr>
+                          <pic:cNvPr id="0" name="" descr=""/>
+                          <pic:cNvPicPr>
+                            <a:picLocks noChangeAspect="1" noChangeArrowheads="1"/>
+                          </pic:cNvPicPr>
+                        </pic:nvPicPr>
+                        <pic:blipFill>
+                          <a:blip r:embed="rId15" cstate="none"/>
+                          <a:srcRect/>
+                          <a:stretch>
+                            <a:fillRect/>
+                          </a:stretch>
+                        </pic:blipFill>
+                        <pic:spPr bwMode="auto">
+                          <a:xfrm>
+                            <a:off x="0" y="0"/>
+                            <a:ext cx="5495925" cy="5334000"/>
+                          </a:xfrm>
+                          <a:prstGeom prst="rect">
+                            <a:avLst/>
+                          </a:prstGeom>
+                        </pic:spPr>
+                      </pic:pic>
+                    </a:graphicData>
+                  </a:graphic>
+                </wp:inline>
+              </w:drawing>
+            </w:r>
+          </w:p>
+        </w:tc>
+      </w:tr>
+    </w:tbl>
+    <w:p>
+      <w:pPr>
+        <w:spacing w:after="200" w:before="80"/>
+        <w:jc w:val="center"/>
+      </w:pPr>
+      <w:r>
+        <w:rPr>
+          <w:rFonts w:ascii="Arial" w:cs="Arial" w:eastAsia="Arial" w:hAnsi="Arial"/>
+          <w:b/>
+          <w:bCs/>
+          <w:color w:val="555B6E"/>
+          <w:sz w:val="17"/>
+          <w:szCs w:val="17"/>
+        </w:rPr>
+        <w:t xml:space="preserve">Figure 7. </w:t>
+      </w:r>
+      <w:r>
+        <w:rPr>
+          <w:rFonts w:ascii="Arial" w:cs="Arial" w:eastAsia="Arial" w:hAnsi="Arial"/>
+          <w:i/>
+          <w:iCs/>
+          <w:color w:val="555B6E"/>
+          <w:sz w:val="17"/>
+          <w:szCs w:val="17"/>
+        </w:rPr>
+        <w:t xml:space="preserve">A share of the total with CALCULATE and ALL. The check says it is worked out over the report's rows.</w:t>
       </w:r>
     </w:p>
     <w:p>
@@ -5346,6 +6099,7 @@
     </w:p>
     <w:p>
       <w:pPr>
+        <w:keepNext/>
         <w:spacing w:after="100"/>
       </w:pPr>
       <w:r>
@@ -5369,6 +6123,113 @@
         <w:t xml:space="preserve">Anyone who can build reports</w:t>
       </w:r>
     </w:p>
+    <w:tbl>
+      <w:tblPr>
+        <w:tblW w:type="dxa" w:w="9870"/>
+        <w:jc w:val="center"/>
+        <w:tblBorders>
+          <w:top w:val="single" w:color="D9DBE3" w:sz="4"/>
+          <w:left w:val="single" w:color="D9DBE3" w:sz="4"/>
+          <w:bottom w:val="single" w:color="D9DBE3" w:sz="4"/>
+          <w:right w:val="single" w:color="D9DBE3" w:sz="4"/>
+          <w:insideH w:val="none"/>
+          <w:insideV w:val="none"/>
+        </w:tblBorders>
+      </w:tblPr>
+      <w:tblGrid>
+        <w:gridCol w:w="9870"/>
+      </w:tblGrid>
+      <w:tr>
+        <w:trPr>
+          <w:cantSplit/>
+        </w:trPr>
+        <w:tc>
+          <w:tcPr>
+            <w:tcW w:type="dxa" w:w="9870"/>
+            <w:tcMar>
+              <w:top w:type="dxa" w:w="40"/>
+              <w:left w:type="dxa" w:w="40"/>
+              <w:bottom w:type="dxa" w:w="40"/>
+              <w:right w:type="dxa" w:w="40"/>
+            </w:tcMar>
+          </w:tcPr>
+          <w:p>
+            <w:pPr>
+              <w:keepNext/>
+              <w:jc w:val="center"/>
+            </w:pPr>
+            <w:r>
+              <w:drawing>
+                <wp:inline distT="0" distB="0" distL="0" distR="0">
+                  <wp:extent cx="6191250" cy="2800350"/>
+                  <wp:effectExtent t="0" r="0" b="0" l="0"/>
+                  <wp:docPr id="1" name="shared" descr="Insights → Shared Formulas: each formula with its kind, its Certified mark and the reports that use it." title="Insights → Shared Formulas: each formula with its kind, its Certified mark and the reports that use it."/>
+                  <wp:cNvGraphicFramePr>
+                    <a:graphicFrameLocks xmlns:a="http://schemas.openxmlformats.org/drawingml/2006/main" noChangeAspect="1"/>
+                  </wp:cNvGraphicFramePr>
+                  <a:graphic xmlns:a="http://schemas.openxmlformats.org/drawingml/2006/main">
+                    <a:graphicData uri="http://schemas.openxmlformats.org/drawingml/2006/picture">
+                      <pic:pic xmlns:pic="http://schemas.openxmlformats.org/drawingml/2006/picture">
+                        <pic:nvPicPr>
+                          <pic:cNvPr id="0" name="" descr=""/>
+                          <pic:cNvPicPr>
+                            <a:picLocks noChangeAspect="1" noChangeArrowheads="1"/>
+                          </pic:cNvPicPr>
+                        </pic:nvPicPr>
+                        <pic:blipFill>
+                          <a:blip r:embed="rId16" cstate="none"/>
+                          <a:srcRect/>
+                          <a:stretch>
+                            <a:fillRect/>
+                          </a:stretch>
+                        </pic:blipFill>
+                        <pic:spPr bwMode="auto">
+                          <a:xfrm>
+                            <a:off x="0" y="0"/>
+                            <a:ext cx="6191250" cy="2800350"/>
+                          </a:xfrm>
+                          <a:prstGeom prst="rect">
+                            <a:avLst/>
+                          </a:prstGeom>
+                        </pic:spPr>
+                      </pic:pic>
+                    </a:graphicData>
+                  </a:graphic>
+                </wp:inline>
+              </w:drawing>
+            </w:r>
+          </w:p>
+        </w:tc>
+      </w:tr>
+    </w:tbl>
+    <w:p>
+      <w:pPr>
+        <w:spacing w:after="200" w:before="80"/>
+        <w:jc w:val="center"/>
+      </w:pPr>
+      <w:r>
+        <w:rPr>
+          <w:rFonts w:ascii="Arial" w:cs="Arial" w:eastAsia="Arial" w:hAnsi="Arial"/>
+          <w:b/>
+          <w:bCs/>
+          <w:color w:val="555B6E"/>
+          <w:sz w:val="17"/>
+          <w:szCs w:val="17"/>
+        </w:rPr>
+        <w:t xml:space="preserve">Figure 8. </w:t>
+      </w:r>
+      <w:r>
+        <w:rPr>
+          <w:rFonts w:ascii="Arial" w:cs="Arial" w:eastAsia="Arial" w:hAnsi="Arial"/>
+          <w:i/>
+          <w:iCs/>
+          <w:color w:val="555B6E"/>
+          <w:sz w:val="17"/>
+          <w:szCs w:val="17"/>
+        </w:rPr>
+        <w:t xml:space="preserve">Insights → Shared Formulas: each formula with its kind, its Certified mark and the reports that use it.</w:t>
+      </w:r>
+    </w:p>
     <w:p>
       <w:pPr>
         <w:pStyle w:val="ListParagraph"/>
@@ -5687,6 +6548,7 @@
     </w:p>
     <w:p>
       <w:pPr>
+        <w:keepNext/>
         <w:spacing w:after="100"/>
       </w:pPr>
       <w:r>
@@ -11557,6 +12419,113 @@
         <w:t xml:space="preserve">Stack the bars, or combine bars and a line</w:t>
       </w:r>
     </w:p>
+    <w:tbl>
+      <w:tblPr>
+        <w:tblW w:type="dxa" w:w="9870"/>
+        <w:jc w:val="center"/>
+        <w:tblBorders>
+          <w:top w:val="single" w:color="D9DBE3" w:sz="4"/>
+          <w:left w:val="single" w:color="D9DBE3" w:sz="4"/>
+          <w:bottom w:val="single" w:color="D9DBE3" w:sz="4"/>
+          <w:right w:val="single" w:color="D9DBE3" w:sz="4"/>
+          <w:insideH w:val="none"/>
+          <w:insideV w:val="none"/>
+        </w:tblBorders>
+      </w:tblPr>
+      <w:tblGrid>
+        <w:gridCol w:w="9870"/>
+      </w:tblGrid>
+      <w:tr>
+        <w:trPr>
+          <w:cantSplit/>
+        </w:trPr>
+        <w:tc>
+          <w:tcPr>
+            <w:tcW w:type="dxa" w:w="9870"/>
+            <w:tcMar>
+              <w:top w:type="dxa" w:w="40"/>
+              <w:left w:type="dxa" w:w="40"/>
+              <w:bottom w:type="dxa" w:w="40"/>
+              <w:right w:type="dxa" w:w="40"/>
+            </w:tcMar>
+          </w:tcPr>
+          <w:p>
+            <w:pPr>
+              <w:keepNext/>
+              <w:jc w:val="center"/>
+            </w:pPr>
+            <w:r>
+              <w:drawing>
+                <wp:inline distT="0" distB="0" distL="0" distR="0">
+                  <wp:extent cx="6191250" cy="3981450"/>
+                  <wp:effectExtent t="0" r="0" b="0" l="0"/>
+                  <wp:docPr id="1" name="chart-stacked" descr="A stacked chart: each month one bar, the channels on top of each other. Combo and 100% Stacked sit beside it." title="A stacked chart: each month one bar, the channels on top of each other. Combo and 100% Stacked sit beside it."/>
+                  <wp:cNvGraphicFramePr>
+                    <a:graphicFrameLocks xmlns:a="http://schemas.openxmlformats.org/drawingml/2006/main" noChangeAspect="1"/>
+                  </wp:cNvGraphicFramePr>
+                  <a:graphic xmlns:a="http://schemas.openxmlformats.org/drawingml/2006/main">
+                    <a:graphicData uri="http://schemas.openxmlformats.org/drawingml/2006/picture">
+                      <pic:pic xmlns:pic="http://schemas.openxmlformats.org/drawingml/2006/picture">
+                        <pic:nvPicPr>
+                          <pic:cNvPr id="0" name="" descr=""/>
+                          <pic:cNvPicPr>
+                            <a:picLocks noChangeAspect="1" noChangeArrowheads="1"/>
+                          </pic:cNvPicPr>
+                        </pic:nvPicPr>
+                        <pic:blipFill>
+                          <a:blip r:embed="rId17" cstate="none"/>
+                          <a:srcRect/>
+                          <a:stretch>
+                            <a:fillRect/>
+                          </a:stretch>
+                        </pic:blipFill>
+                        <pic:spPr bwMode="auto">
+                          <a:xfrm>
+                            <a:off x="0" y="0"/>
+                            <a:ext cx="6191250" cy="3981450"/>
+                          </a:xfrm>
+                          <a:prstGeom prst="rect">
+                            <a:avLst/>
+                          </a:prstGeom>
+                        </pic:spPr>
+                      </pic:pic>
+                    </a:graphicData>
+                  </a:graphic>
+                </wp:inline>
+              </w:drawing>
+            </w:r>
+          </w:p>
+        </w:tc>
+      </w:tr>
+    </w:tbl>
+    <w:p>
+      <w:pPr>
+        <w:spacing w:after="200" w:before="80"/>
+        <w:jc w:val="center"/>
+      </w:pPr>
+      <w:r>
+        <w:rPr>
+          <w:rFonts w:ascii="Arial" w:cs="Arial" w:eastAsia="Arial" w:hAnsi="Arial"/>
+          <w:b/>
+          <w:bCs/>
+          <w:color w:val="555B6E"/>
+          <w:sz w:val="17"/>
+          <w:szCs w:val="17"/>
+        </w:rPr>
+        <w:t xml:space="preserve">Figure 9. </w:t>
+      </w:r>
+      <w:r>
+        <w:rPr>
+          <w:rFonts w:ascii="Arial" w:cs="Arial" w:eastAsia="Arial" w:hAnsi="Arial"/>
+          <w:i/>
+          <w:iCs/>
+          <w:color w:val="555B6E"/>
+          <w:sz w:val="17"/>
+          <w:szCs w:val="17"/>
+        </w:rPr>
+        <w:t xml:space="preserve">A stacked chart: each month one bar, the channels on top of each other. Combo and 100% Stacked sit beside it.</w:t>
+      </w:r>
+    </w:p>
     <w:p>
       <w:pPr>
         <w:pStyle w:val="ListParagraph"/>
@@ -11693,6 +12662,113 @@
         <w:t xml:space="preserve">Show a report as a pie or a funnel</w:t>
       </w:r>
     </w:p>
+    <w:tbl>
+      <w:tblPr>
+        <w:tblW w:type="dxa" w:w="9870"/>
+        <w:jc w:val="center"/>
+        <w:tblBorders>
+          <w:top w:val="single" w:color="D9DBE3" w:sz="4"/>
+          <w:left w:val="single" w:color="D9DBE3" w:sz="4"/>
+          <w:bottom w:val="single" w:color="D9DBE3" w:sz="4"/>
+          <w:right w:val="single" w:color="D9DBE3" w:sz="4"/>
+          <w:insideH w:val="none"/>
+          <w:insideV w:val="none"/>
+        </w:tblBorders>
+      </w:tblPr>
+      <w:tblGrid>
+        <w:gridCol w:w="9870"/>
+      </w:tblGrid>
+      <w:tr>
+        <w:trPr>
+          <w:cantSplit/>
+        </w:trPr>
+        <w:tc>
+          <w:tcPr>
+            <w:tcW w:type="dxa" w:w="9870"/>
+            <w:tcMar>
+              <w:top w:type="dxa" w:w="40"/>
+              <w:left w:type="dxa" w:w="40"/>
+              <w:bottom w:type="dxa" w:w="40"/>
+              <w:right w:type="dxa" w:w="40"/>
+            </w:tcMar>
+          </w:tcPr>
+          <w:p>
+            <w:pPr>
+              <w:keepNext/>
+              <w:jc w:val="center"/>
+            </w:pPr>
+            <w:r>
+              <w:drawing>
+                <wp:inline distT="0" distB="0" distL="0" distR="0">
+                  <wp:extent cx="6191250" cy="3981450"/>
+                  <wp:effectExtent t="0" r="0" b="0" l="0"/>
+                  <wp:docPr id="1" name="chart-pie" descr="A pie by campaign: the total in the middle, each value with its share in the legend." title="A pie by campaign: the total in the middle, each value with its share in the legend."/>
+                  <wp:cNvGraphicFramePr>
+                    <a:graphicFrameLocks xmlns:a="http://schemas.openxmlformats.org/drawingml/2006/main" noChangeAspect="1"/>
+                  </wp:cNvGraphicFramePr>
+                  <a:graphic xmlns:a="http://schemas.openxmlformats.org/drawingml/2006/main">
+                    <a:graphicData uri="http://schemas.openxmlformats.org/drawingml/2006/picture">
+                      <pic:pic xmlns:pic="http://schemas.openxmlformats.org/drawingml/2006/picture">
+                        <pic:nvPicPr>
+                          <pic:cNvPr id="0" name="" descr=""/>
+                          <pic:cNvPicPr>
+                            <a:picLocks noChangeAspect="1" noChangeArrowheads="1"/>
+                          </pic:cNvPicPr>
+                        </pic:nvPicPr>
+                        <pic:blipFill>
+                          <a:blip r:embed="rId18" cstate="none"/>
+                          <a:srcRect/>
+                          <a:stretch>
+                            <a:fillRect/>
+                          </a:stretch>
+                        </pic:blipFill>
+                        <pic:spPr bwMode="auto">
+                          <a:xfrm>
+                            <a:off x="0" y="0"/>
+                            <a:ext cx="6191250" cy="3981450"/>
+                          </a:xfrm>
+                          <a:prstGeom prst="rect">
+                            <a:avLst/>
+                          </a:prstGeom>
+                        </pic:spPr>
+                      </pic:pic>
+                    </a:graphicData>
+                  </a:graphic>
+                </wp:inline>
+              </w:drawing>
+            </w:r>
+          </w:p>
+        </w:tc>
+      </w:tr>
+    </w:tbl>
+    <w:p>
+      <w:pPr>
+        <w:spacing w:after="200" w:before="80"/>
+        <w:jc w:val="center"/>
+      </w:pPr>
+      <w:r>
+        <w:rPr>
+          <w:rFonts w:ascii="Arial" w:cs="Arial" w:eastAsia="Arial" w:hAnsi="Arial"/>
+          <w:b/>
+          <w:bCs/>
+          <w:color w:val="555B6E"/>
+          <w:sz w:val="17"/>
+          <w:szCs w:val="17"/>
+        </w:rPr>
+        <w:t xml:space="preserve">Figure 10. </w:t>
+      </w:r>
+      <w:r>
+        <w:rPr>
+          <w:rFonts w:ascii="Arial" w:cs="Arial" w:eastAsia="Arial" w:hAnsi="Arial"/>
+          <w:i/>
+          <w:iCs/>
+          <w:color w:val="555B6E"/>
+          <w:sz w:val="17"/>
+          <w:szCs w:val="17"/>
+        </w:rPr>
+        <w:t xml:space="preserve">A pie by campaign: the total in the middle, each value with its share in the legend.</w:t>
+      </w:r>
+    </w:p>
     <w:p>
       <w:pPr>
         <w:pStyle w:val="ListParagraph"/>
@@ -11849,6 +12925,113 @@
         <w:t xml:space="preserve">Use a scatter, bubble, treemap or waterfall chart</w:t>
       </w:r>
     </w:p>
+    <w:tbl>
+      <w:tblPr>
+        <w:tblW w:type="dxa" w:w="9870"/>
+        <w:jc w:val="center"/>
+        <w:tblBorders>
+          <w:top w:val="single" w:color="D9DBE3" w:sz="4"/>
+          <w:left w:val="single" w:color="D9DBE3" w:sz="4"/>
+          <w:bottom w:val="single" w:color="D9DBE3" w:sz="4"/>
+          <w:right w:val="single" w:color="D9DBE3" w:sz="4"/>
+          <w:insideH w:val="none"/>
+          <w:insideV w:val="none"/>
+        </w:tblBorders>
+      </w:tblPr>
+      <w:tblGrid>
+        <w:gridCol w:w="9870"/>
+      </w:tblGrid>
+      <w:tr>
+        <w:trPr>
+          <w:cantSplit/>
+        </w:trPr>
+        <w:tc>
+          <w:tcPr>
+            <w:tcW w:type="dxa" w:w="9870"/>
+            <w:tcMar>
+              <w:top w:type="dxa" w:w="40"/>
+              <w:left w:type="dxa" w:w="40"/>
+              <w:bottom w:type="dxa" w:w="40"/>
+              <w:right w:type="dxa" w:w="40"/>
+            </w:tcMar>
+          </w:tcPr>
+          <w:p>
+            <w:pPr>
+              <w:keepNext/>
+              <w:jc w:val="center"/>
+            </w:pPr>
+            <w:r>
+              <w:drawing>
+                <wp:inline distT="0" distB="0" distL="0" distR="0">
+                  <wp:extent cx="6191250" cy="3981450"/>
+                  <wp:effectExtent t="0" r="0" b="0" l="0"/>
+                  <wp:docPr id="1" name="chart-treemap" descr="A treemap from More Charts: boxes sized by their share, the largest first." title="A treemap from More Charts: boxes sized by their share, the largest first."/>
+                  <wp:cNvGraphicFramePr>
+                    <a:graphicFrameLocks xmlns:a="http://schemas.openxmlformats.org/drawingml/2006/main" noChangeAspect="1"/>
+                  </wp:cNvGraphicFramePr>
+                  <a:graphic xmlns:a="http://schemas.openxmlformats.org/drawingml/2006/main">
+                    <a:graphicData uri="http://schemas.openxmlformats.org/drawingml/2006/picture">
+                      <pic:pic xmlns:pic="http://schemas.openxmlformats.org/drawingml/2006/picture">
+                        <pic:nvPicPr>
+                          <pic:cNvPr id="0" name="" descr=""/>
+                          <pic:cNvPicPr>
+                            <a:picLocks noChangeAspect="1" noChangeArrowheads="1"/>
+                          </pic:cNvPicPr>
+                        </pic:nvPicPr>
+                        <pic:blipFill>
+                          <a:blip r:embed="rId19" cstate="none"/>
+                          <a:srcRect/>
+                          <a:stretch>
+                            <a:fillRect/>
+                          </a:stretch>
+                        </pic:blipFill>
+                        <pic:spPr bwMode="auto">
+                          <a:xfrm>
+                            <a:off x="0" y="0"/>
+                            <a:ext cx="6191250" cy="3981450"/>
+                          </a:xfrm>
+                          <a:prstGeom prst="rect">
+                            <a:avLst/>
+                          </a:prstGeom>
+                        </pic:spPr>
+                      </pic:pic>
+                    </a:graphicData>
+                  </a:graphic>
+                </wp:inline>
+              </w:drawing>
+            </w:r>
+          </w:p>
+        </w:tc>
+      </w:tr>
+    </w:tbl>
+    <w:p>
+      <w:pPr>
+        <w:spacing w:after="200" w:before="80"/>
+        <w:jc w:val="center"/>
+      </w:pPr>
+      <w:r>
+        <w:rPr>
+          <w:rFonts w:ascii="Arial" w:cs="Arial" w:eastAsia="Arial" w:hAnsi="Arial"/>
+          <w:b/>
+          <w:bCs/>
+          <w:color w:val="555B6E"/>
+          <w:sz w:val="17"/>
+          <w:szCs w:val="17"/>
+        </w:rPr>
+        <w:t xml:space="preserve">Figure 11. </w:t>
+      </w:r>
+      <w:r>
+        <w:rPr>
+          <w:rFonts w:ascii="Arial" w:cs="Arial" w:eastAsia="Arial" w:hAnsi="Arial"/>
+          <w:i/>
+          <w:iCs/>
+          <w:color w:val="555B6E"/>
+          <w:sz w:val="17"/>
+          <w:szCs w:val="17"/>
+        </w:rPr>
+        <w:t xml:space="preserve">A treemap from More Charts: boxes sized by their share, the largest first.</w:t>
+      </w:r>
+    </w:p>
     <w:p>
       <w:pPr>
         <w:pStyle w:val="ListParagraph"/>
@@ -12031,6 +13214,113 @@
         <w:t xml:space="preserve">Show one figure: a KPI card or a gauge</w:t>
       </w:r>
     </w:p>
+    <w:tbl>
+      <w:tblPr>
+        <w:tblW w:type="dxa" w:w="9870"/>
+        <w:jc w:val="center"/>
+        <w:tblBorders>
+          <w:top w:val="single" w:color="D9DBE3" w:sz="4"/>
+          <w:left w:val="single" w:color="D9DBE3" w:sz="4"/>
+          <w:bottom w:val="single" w:color="D9DBE3" w:sz="4"/>
+          <w:right w:val="single" w:color="D9DBE3" w:sz="4"/>
+          <w:insideH w:val="none"/>
+          <w:insideV w:val="none"/>
+        </w:tblBorders>
+      </w:tblPr>
+      <w:tblGrid>
+        <w:gridCol w:w="9870"/>
+      </w:tblGrid>
+      <w:tr>
+        <w:trPr>
+          <w:cantSplit/>
+        </w:trPr>
+        <w:tc>
+          <w:tcPr>
+            <w:tcW w:type="dxa" w:w="9870"/>
+            <w:tcMar>
+              <w:top w:type="dxa" w:w="40"/>
+              <w:left w:type="dxa" w:w="40"/>
+              <w:bottom w:type="dxa" w:w="40"/>
+              <w:right w:type="dxa" w:w="40"/>
+            </w:tcMar>
+          </w:tcPr>
+          <w:p>
+            <w:pPr>
+              <w:keepNext/>
+              <w:jc w:val="center"/>
+            </w:pPr>
+            <w:r>
+              <w:drawing>
+                <wp:inline distT="0" distB="0" distL="0" distR="0">
+                  <wp:extent cx="6191250" cy="3981450"/>
+                  <wp:effectExtent t="0" r="0" b="0" l="0"/>
+                  <wp:docPr id="1" name="chart-kpi" descr="A KPI card with a target: the value, the share of target and a small trend line." title="A KPI card with a target: the value, the share of target and a small trend line."/>
+                  <wp:cNvGraphicFramePr>
+                    <a:graphicFrameLocks xmlns:a="http://schemas.openxmlformats.org/drawingml/2006/main" noChangeAspect="1"/>
+                  </wp:cNvGraphicFramePr>
+                  <a:graphic xmlns:a="http://schemas.openxmlformats.org/drawingml/2006/main">
+                    <a:graphicData uri="http://schemas.openxmlformats.org/drawingml/2006/picture">
+                      <pic:pic xmlns:pic="http://schemas.openxmlformats.org/drawingml/2006/picture">
+                        <pic:nvPicPr>
+                          <pic:cNvPr id="0" name="" descr=""/>
+                          <pic:cNvPicPr>
+                            <a:picLocks noChangeAspect="1" noChangeArrowheads="1"/>
+                          </pic:cNvPicPr>
+                        </pic:nvPicPr>
+                        <pic:blipFill>
+                          <a:blip r:embed="rId20" cstate="none"/>
+                          <a:srcRect/>
+                          <a:stretch>
+                            <a:fillRect/>
+                          </a:stretch>
+                        </pic:blipFill>
+                        <pic:spPr bwMode="auto">
+                          <a:xfrm>
+                            <a:off x="0" y="0"/>
+                            <a:ext cx="6191250" cy="3981450"/>
+                          </a:xfrm>
+                          <a:prstGeom prst="rect">
+                            <a:avLst/>
+                          </a:prstGeom>
+                        </pic:spPr>
+                      </pic:pic>
+                    </a:graphicData>
+                  </a:graphic>
+                </wp:inline>
+              </w:drawing>
+            </w:r>
+          </w:p>
+        </w:tc>
+      </w:tr>
+    </w:tbl>
+    <w:p>
+      <w:pPr>
+        <w:spacing w:after="200" w:before="80"/>
+        <w:jc w:val="center"/>
+      </w:pPr>
+      <w:r>
+        <w:rPr>
+          <w:rFonts w:ascii="Arial" w:cs="Arial" w:eastAsia="Arial" w:hAnsi="Arial"/>
+          <w:b/>
+          <w:bCs/>
+          <w:color w:val="555B6E"/>
+          <w:sz w:val="17"/>
+          <w:szCs w:val="17"/>
+        </w:rPr>
+        <w:t xml:space="preserve">Figure 12. </w:t>
+      </w:r>
+      <w:r>
+        <w:rPr>
+          <w:rFonts w:ascii="Arial" w:cs="Arial" w:eastAsia="Arial" w:hAnsi="Arial"/>
+          <w:i/>
+          <w:iCs/>
+          <w:color w:val="555B6E"/>
+          <w:sz w:val="17"/>
+          <w:szCs w:val="17"/>
+        </w:rPr>
+        <w:t xml:space="preserve">A KPI card with a target: the value, the share of target and a small trend line.</w:t>
+      </w:r>
+    </w:p>
     <w:p>
       <w:pPr>
         <w:pStyle w:val="ListParagraph"/>
@@ -12199,6 +13489,113 @@
         <w:t xml:space="preserve">Put the numbers on a map</w:t>
       </w:r>
     </w:p>
+    <w:tbl>
+      <w:tblPr>
+        <w:tblW w:type="dxa" w:w="9870"/>
+        <w:jc w:val="center"/>
+        <w:tblBorders>
+          <w:top w:val="single" w:color="D9DBE3" w:sz="4"/>
+          <w:left w:val="single" w:color="D9DBE3" w:sz="4"/>
+          <w:bottom w:val="single" w:color="D9DBE3" w:sz="4"/>
+          <w:right w:val="single" w:color="D9DBE3" w:sz="4"/>
+          <w:insideH w:val="none"/>
+          <w:insideV w:val="none"/>
+        </w:tblBorders>
+      </w:tblPr>
+      <w:tblGrid>
+        <w:gridCol w:w="9870"/>
+      </w:tblGrid>
+      <w:tr>
+        <w:trPr>
+          <w:cantSplit/>
+        </w:trPr>
+        <w:tc>
+          <w:tcPr>
+            <w:tcW w:type="dxa" w:w="9870"/>
+            <w:tcMar>
+              <w:top w:type="dxa" w:w="40"/>
+              <w:left w:type="dxa" w:w="40"/>
+              <w:bottom w:type="dxa" w:w="40"/>
+              <w:right w:type="dxa" w:w="40"/>
+            </w:tcMar>
+          </w:tcPr>
+          <w:p>
+            <w:pPr>
+              <w:keepNext/>
+              <w:jc w:val="center"/>
+            </w:pPr>
+            <w:r>
+              <w:drawing>
+                <wp:inline distT="0" distB="0" distL="0" distR="0">
+                  <wp:extent cx="6191250" cy="4191000"/>
+                  <wp:effectExtent t="0" r="0" b="0" l="0"/>
+                  <wp:docPr id="1" name="chart-map" descr="A map of US states: darker blue is more, grey has no data; Map Of picks states or countries." title="A map of US states: darker blue is more, grey has no data; Map Of picks states or countries."/>
+                  <wp:cNvGraphicFramePr>
+                    <a:graphicFrameLocks xmlns:a="http://schemas.openxmlformats.org/drawingml/2006/main" noChangeAspect="1"/>
+                  </wp:cNvGraphicFramePr>
+                  <a:graphic xmlns:a="http://schemas.openxmlformats.org/drawingml/2006/main">
+                    <a:graphicData uri="http://schemas.openxmlformats.org/drawingml/2006/picture">
+                      <pic:pic xmlns:pic="http://schemas.openxmlformats.org/drawingml/2006/picture">
+                        <pic:nvPicPr>
+                          <pic:cNvPr id="0" name="" descr=""/>
+                          <pic:cNvPicPr>
+                            <a:picLocks noChangeAspect="1" noChangeArrowheads="1"/>
+                          </pic:cNvPicPr>
+                        </pic:nvPicPr>
+                        <pic:blipFill>
+                          <a:blip r:embed="rId21" cstate="none"/>
+                          <a:srcRect/>
+                          <a:stretch>
+                            <a:fillRect/>
+                          </a:stretch>
+                        </pic:blipFill>
+                        <pic:spPr bwMode="auto">
+                          <a:xfrm>
+                            <a:off x="0" y="0"/>
+                            <a:ext cx="6191250" cy="4191000"/>
+                          </a:xfrm>
+                          <a:prstGeom prst="rect">
+                            <a:avLst/>
+                          </a:prstGeom>
+                        </pic:spPr>
+                      </pic:pic>
+                    </a:graphicData>
+                  </a:graphic>
+                </wp:inline>
+              </w:drawing>
+            </w:r>
+          </w:p>
+        </w:tc>
+      </w:tr>
+    </w:tbl>
+    <w:p>
+      <w:pPr>
+        <w:spacing w:after="200" w:before="80"/>
+        <w:jc w:val="center"/>
+      </w:pPr>
+      <w:r>
+        <w:rPr>
+          <w:rFonts w:ascii="Arial" w:cs="Arial" w:eastAsia="Arial" w:hAnsi="Arial"/>
+          <w:b/>
+          <w:bCs/>
+          <w:color w:val="555B6E"/>
+          <w:sz w:val="17"/>
+          <w:szCs w:val="17"/>
+        </w:rPr>
+        <w:t xml:space="preserve">Figure 13. </w:t>
+      </w:r>
+      <w:r>
+        <w:rPr>
+          <w:rFonts w:ascii="Arial" w:cs="Arial" w:eastAsia="Arial" w:hAnsi="Arial"/>
+          <w:i/>
+          <w:iCs/>
+          <w:color w:val="555B6E"/>
+          <w:sz w:val="17"/>
+          <w:szCs w:val="17"/>
+        </w:rPr>
+        <w:t xml:space="preserve">A map of US states: darker blue is more, grey has no data; Map Of picks states or countries.</w:t>
+      </w:r>
+    </w:p>
     <w:p>
       <w:pPr>
         <w:pStyle w:val="ListParagraph"/>
@@ -12361,6 +13758,113 @@
         <w:t xml:space="preserve">Show every value side by side in a pivot (matrix)</w:t>
       </w:r>
     </w:p>
+    <w:tbl>
+      <w:tblPr>
+        <w:tblW w:type="dxa" w:w="9870"/>
+        <w:jc w:val="center"/>
+        <w:tblBorders>
+          <w:top w:val="single" w:color="D9DBE3" w:sz="4"/>
+          <w:left w:val="single" w:color="D9DBE3" w:sz="4"/>
+          <w:bottom w:val="single" w:color="D9DBE3" w:sz="4"/>
+          <w:right w:val="single" w:color="D9DBE3" w:sz="4"/>
+          <w:insideH w:val="none"/>
+          <w:insideV w:val="none"/>
+        </w:tblBorders>
+      </w:tblPr>
+      <w:tblGrid>
+        <w:gridCol w:w="9870"/>
+      </w:tblGrid>
+      <w:tr>
+        <w:trPr>
+          <w:cantSplit/>
+        </w:trPr>
+        <w:tc>
+          <w:tcPr>
+            <w:tcW w:type="dxa" w:w="9870"/>
+            <w:tcMar>
+              <w:top w:type="dxa" w:w="40"/>
+              <w:left w:type="dxa" w:w="40"/>
+              <w:bottom w:type="dxa" w:w="40"/>
+              <w:right w:type="dxa" w:w="40"/>
+            </w:tcMar>
+          </w:tcPr>
+          <w:p>
+            <w:pPr>
+              <w:keepNext/>
+              <w:jc w:val="center"/>
+            </w:pPr>
+            <w:r>
+              <w:drawing>
+                <wp:inline distT="0" distB="0" distL="0" distR="0">
+                  <wp:extent cx="6191250" cy="3981450"/>
+                  <wp:effectExtent t="0" r="0" b="0" l="0"/>
+                  <wp:docPr id="1" name="matrix" descr="All Values and Trend Column: every value under each month, with a total for each." title="All Values and Trend Column: every value under each month, with a total for each."/>
+                  <wp:cNvGraphicFramePr>
+                    <a:graphicFrameLocks xmlns:a="http://schemas.openxmlformats.org/drawingml/2006/main" noChangeAspect="1"/>
+                  </wp:cNvGraphicFramePr>
+                  <a:graphic xmlns:a="http://schemas.openxmlformats.org/drawingml/2006/main">
+                    <a:graphicData uri="http://schemas.openxmlformats.org/drawingml/2006/picture">
+                      <pic:pic xmlns:pic="http://schemas.openxmlformats.org/drawingml/2006/picture">
+                        <pic:nvPicPr>
+                          <pic:cNvPr id="0" name="" descr=""/>
+                          <pic:cNvPicPr>
+                            <a:picLocks noChangeAspect="1" noChangeArrowheads="1"/>
+                          </pic:cNvPicPr>
+                        </pic:nvPicPr>
+                        <pic:blipFill>
+                          <a:blip r:embed="rId22" cstate="none"/>
+                          <a:srcRect/>
+                          <a:stretch>
+                            <a:fillRect/>
+                          </a:stretch>
+                        </pic:blipFill>
+                        <pic:spPr bwMode="auto">
+                          <a:xfrm>
+                            <a:off x="0" y="0"/>
+                            <a:ext cx="6191250" cy="3981450"/>
+                          </a:xfrm>
+                          <a:prstGeom prst="rect">
+                            <a:avLst/>
+                          </a:prstGeom>
+                        </pic:spPr>
+                      </pic:pic>
+                    </a:graphicData>
+                  </a:graphic>
+                </wp:inline>
+              </w:drawing>
+            </w:r>
+          </w:p>
+        </w:tc>
+      </w:tr>
+    </w:tbl>
+    <w:p>
+      <w:pPr>
+        <w:spacing w:after="200" w:before="80"/>
+        <w:jc w:val="center"/>
+      </w:pPr>
+      <w:r>
+        <w:rPr>
+          <w:rFonts w:ascii="Arial" w:cs="Arial" w:eastAsia="Arial" w:hAnsi="Arial"/>
+          <w:b/>
+          <w:bCs/>
+          <w:color w:val="555B6E"/>
+          <w:sz w:val="17"/>
+          <w:szCs w:val="17"/>
+        </w:rPr>
+        <w:t xml:space="preserve">Figure 14. </w:t>
+      </w:r>
+      <w:r>
+        <w:rPr>
+          <w:rFonts w:ascii="Arial" w:cs="Arial" w:eastAsia="Arial" w:hAnsi="Arial"/>
+          <w:i/>
+          <w:iCs/>
+          <w:color w:val="555B6E"/>
+          <w:sz w:val="17"/>
+          <w:szCs w:val="17"/>
+        </w:rPr>
+        <w:t xml:space="preserve">All Values and Trend Column: every value under each month, with a total for each.</w:t>
+      </w:r>
+    </w:p>
     <w:p>
       <w:pPr>
         <w:pStyle w:val="ListParagraph"/>
@@ -12469,6 +13973,113 @@
         <w:t xml:space="preserve">Repeat a chart per value (small multiples)</w:t>
       </w:r>
     </w:p>
+    <w:tbl>
+      <w:tblPr>
+        <w:tblW w:type="dxa" w:w="9870"/>
+        <w:jc w:val="center"/>
+        <w:tblBorders>
+          <w:top w:val="single" w:color="D9DBE3" w:sz="4"/>
+          <w:left w:val="single" w:color="D9DBE3" w:sz="4"/>
+          <w:bottom w:val="single" w:color="D9DBE3" w:sz="4"/>
+          <w:right w:val="single" w:color="D9DBE3" w:sz="4"/>
+          <w:insideH w:val="none"/>
+          <w:insideV w:val="none"/>
+        </w:tblBorders>
+      </w:tblPr>
+      <w:tblGrid>
+        <w:gridCol w:w="9870"/>
+      </w:tblGrid>
+      <w:tr>
+        <w:trPr>
+          <w:cantSplit/>
+        </w:trPr>
+        <w:tc>
+          <w:tcPr>
+            <w:tcW w:type="dxa" w:w="9870"/>
+            <w:tcMar>
+              <w:top w:type="dxa" w:w="40"/>
+              <w:left w:type="dxa" w:w="40"/>
+              <w:bottom w:type="dxa" w:w="40"/>
+              <w:right w:type="dxa" w:w="40"/>
+            </w:tcMar>
+          </w:tcPr>
+          <w:p>
+            <w:pPr>
+              <w:keepNext/>
+              <w:jc w:val="center"/>
+            </w:pPr>
+            <w:r>
+              <w:drawing>
+                <wp:inline distT="0" distB="0" distL="0" distR="0">
+                  <wp:extent cx="6191250" cy="4391025"/>
+                  <wp:effectExtent t="0" r="0" b="0" l="0"/>
+                  <wp:docPr id="1" name="multiples" descr="Repeat By Channel: one small chart per value, all on one scale." title="Repeat By Channel: one small chart per value, all on one scale."/>
+                  <wp:cNvGraphicFramePr>
+                    <a:graphicFrameLocks xmlns:a="http://schemas.openxmlformats.org/drawingml/2006/main" noChangeAspect="1"/>
+                  </wp:cNvGraphicFramePr>
+                  <a:graphic xmlns:a="http://schemas.openxmlformats.org/drawingml/2006/main">
+                    <a:graphicData uri="http://schemas.openxmlformats.org/drawingml/2006/picture">
+                      <pic:pic xmlns:pic="http://schemas.openxmlformats.org/drawingml/2006/picture">
+                        <pic:nvPicPr>
+                          <pic:cNvPr id="0" name="" descr=""/>
+                          <pic:cNvPicPr>
+                            <a:picLocks noChangeAspect="1" noChangeArrowheads="1"/>
+                          </pic:cNvPicPr>
+                        </pic:nvPicPr>
+                        <pic:blipFill>
+                          <a:blip r:embed="rId23" cstate="none"/>
+                          <a:srcRect/>
+                          <a:stretch>
+                            <a:fillRect/>
+                          </a:stretch>
+                        </pic:blipFill>
+                        <pic:spPr bwMode="auto">
+                          <a:xfrm>
+                            <a:off x="0" y="0"/>
+                            <a:ext cx="6191250" cy="4391025"/>
+                          </a:xfrm>
+                          <a:prstGeom prst="rect">
+                            <a:avLst/>
+                          </a:prstGeom>
+                        </pic:spPr>
+                      </pic:pic>
+                    </a:graphicData>
+                  </a:graphic>
+                </wp:inline>
+              </w:drawing>
+            </w:r>
+          </w:p>
+        </w:tc>
+      </w:tr>
+    </w:tbl>
+    <w:p>
+      <w:pPr>
+        <w:spacing w:after="200" w:before="80"/>
+        <w:jc w:val="center"/>
+      </w:pPr>
+      <w:r>
+        <w:rPr>
+          <w:rFonts w:ascii="Arial" w:cs="Arial" w:eastAsia="Arial" w:hAnsi="Arial"/>
+          <w:b/>
+          <w:bCs/>
+          <w:color w:val="555B6E"/>
+          <w:sz w:val="17"/>
+          <w:szCs w:val="17"/>
+        </w:rPr>
+        <w:t xml:space="preserve">Figure 15. </w:t>
+      </w:r>
+      <w:r>
+        <w:rPr>
+          <w:rFonts w:ascii="Arial" w:cs="Arial" w:eastAsia="Arial" w:hAnsi="Arial"/>
+          <w:i/>
+          <w:iCs/>
+          <w:color w:val="555B6E"/>
+          <w:sz w:val="17"/>
+          <w:szCs w:val="17"/>
+        </w:rPr>
+        <w:t xml:space="preserve">Repeat By Channel: one small chart per value, all on one scale.</w:t>
+      </w:r>
+    </w:p>
     <w:p>
       <w:pPr>
         <w:pStyle w:val="ListParagraph"/>
@@ -12561,6 +14172,113 @@
           <w:rFonts w:ascii="Arial" w:cs="Arial" w:eastAsia="Arial" w:hAnsi="Arial"/>
         </w:rPr>
         <w:t xml:space="preserve">Colour the numbers</w:t>
+      </w:r>
+    </w:p>
+    <w:tbl>
+      <w:tblPr>
+        <w:tblW w:type="dxa" w:w="9870"/>
+        <w:jc w:val="center"/>
+        <w:tblBorders>
+          <w:top w:val="single" w:color="D9DBE3" w:sz="4"/>
+          <w:left w:val="single" w:color="D9DBE3" w:sz="4"/>
+          <w:bottom w:val="single" w:color="D9DBE3" w:sz="4"/>
+          <w:right w:val="single" w:color="D9DBE3" w:sz="4"/>
+          <w:insideH w:val="none"/>
+          <w:insideV w:val="none"/>
+        </w:tblBorders>
+      </w:tblPr>
+      <w:tblGrid>
+        <w:gridCol w:w="9870"/>
+      </w:tblGrid>
+      <w:tr>
+        <w:trPr>
+          <w:cantSplit/>
+        </w:trPr>
+        <w:tc>
+          <w:tcPr>
+            <w:tcW w:type="dxa" w:w="9870"/>
+            <w:tcMar>
+              <w:top w:type="dxa" w:w="40"/>
+              <w:left w:type="dxa" w:w="40"/>
+              <w:bottom w:type="dxa" w:w="40"/>
+              <w:right w:type="dxa" w:w="40"/>
+            </w:tcMar>
+          </w:tcPr>
+          <w:p>
+            <w:pPr>
+              <w:keepNext/>
+              <w:jc w:val="center"/>
+            </w:pPr>
+            <w:r>
+              <w:drawing>
+                <wp:inline distT="0" distB="0" distL="0" distR="0">
+                  <wp:extent cx="6191250" cy="3676650"/>
+                  <wp:effectExtent t="0" r="0" b="0" l="0"/>
+                  <wp:docPr id="1" name="format" descr="Rules colour Sent Count good, warning or bad; data bars sit behind Opened." title="Rules colour Sent Count good, warning or bad; data bars sit behind Opened."/>
+                  <wp:cNvGraphicFramePr>
+                    <a:graphicFrameLocks xmlns:a="http://schemas.openxmlformats.org/drawingml/2006/main" noChangeAspect="1"/>
+                  </wp:cNvGraphicFramePr>
+                  <a:graphic xmlns:a="http://schemas.openxmlformats.org/drawingml/2006/main">
+                    <a:graphicData uri="http://schemas.openxmlformats.org/drawingml/2006/picture">
+                      <pic:pic xmlns:pic="http://schemas.openxmlformats.org/drawingml/2006/picture">
+                        <pic:nvPicPr>
+                          <pic:cNvPr id="0" name="" descr=""/>
+                          <pic:cNvPicPr>
+                            <a:picLocks noChangeAspect="1" noChangeArrowheads="1"/>
+                          </pic:cNvPicPr>
+                        </pic:nvPicPr>
+                        <pic:blipFill>
+                          <a:blip r:embed="rId24" cstate="none"/>
+                          <a:srcRect/>
+                          <a:stretch>
+                            <a:fillRect/>
+                          </a:stretch>
+                        </pic:blipFill>
+                        <pic:spPr bwMode="auto">
+                          <a:xfrm>
+                            <a:off x="0" y="0"/>
+                            <a:ext cx="6191250" cy="3676650"/>
+                          </a:xfrm>
+                          <a:prstGeom prst="rect">
+                            <a:avLst/>
+                          </a:prstGeom>
+                        </pic:spPr>
+                      </pic:pic>
+                    </a:graphicData>
+                  </a:graphic>
+                </wp:inline>
+              </w:drawing>
+            </w:r>
+          </w:p>
+        </w:tc>
+      </w:tr>
+    </w:tbl>
+    <w:p>
+      <w:pPr>
+        <w:spacing w:after="200" w:before="80"/>
+        <w:jc w:val="center"/>
+      </w:pPr>
+      <w:r>
+        <w:rPr>
+          <w:rFonts w:ascii="Arial" w:cs="Arial" w:eastAsia="Arial" w:hAnsi="Arial"/>
+          <w:b/>
+          <w:bCs/>
+          <w:color w:val="555B6E"/>
+          <w:sz w:val="17"/>
+          <w:szCs w:val="17"/>
+        </w:rPr>
+        <w:t xml:space="preserve">Figure 16. </w:t>
+      </w:r>
+      <w:r>
+        <w:rPr>
+          <w:rFonts w:ascii="Arial" w:cs="Arial" w:eastAsia="Arial" w:hAnsi="Arial"/>
+          <w:i/>
+          <w:iCs/>
+          <w:color w:val="555B6E"/>
+          <w:sz w:val="17"/>
+          <w:szCs w:val="17"/>
+        </w:rPr>
+        <w:t xml:space="preserve">Rules colour Sent Count good, warning or bad; data bars sit behind Opened.</w:t>
       </w:r>
     </w:p>
     <w:p>
@@ -13138,6 +14856,113 @@
         <w:t xml:space="preserve">Drill in a pivot or a hierarchy</w:t>
       </w:r>
     </w:p>
+    <w:tbl>
+      <w:tblPr>
+        <w:tblW w:type="dxa" w:w="9870"/>
+        <w:jc w:val="center"/>
+        <w:tblBorders>
+          <w:top w:val="single" w:color="D9DBE3" w:sz="4"/>
+          <w:left w:val="single" w:color="D9DBE3" w:sz="4"/>
+          <w:bottom w:val="single" w:color="D9DBE3" w:sz="4"/>
+          <w:right w:val="single" w:color="D9DBE3" w:sz="4"/>
+          <w:insideH w:val="none"/>
+          <w:insideV w:val="none"/>
+        </w:tblBorders>
+      </w:tblPr>
+      <w:tblGrid>
+        <w:gridCol w:w="9870"/>
+      </w:tblGrid>
+      <w:tr>
+        <w:trPr>
+          <w:cantSplit/>
+        </w:trPr>
+        <w:tc>
+          <w:tcPr>
+            <w:tcW w:type="dxa" w:w="9870"/>
+            <w:tcMar>
+              <w:top w:type="dxa" w:w="40"/>
+              <w:left w:type="dxa" w:w="40"/>
+              <w:bottom w:type="dxa" w:w="40"/>
+              <w:right w:type="dxa" w:w="40"/>
+            </w:tcMar>
+          </w:tcPr>
+          <w:p>
+            <w:pPr>
+              <w:keepNext/>
+              <w:jc w:val="center"/>
+            </w:pPr>
+            <w:r>
+              <w:drawing>
+                <wp:inline distT="0" distB="0" distL="0" distR="0">
+                  <wp:extent cx="6191250" cy="3676650"/>
+                  <wp:effectExtent t="0" r="0" b="0" l="0"/>
+                  <wp:docPr id="1" name="view-hierarchy" descr="The Hierarchy view: each channel folds over its months, with a subtotal per group." title="The Hierarchy view: each channel folds over its months, with a subtotal per group."/>
+                  <wp:cNvGraphicFramePr>
+                    <a:graphicFrameLocks xmlns:a="http://schemas.openxmlformats.org/drawingml/2006/main" noChangeAspect="1"/>
+                  </wp:cNvGraphicFramePr>
+                  <a:graphic xmlns:a="http://schemas.openxmlformats.org/drawingml/2006/main">
+                    <a:graphicData uri="http://schemas.openxmlformats.org/drawingml/2006/picture">
+                      <pic:pic xmlns:pic="http://schemas.openxmlformats.org/drawingml/2006/picture">
+                        <pic:nvPicPr>
+                          <pic:cNvPr id="0" name="" descr=""/>
+                          <pic:cNvPicPr>
+                            <a:picLocks noChangeAspect="1" noChangeArrowheads="1"/>
+                          </pic:cNvPicPr>
+                        </pic:nvPicPr>
+                        <pic:blipFill>
+                          <a:blip r:embed="rId25" cstate="none"/>
+                          <a:srcRect/>
+                          <a:stretch>
+                            <a:fillRect/>
+                          </a:stretch>
+                        </pic:blipFill>
+                        <pic:spPr bwMode="auto">
+                          <a:xfrm>
+                            <a:off x="0" y="0"/>
+                            <a:ext cx="6191250" cy="3676650"/>
+                          </a:xfrm>
+                          <a:prstGeom prst="rect">
+                            <a:avLst/>
+                          </a:prstGeom>
+                        </pic:spPr>
+                      </pic:pic>
+                    </a:graphicData>
+                  </a:graphic>
+                </wp:inline>
+              </w:drawing>
+            </w:r>
+          </w:p>
+        </w:tc>
+      </w:tr>
+    </w:tbl>
+    <w:p>
+      <w:pPr>
+        <w:spacing w:after="200" w:before="80"/>
+        <w:jc w:val="center"/>
+      </w:pPr>
+      <w:r>
+        <w:rPr>
+          <w:rFonts w:ascii="Arial" w:cs="Arial" w:eastAsia="Arial" w:hAnsi="Arial"/>
+          <w:b/>
+          <w:bCs/>
+          <w:color w:val="555B6E"/>
+          <w:sz w:val="17"/>
+          <w:szCs w:val="17"/>
+        </w:rPr>
+        <w:t xml:space="preserve">Figure 17. </w:t>
+      </w:r>
+      <w:r>
+        <w:rPr>
+          <w:rFonts w:ascii="Arial" w:cs="Arial" w:eastAsia="Arial" w:hAnsi="Arial"/>
+          <w:i/>
+          <w:iCs/>
+          <w:color w:val="555B6E"/>
+          <w:sz w:val="17"/>
+          <w:szCs w:val="17"/>
+        </w:rPr>
+        <w:t xml:space="preserve">The Hierarchy view: each channel folds over its months, with a subtotal per group.</w:t>
+      </w:r>
+    </w:p>
     <w:p>
       <w:pPr>
         <w:pStyle w:val="ListParagraph"/>
@@ -13844,6 +15669,113 @@
           <w:rFonts w:ascii="Arial" w:cs="Arial" w:eastAsia="Arial" w:hAnsi="Arial"/>
         </w:rPr>
         <w:t xml:space="preserve">Ask a question before a report runs (Parameters)</w:t>
+      </w:r>
+    </w:p>
+    <w:tbl>
+      <w:tblPr>
+        <w:tblW w:type="dxa" w:w="9870"/>
+        <w:jc w:val="center"/>
+        <w:tblBorders>
+          <w:top w:val="single" w:color="D9DBE3" w:sz="4"/>
+          <w:left w:val="single" w:color="D9DBE3" w:sz="4"/>
+          <w:bottom w:val="single" w:color="D9DBE3" w:sz="4"/>
+          <w:right w:val="single" w:color="D9DBE3" w:sz="4"/>
+          <w:insideH w:val="none"/>
+          <w:insideV w:val="none"/>
+        </w:tblBorders>
+      </w:tblPr>
+      <w:tblGrid>
+        <w:gridCol w:w="9870"/>
+      </w:tblGrid>
+      <w:tr>
+        <w:trPr>
+          <w:cantSplit/>
+        </w:trPr>
+        <w:tc>
+          <w:tcPr>
+            <w:tcW w:type="dxa" w:w="9870"/>
+            <w:tcMar>
+              <w:top w:type="dxa" w:w="40"/>
+              <w:left w:type="dxa" w:w="40"/>
+              <w:bottom w:type="dxa" w:w="40"/>
+              <w:right w:type="dxa" w:w="40"/>
+            </w:tcMar>
+          </w:tcPr>
+          <w:p>
+            <w:pPr>
+              <w:keepNext/>
+              <w:jc w:val="center"/>
+            </w:pPr>
+            <w:r>
+              <w:drawing>
+                <wp:inline distT="0" distB="0" distL="0" distR="0">
+                  <wp:extent cx="6191250" cy="2952750"/>
+                  <wp:effectExtent t="0" r="0" b="0" l="0"/>
+                  <wp:docPr id="1" name="params" descr="The questions above a report: pick the answers and press Run Report." title="The questions above a report: pick the answers and press Run Report."/>
+                  <wp:cNvGraphicFramePr>
+                    <a:graphicFrameLocks xmlns:a="http://schemas.openxmlformats.org/drawingml/2006/main" noChangeAspect="1"/>
+                  </wp:cNvGraphicFramePr>
+                  <a:graphic xmlns:a="http://schemas.openxmlformats.org/drawingml/2006/main">
+                    <a:graphicData uri="http://schemas.openxmlformats.org/drawingml/2006/picture">
+                      <pic:pic xmlns:pic="http://schemas.openxmlformats.org/drawingml/2006/picture">
+                        <pic:nvPicPr>
+                          <pic:cNvPr id="0" name="" descr=""/>
+                          <pic:cNvPicPr>
+                            <a:picLocks noChangeAspect="1" noChangeArrowheads="1"/>
+                          </pic:cNvPicPr>
+                        </pic:nvPicPr>
+                        <pic:blipFill>
+                          <a:blip r:embed="rId26" cstate="none"/>
+                          <a:srcRect/>
+                          <a:stretch>
+                            <a:fillRect/>
+                          </a:stretch>
+                        </pic:blipFill>
+                        <pic:spPr bwMode="auto">
+                          <a:xfrm>
+                            <a:off x="0" y="0"/>
+                            <a:ext cx="6191250" cy="2952750"/>
+                          </a:xfrm>
+                          <a:prstGeom prst="rect">
+                            <a:avLst/>
+                          </a:prstGeom>
+                        </pic:spPr>
+                      </pic:pic>
+                    </a:graphicData>
+                  </a:graphic>
+                </wp:inline>
+              </w:drawing>
+            </w:r>
+          </w:p>
+        </w:tc>
+      </w:tr>
+    </w:tbl>
+    <w:p>
+      <w:pPr>
+        <w:spacing w:after="200" w:before="80"/>
+        <w:jc w:val="center"/>
+      </w:pPr>
+      <w:r>
+        <w:rPr>
+          <w:rFonts w:ascii="Arial" w:cs="Arial" w:eastAsia="Arial" w:hAnsi="Arial"/>
+          <w:b/>
+          <w:bCs/>
+          <w:color w:val="555B6E"/>
+          <w:sz w:val="17"/>
+          <w:szCs w:val="17"/>
+        </w:rPr>
+        <w:t xml:space="preserve">Figure 18. </w:t>
+      </w:r>
+      <w:r>
+        <w:rPr>
+          <w:rFonts w:ascii="Arial" w:cs="Arial" w:eastAsia="Arial" w:hAnsi="Arial"/>
+          <w:i/>
+          <w:iCs/>
+          <w:color w:val="555B6E"/>
+          <w:sz w:val="17"/>
+          <w:szCs w:val="17"/>
+        </w:rPr>
+        <w:t xml:space="preserve">The questions above a report: pick the answers and press Run Report.</w:t>
       </w:r>
     </w:p>
     <w:p>
@@ -14253,6 +16185,7 @@
     </w:p>
     <w:p>
       <w:pPr>
+        <w:keepNext/>
         <w:spacing w:after="100"/>
       </w:pPr>
       <w:r>
@@ -14276,6 +16209,113 @@
         <w:t xml:space="preserve">Anyone who can build reports</w:t>
       </w:r>
     </w:p>
+    <w:tbl>
+      <w:tblPr>
+        <w:tblW w:type="dxa" w:w="9120"/>
+        <w:jc w:val="center"/>
+        <w:tblBorders>
+          <w:top w:val="single" w:color="D9DBE3" w:sz="4"/>
+          <w:left w:val="single" w:color="D9DBE3" w:sz="4"/>
+          <w:bottom w:val="single" w:color="D9DBE3" w:sz="4"/>
+          <w:right w:val="single" w:color="D9DBE3" w:sz="4"/>
+          <w:insideH w:val="none"/>
+          <w:insideV w:val="none"/>
+        </w:tblBorders>
+      </w:tblPr>
+      <w:tblGrid>
+        <w:gridCol w:w="9120"/>
+      </w:tblGrid>
+      <w:tr>
+        <w:trPr>
+          <w:cantSplit/>
+        </w:trPr>
+        <w:tc>
+          <w:tcPr>
+            <w:tcW w:type="dxa" w:w="9120"/>
+            <w:tcMar>
+              <w:top w:type="dxa" w:w="40"/>
+              <w:left w:type="dxa" w:w="40"/>
+              <w:bottom w:type="dxa" w:w="40"/>
+              <w:right w:type="dxa" w:w="40"/>
+            </w:tcMar>
+          </w:tcPr>
+          <w:p>
+            <w:pPr>
+              <w:keepNext/>
+              <w:jc w:val="center"/>
+            </w:pPr>
+            <w:r>
+              <w:drawing>
+                <wp:inline distT="0" distB="0" distL="0" distR="0">
+                  <wp:extent cx="5715000" cy="5334000"/>
+                  <wp:effectExtent t="0" r="0" b="0" l="0"/>
+                  <wp:docPr id="1" name="upload-review" descr="Review the Columns: each column's label, type and use, with the first rows of the file." title="Review the Columns: each column's label, type and use, with the first rows of the file."/>
+                  <wp:cNvGraphicFramePr>
+                    <a:graphicFrameLocks xmlns:a="http://schemas.openxmlformats.org/drawingml/2006/main" noChangeAspect="1"/>
+                  </wp:cNvGraphicFramePr>
+                  <a:graphic xmlns:a="http://schemas.openxmlformats.org/drawingml/2006/main">
+                    <a:graphicData uri="http://schemas.openxmlformats.org/drawingml/2006/picture">
+                      <pic:pic xmlns:pic="http://schemas.openxmlformats.org/drawingml/2006/picture">
+                        <pic:nvPicPr>
+                          <pic:cNvPr id="0" name="" descr=""/>
+                          <pic:cNvPicPr>
+                            <a:picLocks noChangeAspect="1" noChangeArrowheads="1"/>
+                          </pic:cNvPicPr>
+                        </pic:nvPicPr>
+                        <pic:blipFill>
+                          <a:blip r:embed="rId27" cstate="none"/>
+                          <a:srcRect/>
+                          <a:stretch>
+                            <a:fillRect/>
+                          </a:stretch>
+                        </pic:blipFill>
+                        <pic:spPr bwMode="auto">
+                          <a:xfrm>
+                            <a:off x="0" y="0"/>
+                            <a:ext cx="5715000" cy="5334000"/>
+                          </a:xfrm>
+                          <a:prstGeom prst="rect">
+                            <a:avLst/>
+                          </a:prstGeom>
+                        </pic:spPr>
+                      </pic:pic>
+                    </a:graphicData>
+                  </a:graphic>
+                </wp:inline>
+              </w:drawing>
+            </w:r>
+          </w:p>
+        </w:tc>
+      </w:tr>
+    </w:tbl>
+    <w:p>
+      <w:pPr>
+        <w:spacing w:after="200" w:before="80"/>
+        <w:jc w:val="center"/>
+      </w:pPr>
+      <w:r>
+        <w:rPr>
+          <w:rFonts w:ascii="Arial" w:cs="Arial" w:eastAsia="Arial" w:hAnsi="Arial"/>
+          <w:b/>
+          <w:bCs/>
+          <w:color w:val="555B6E"/>
+          <w:sz w:val="17"/>
+          <w:szCs w:val="17"/>
+        </w:rPr>
+        <w:t xml:space="preserve">Figure 19. </w:t>
+      </w:r>
+      <w:r>
+        <w:rPr>
+          <w:rFonts w:ascii="Arial" w:cs="Arial" w:eastAsia="Arial" w:hAnsi="Arial"/>
+          <w:i/>
+          <w:iCs/>
+          <w:color w:val="555B6E"/>
+          <w:sz w:val="17"/>
+          <w:szCs w:val="17"/>
+        </w:rPr>
+        <w:t xml:space="preserve">Review the Columns: each column's label, type and use, with the first rows of the file.</w:t>
+      </w:r>
+    </w:p>
     <w:p>
       <w:pPr>
         <w:pStyle w:val="ListParagraph"/>
@@ -14528,6 +16568,7 @@
     </w:p>
     <w:p>
       <w:pPr>
+        <w:keepNext/>
         <w:spacing w:after="100"/>
       </w:pPr>
       <w:r>
@@ -14679,6 +16720,7 @@
     </w:p>
     <w:p>
       <w:pPr>
+        <w:keepNext/>
         <w:spacing w:after="100"/>
       </w:pPr>
       <w:r>
@@ -15054,6 +17096,7 @@
     </w:p>
     <w:p>
       <w:pPr>
+        <w:keepNext/>
         <w:spacing w:after="100"/>
       </w:pPr>
       <w:r>
@@ -15445,6 +17488,7 @@
     </w:p>
     <w:p>
       <w:pPr>
+        <w:keepNext/>
         <w:spacing w:after="100"/>
       </w:pPr>
       <w:r>
@@ -15791,6 +17835,113 @@
         <w:t xml:space="preserve">How a Dashboard Works</w:t>
       </w:r>
     </w:p>
+    <w:tbl>
+      <w:tblPr>
+        <w:tblW w:type="dxa" w:w="7065"/>
+        <w:jc w:val="center"/>
+        <w:tblBorders>
+          <w:top w:val="single" w:color="D9DBE3" w:sz="4"/>
+          <w:left w:val="single" w:color="D9DBE3" w:sz="4"/>
+          <w:bottom w:val="single" w:color="D9DBE3" w:sz="4"/>
+          <w:right w:val="single" w:color="D9DBE3" w:sz="4"/>
+          <w:insideH w:val="none"/>
+          <w:insideV w:val="none"/>
+        </w:tblBorders>
+      </w:tblPr>
+      <w:tblGrid>
+        <w:gridCol w:w="7065"/>
+      </w:tblGrid>
+      <w:tr>
+        <w:trPr>
+          <w:cantSplit/>
+        </w:trPr>
+        <w:tc>
+          <w:tcPr>
+            <w:tcW w:type="dxa" w:w="7065"/>
+            <w:tcMar>
+              <w:top w:type="dxa" w:w="40"/>
+              <w:left w:type="dxa" w:w="40"/>
+              <w:bottom w:type="dxa" w:w="40"/>
+              <w:right w:type="dxa" w:w="40"/>
+            </w:tcMar>
+          </w:tcPr>
+          <w:p>
+            <w:pPr>
+              <w:keepNext/>
+              <w:jc w:val="center"/>
+            </w:pPr>
+            <w:r>
+              <w:drawing>
+                <wp:inline distT="0" distB="0" distL="0" distR="0">
+                  <wp:extent cx="4410075" cy="5334000"/>
+                  <wp:effectExtent t="0" r="0" b="0" l="0"/>
+                  <wp:docPr id="1" name="dashboard" descr="A dashboard: figures, charts, a grid, a pivot and a hierarchy on one period, with a Channel slicer under it." title="A dashboard: figures, charts, a grid, a pivot and a hierarchy on one period, with a Channel slicer under it."/>
+                  <wp:cNvGraphicFramePr>
+                    <a:graphicFrameLocks xmlns:a="http://schemas.openxmlformats.org/drawingml/2006/main" noChangeAspect="1"/>
+                  </wp:cNvGraphicFramePr>
+                  <a:graphic xmlns:a="http://schemas.openxmlformats.org/drawingml/2006/main">
+                    <a:graphicData uri="http://schemas.openxmlformats.org/drawingml/2006/picture">
+                      <pic:pic xmlns:pic="http://schemas.openxmlformats.org/drawingml/2006/picture">
+                        <pic:nvPicPr>
+                          <pic:cNvPr id="0" name="" descr=""/>
+                          <pic:cNvPicPr>
+                            <a:picLocks noChangeAspect="1" noChangeArrowheads="1"/>
+                          </pic:cNvPicPr>
+                        </pic:nvPicPr>
+                        <pic:blipFill>
+                          <a:blip r:embed="rId28" cstate="none"/>
+                          <a:srcRect/>
+                          <a:stretch>
+                            <a:fillRect/>
+                          </a:stretch>
+                        </pic:blipFill>
+                        <pic:spPr bwMode="auto">
+                          <a:xfrm>
+                            <a:off x="0" y="0"/>
+                            <a:ext cx="4410075" cy="5334000"/>
+                          </a:xfrm>
+                          <a:prstGeom prst="rect">
+                            <a:avLst/>
+                          </a:prstGeom>
+                        </pic:spPr>
+                      </pic:pic>
+                    </a:graphicData>
+                  </a:graphic>
+                </wp:inline>
+              </w:drawing>
+            </w:r>
+          </w:p>
+        </w:tc>
+      </w:tr>
+    </w:tbl>
+    <w:p>
+      <w:pPr>
+        <w:spacing w:after="200" w:before="80"/>
+        <w:jc w:val="center"/>
+      </w:pPr>
+      <w:r>
+        <w:rPr>
+          <w:rFonts w:ascii="Arial" w:cs="Arial" w:eastAsia="Arial" w:hAnsi="Arial"/>
+          <w:b/>
+          <w:bCs/>
+          <w:color w:val="555B6E"/>
+          <w:sz w:val="17"/>
+          <w:szCs w:val="17"/>
+        </w:rPr>
+        <w:t xml:space="preserve">Figure 20. </w:t>
+      </w:r>
+      <w:r>
+        <w:rPr>
+          <w:rFonts w:ascii="Arial" w:cs="Arial" w:eastAsia="Arial" w:hAnsi="Arial"/>
+          <w:i/>
+          <w:iCs/>
+          <w:color w:val="555B6E"/>
+          <w:sz w:val="17"/>
+          <w:szCs w:val="17"/>
+        </w:rPr>
+        <w:t xml:space="preserve">A dashboard: figures, charts, a grid, a pivot and a hierarchy on one period, with a Channel slicer under it.</w:t>
+      </w:r>
+    </w:p>
     <w:p>
       <w:pPr>
         <w:spacing w:after="120" w:line="276"/>
@@ -16176,6 +18327,7 @@
     </w:p>
     <w:p>
       <w:pPr>
+        <w:keepNext/>
         <w:spacing w:after="100"/>
       </w:pPr>
       <w:r>
@@ -16199,6 +18351,113 @@
         <w:t xml:space="preserve">Its owner or a report administrator</w:t>
       </w:r>
     </w:p>
+    <w:tbl>
+      <w:tblPr>
+        <w:tblW w:type="dxa" w:w="9705"/>
+        <w:jc w:val="center"/>
+        <w:tblBorders>
+          <w:top w:val="single" w:color="D9DBE3" w:sz="4"/>
+          <w:left w:val="single" w:color="D9DBE3" w:sz="4"/>
+          <w:bottom w:val="single" w:color="D9DBE3" w:sz="4"/>
+          <w:right w:val="single" w:color="D9DBE3" w:sz="4"/>
+          <w:insideH w:val="none"/>
+          <w:insideV w:val="none"/>
+        </w:tblBorders>
+      </w:tblPr>
+      <w:tblGrid>
+        <w:gridCol w:w="9705"/>
+      </w:tblGrid>
+      <w:tr>
+        <w:trPr>
+          <w:cantSplit/>
+        </w:trPr>
+        <w:tc>
+          <w:tcPr>
+            <w:tcW w:type="dxa" w:w="9705"/>
+            <w:tcMar>
+              <w:top w:type="dxa" w:w="40"/>
+              <w:left w:type="dxa" w:w="40"/>
+              <w:bottom w:type="dxa" w:w="40"/>
+              <w:right w:type="dxa" w:w="40"/>
+            </w:tcMar>
+          </w:tcPr>
+          <w:p>
+            <w:pPr>
+              <w:keepNext/>
+              <w:jc w:val="center"/>
+            </w:pPr>
+            <w:r>
+              <w:drawing>
+                <wp:inline distT="0" distB="0" distL="0" distR="0">
+                  <wp:extent cx="6086475" cy="5334000"/>
+                  <wp:effectExtent t="0" r="0" b="0" l="0"/>
+                  <wp:docPr id="1" name="dashboard-edit" descr="The dashboard editor: Add Tile, the row controls and each tile's controls." title="The dashboard editor: Add Tile, the row controls and each tile's controls."/>
+                  <wp:cNvGraphicFramePr>
+                    <a:graphicFrameLocks xmlns:a="http://schemas.openxmlformats.org/drawingml/2006/main" noChangeAspect="1"/>
+                  </wp:cNvGraphicFramePr>
+                  <a:graphic xmlns:a="http://schemas.openxmlformats.org/drawingml/2006/main">
+                    <a:graphicData uri="http://schemas.openxmlformats.org/drawingml/2006/picture">
+                      <pic:pic xmlns:pic="http://schemas.openxmlformats.org/drawingml/2006/picture">
+                        <pic:nvPicPr>
+                          <pic:cNvPr id="0" name="" descr=""/>
+                          <pic:cNvPicPr>
+                            <a:picLocks noChangeAspect="1" noChangeArrowheads="1"/>
+                          </pic:cNvPicPr>
+                        </pic:nvPicPr>
+                        <pic:blipFill>
+                          <a:blip r:embed="rId29" cstate="none"/>
+                          <a:srcRect/>
+                          <a:stretch>
+                            <a:fillRect/>
+                          </a:stretch>
+                        </pic:blipFill>
+                        <pic:spPr bwMode="auto">
+                          <a:xfrm>
+                            <a:off x="0" y="0"/>
+                            <a:ext cx="6086475" cy="5334000"/>
+                          </a:xfrm>
+                          <a:prstGeom prst="rect">
+                            <a:avLst/>
+                          </a:prstGeom>
+                        </pic:spPr>
+                      </pic:pic>
+                    </a:graphicData>
+                  </a:graphic>
+                </wp:inline>
+              </w:drawing>
+            </w:r>
+          </w:p>
+        </w:tc>
+      </w:tr>
+    </w:tbl>
+    <w:p>
+      <w:pPr>
+        <w:spacing w:after="200" w:before="80"/>
+        <w:jc w:val="center"/>
+      </w:pPr>
+      <w:r>
+        <w:rPr>
+          <w:rFonts w:ascii="Arial" w:cs="Arial" w:eastAsia="Arial" w:hAnsi="Arial"/>
+          <w:b/>
+          <w:bCs/>
+          <w:color w:val="555B6E"/>
+          <w:sz w:val="17"/>
+          <w:szCs w:val="17"/>
+        </w:rPr>
+        <w:t xml:space="preserve">Figure 21. </w:t>
+      </w:r>
+      <w:r>
+        <w:rPr>
+          <w:rFonts w:ascii="Arial" w:cs="Arial" w:eastAsia="Arial" w:hAnsi="Arial"/>
+          <w:i/>
+          <w:iCs/>
+          <w:color w:val="555B6E"/>
+          <w:sz w:val="17"/>
+          <w:szCs w:val="17"/>
+        </w:rPr>
+        <w:t xml:space="preserve">The dashboard editor: Add Tile, the row controls and each tile's controls.</w:t>
+      </w:r>
+    </w:p>
     <w:p>
       <w:pPr>
         <w:pStyle w:val="ListParagraph"/>
@@ -16899,6 +19158,113 @@
         <w:t xml:space="preserve">Lay a dashboard out freely (Free Canvas)</w:t>
       </w:r>
     </w:p>
+    <w:tbl>
+      <w:tblPr>
+        <w:tblW w:type="dxa" w:w="9705"/>
+        <w:jc w:val="center"/>
+        <w:tblBorders>
+          <w:top w:val="single" w:color="D9DBE3" w:sz="4"/>
+          <w:left w:val="single" w:color="D9DBE3" w:sz="4"/>
+          <w:bottom w:val="single" w:color="D9DBE3" w:sz="4"/>
+          <w:right w:val="single" w:color="D9DBE3" w:sz="4"/>
+          <w:insideH w:val="none"/>
+          <w:insideV w:val="none"/>
+        </w:tblBorders>
+      </w:tblPr>
+      <w:tblGrid>
+        <w:gridCol w:w="9705"/>
+      </w:tblGrid>
+      <w:tr>
+        <w:trPr>
+          <w:cantSplit/>
+        </w:trPr>
+        <w:tc>
+          <w:tcPr>
+            <w:tcW w:type="dxa" w:w="9705"/>
+            <w:tcMar>
+              <w:top w:type="dxa" w:w="40"/>
+              <w:left w:type="dxa" w:w="40"/>
+              <w:bottom w:type="dxa" w:w="40"/>
+              <w:right w:type="dxa" w:w="40"/>
+            </w:tcMar>
+          </w:tcPr>
+          <w:p>
+            <w:pPr>
+              <w:keepNext/>
+              <w:jc w:val="center"/>
+            </w:pPr>
+            <w:r>
+              <w:drawing>
+                <wp:inline distT="0" distB="0" distL="0" distR="0">
+                  <wp:extent cx="6086475" cy="5334000"/>
+                  <wp:effectExtent t="0" r="0" b="0" l="0"/>
+                  <wp:docPr id="1" name="dashboard-canvas" descr="Free Canvas: drag a tile by its grip to move it and by its handle to resize it." title="Free Canvas: drag a tile by its grip to move it and by its handle to resize it."/>
+                  <wp:cNvGraphicFramePr>
+                    <a:graphicFrameLocks xmlns:a="http://schemas.openxmlformats.org/drawingml/2006/main" noChangeAspect="1"/>
+                  </wp:cNvGraphicFramePr>
+                  <a:graphic xmlns:a="http://schemas.openxmlformats.org/drawingml/2006/main">
+                    <a:graphicData uri="http://schemas.openxmlformats.org/drawingml/2006/picture">
+                      <pic:pic xmlns:pic="http://schemas.openxmlformats.org/drawingml/2006/picture">
+                        <pic:nvPicPr>
+                          <pic:cNvPr id="0" name="" descr=""/>
+                          <pic:cNvPicPr>
+                            <a:picLocks noChangeAspect="1" noChangeArrowheads="1"/>
+                          </pic:cNvPicPr>
+                        </pic:nvPicPr>
+                        <pic:blipFill>
+                          <a:blip r:embed="rId30" cstate="none"/>
+                          <a:srcRect/>
+                          <a:stretch>
+                            <a:fillRect/>
+                          </a:stretch>
+                        </pic:blipFill>
+                        <pic:spPr bwMode="auto">
+                          <a:xfrm>
+                            <a:off x="0" y="0"/>
+                            <a:ext cx="6086475" cy="5334000"/>
+                          </a:xfrm>
+                          <a:prstGeom prst="rect">
+                            <a:avLst/>
+                          </a:prstGeom>
+                        </pic:spPr>
+                      </pic:pic>
+                    </a:graphicData>
+                  </a:graphic>
+                </wp:inline>
+              </w:drawing>
+            </w:r>
+          </w:p>
+        </w:tc>
+      </w:tr>
+    </w:tbl>
+    <w:p>
+      <w:pPr>
+        <w:spacing w:after="200" w:before="80"/>
+        <w:jc w:val="center"/>
+      </w:pPr>
+      <w:r>
+        <w:rPr>
+          <w:rFonts w:ascii="Arial" w:cs="Arial" w:eastAsia="Arial" w:hAnsi="Arial"/>
+          <w:b/>
+          <w:bCs/>
+          <w:color w:val="555B6E"/>
+          <w:sz w:val="17"/>
+          <w:szCs w:val="17"/>
+        </w:rPr>
+        <w:t xml:space="preserve">Figure 22. </w:t>
+      </w:r>
+      <w:r>
+        <w:rPr>
+          <w:rFonts w:ascii="Arial" w:cs="Arial" w:eastAsia="Arial" w:hAnsi="Arial"/>
+          <w:i/>
+          <w:iCs/>
+          <w:color w:val="555B6E"/>
+          <w:sz w:val="17"/>
+          <w:szCs w:val="17"/>
+        </w:rPr>
+        <w:t xml:space="preserve">Free Canvas: drag a tile by its grip to move it and by its handle to resize it.</w:t>
+      </w:r>
+    </w:p>
     <w:p>
       <w:pPr>
         <w:pStyle w:val="ListParagraph"/>
@@ -17025,6 +19391,113 @@
         <w:t xml:space="preserve">See and shape the phone layout</w:t>
       </w:r>
     </w:p>
+    <w:tbl>
+      <w:tblPr>
+        <w:tblW w:type="dxa" w:w="8175"/>
+        <w:jc w:val="center"/>
+        <w:tblBorders>
+          <w:top w:val="single" w:color="D9DBE3" w:sz="4"/>
+          <w:left w:val="single" w:color="D9DBE3" w:sz="4"/>
+          <w:bottom w:val="single" w:color="D9DBE3" w:sz="4"/>
+          <w:right w:val="single" w:color="D9DBE3" w:sz="4"/>
+          <w:insideH w:val="none"/>
+          <w:insideV w:val="none"/>
+        </w:tblBorders>
+      </w:tblPr>
+      <w:tblGrid>
+        <w:gridCol w:w="8175"/>
+      </w:tblGrid>
+      <w:tr>
+        <w:trPr>
+          <w:cantSplit/>
+        </w:trPr>
+        <w:tc>
+          <w:tcPr>
+            <w:tcW w:type="dxa" w:w="8175"/>
+            <w:tcMar>
+              <w:top w:type="dxa" w:w="40"/>
+              <w:left w:type="dxa" w:w="40"/>
+              <w:bottom w:type="dxa" w:w="40"/>
+              <w:right w:type="dxa" w:w="40"/>
+            </w:tcMar>
+          </w:tcPr>
+          <w:p>
+            <w:pPr>
+              <w:keepNext/>
+              <w:jc w:val="center"/>
+            </w:pPr>
+            <w:r>
+              <w:drawing>
+                <wp:inline distT="0" distB="0" distL="0" distR="0">
+                  <wp:extent cx="5114925" cy="5334000"/>
+                  <wp:effectExtent t="0" r="0" b="0" l="0"/>
+                  <wp:docPr id="1" name="dashboard-phone" descr="The phone layout: the tiles stacked top to bottom, tiles hidden on a phone left out." title="The phone layout: the tiles stacked top to bottom, tiles hidden on a phone left out."/>
+                  <wp:cNvGraphicFramePr>
+                    <a:graphicFrameLocks xmlns:a="http://schemas.openxmlformats.org/drawingml/2006/main" noChangeAspect="1"/>
+                  </wp:cNvGraphicFramePr>
+                  <a:graphic xmlns:a="http://schemas.openxmlformats.org/drawingml/2006/main">
+                    <a:graphicData uri="http://schemas.openxmlformats.org/drawingml/2006/picture">
+                      <pic:pic xmlns:pic="http://schemas.openxmlformats.org/drawingml/2006/picture">
+                        <pic:nvPicPr>
+                          <pic:cNvPr id="0" name="" descr=""/>
+                          <pic:cNvPicPr>
+                            <a:picLocks noChangeAspect="1" noChangeArrowheads="1"/>
+                          </pic:cNvPicPr>
+                        </pic:nvPicPr>
+                        <pic:blipFill>
+                          <a:blip r:embed="rId31" cstate="none"/>
+                          <a:srcRect/>
+                          <a:stretch>
+                            <a:fillRect/>
+                          </a:stretch>
+                        </pic:blipFill>
+                        <pic:spPr bwMode="auto">
+                          <a:xfrm>
+                            <a:off x="0" y="0"/>
+                            <a:ext cx="5114925" cy="5334000"/>
+                          </a:xfrm>
+                          <a:prstGeom prst="rect">
+                            <a:avLst/>
+                          </a:prstGeom>
+                        </pic:spPr>
+                      </pic:pic>
+                    </a:graphicData>
+                  </a:graphic>
+                </wp:inline>
+              </w:drawing>
+            </w:r>
+          </w:p>
+        </w:tc>
+      </w:tr>
+    </w:tbl>
+    <w:p>
+      <w:pPr>
+        <w:spacing w:after="200" w:before="80"/>
+        <w:jc w:val="center"/>
+      </w:pPr>
+      <w:r>
+        <w:rPr>
+          <w:rFonts w:ascii="Arial" w:cs="Arial" w:eastAsia="Arial" w:hAnsi="Arial"/>
+          <w:b/>
+          <w:bCs/>
+          <w:color w:val="555B6E"/>
+          <w:sz w:val="17"/>
+          <w:szCs w:val="17"/>
+        </w:rPr>
+        <w:t xml:space="preserve">Figure 23. </w:t>
+      </w:r>
+      <w:r>
+        <w:rPr>
+          <w:rFonts w:ascii="Arial" w:cs="Arial" w:eastAsia="Arial" w:hAnsi="Arial"/>
+          <w:i/>
+          <w:iCs/>
+          <w:color w:val="555B6E"/>
+          <w:sz w:val="17"/>
+          <w:szCs w:val="17"/>
+        </w:rPr>
+        <w:t xml:space="preserve">The phone layout: the tiles stacked top to bottom, tiles hidden on a phone left out.</w:t>
+      </w:r>
+    </w:p>
     <w:p>
       <w:pPr>
         <w:pStyle w:val="ListParagraph"/>
@@ -17117,6 +19590,113 @@
           <w:rFonts w:ascii="Arial" w:cs="Arial" w:eastAsia="Arial" w:hAnsi="Arial"/>
         </w:rPr>
         <w:t xml:space="preserve">Give a dashboard a theme</w:t>
+      </w:r>
+    </w:p>
+    <w:tbl>
+      <w:tblPr>
+        <w:tblW w:type="dxa" w:w="9705"/>
+        <w:jc w:val="center"/>
+        <w:tblBorders>
+          <w:top w:val="single" w:color="D9DBE3" w:sz="4"/>
+          <w:left w:val="single" w:color="D9DBE3" w:sz="4"/>
+          <w:bottom w:val="single" w:color="D9DBE3" w:sz="4"/>
+          <w:right w:val="single" w:color="D9DBE3" w:sz="4"/>
+          <w:insideH w:val="none"/>
+          <w:insideV w:val="none"/>
+        </w:tblBorders>
+      </w:tblPr>
+      <w:tblGrid>
+        <w:gridCol w:w="9705"/>
+      </w:tblGrid>
+      <w:tr>
+        <w:trPr>
+          <w:cantSplit/>
+        </w:trPr>
+        <w:tc>
+          <w:tcPr>
+            <w:tcW w:type="dxa" w:w="9705"/>
+            <w:tcMar>
+              <w:top w:type="dxa" w:w="40"/>
+              <w:left w:type="dxa" w:w="40"/>
+              <w:bottom w:type="dxa" w:w="40"/>
+              <w:right w:type="dxa" w:w="40"/>
+            </w:tcMar>
+          </w:tcPr>
+          <w:p>
+            <w:pPr>
+              <w:keepNext/>
+              <w:jc w:val="center"/>
+            </w:pPr>
+            <w:r>
+              <w:drawing>
+                <wp:inline distT="0" distB="0" distL="0" distR="0">
+                  <wp:extent cx="6086475" cy="5334000"/>
+                  <wp:effectExtent t="0" r="0" b="0" l="0"/>
+                  <wp:docPr id="1" name="dashboard-theme" descr="The Navy theme: every chart on the dashboard takes its colours." title="The Navy theme: every chart on the dashboard takes its colours."/>
+                  <wp:cNvGraphicFramePr>
+                    <a:graphicFrameLocks xmlns:a="http://schemas.openxmlformats.org/drawingml/2006/main" noChangeAspect="1"/>
+                  </wp:cNvGraphicFramePr>
+                  <a:graphic xmlns:a="http://schemas.openxmlformats.org/drawingml/2006/main">
+                    <a:graphicData uri="http://schemas.openxmlformats.org/drawingml/2006/picture">
+                      <pic:pic xmlns:pic="http://schemas.openxmlformats.org/drawingml/2006/picture">
+                        <pic:nvPicPr>
+                          <pic:cNvPr id="0" name="" descr=""/>
+                          <pic:cNvPicPr>
+                            <a:picLocks noChangeAspect="1" noChangeArrowheads="1"/>
+                          </pic:cNvPicPr>
+                        </pic:nvPicPr>
+                        <pic:blipFill>
+                          <a:blip r:embed="rId32" cstate="none"/>
+                          <a:srcRect/>
+                          <a:stretch>
+                            <a:fillRect/>
+                          </a:stretch>
+                        </pic:blipFill>
+                        <pic:spPr bwMode="auto">
+                          <a:xfrm>
+                            <a:off x="0" y="0"/>
+                            <a:ext cx="6086475" cy="5334000"/>
+                          </a:xfrm>
+                          <a:prstGeom prst="rect">
+                            <a:avLst/>
+                          </a:prstGeom>
+                        </pic:spPr>
+                      </pic:pic>
+                    </a:graphicData>
+                  </a:graphic>
+                </wp:inline>
+              </w:drawing>
+            </w:r>
+          </w:p>
+        </w:tc>
+      </w:tr>
+    </w:tbl>
+    <w:p>
+      <w:pPr>
+        <w:spacing w:after="200" w:before="80"/>
+        <w:jc w:val="center"/>
+      </w:pPr>
+      <w:r>
+        <w:rPr>
+          <w:rFonts w:ascii="Arial" w:cs="Arial" w:eastAsia="Arial" w:hAnsi="Arial"/>
+          <w:b/>
+          <w:bCs/>
+          <w:color w:val="555B6E"/>
+          <w:sz w:val="17"/>
+          <w:szCs w:val="17"/>
+        </w:rPr>
+        <w:t xml:space="preserve">Figure 24. </w:t>
+      </w:r>
+      <w:r>
+        <w:rPr>
+          <w:rFonts w:ascii="Arial" w:cs="Arial" w:eastAsia="Arial" w:hAnsi="Arial"/>
+          <w:i/>
+          <w:iCs/>
+          <w:color w:val="555B6E"/>
+          <w:sz w:val="17"/>
+          <w:szCs w:val="17"/>
+        </w:rPr>
+        <w:t xml:space="preserve">The Navy theme: every chart on the dashboard takes its colours.</w:t>
       </w:r>
     </w:p>
     <w:p>
@@ -17596,6 +20176,7 @@
     </w:p>
     <w:p>
       <w:pPr>
+        <w:keepNext/>
         <w:spacing w:after="100"/>
       </w:pPr>
       <w:r>
@@ -17619,6 +20200,113 @@
         <w:t xml:space="preserve">Anyone who can build reports</w:t>
       </w:r>
     </w:p>
+    <w:tbl>
+      <w:tblPr>
+        <w:tblW w:type="dxa" w:w="9870"/>
+        <w:jc w:val="center"/>
+        <w:tblBorders>
+          <w:top w:val="single" w:color="D9DBE3" w:sz="4"/>
+          <w:left w:val="single" w:color="D9DBE3" w:sz="4"/>
+          <w:bottom w:val="single" w:color="D9DBE3" w:sz="4"/>
+          <w:right w:val="single" w:color="D9DBE3" w:sz="4"/>
+          <w:insideH w:val="none"/>
+          <w:insideV w:val="none"/>
+        </w:tblBorders>
+      </w:tblPr>
+      <w:tblGrid>
+        <w:gridCol w:w="9870"/>
+      </w:tblGrid>
+      <w:tr>
+        <w:trPr>
+          <w:cantSplit/>
+        </w:trPr>
+        <w:tc>
+          <w:tcPr>
+            <w:tcW w:type="dxa" w:w="9870"/>
+            <w:tcMar>
+              <w:top w:type="dxa" w:w="40"/>
+              <w:left w:type="dxa" w:w="40"/>
+              <w:bottom w:type="dxa" w:w="40"/>
+              <w:right w:type="dxa" w:w="40"/>
+            </w:tcMar>
+          </w:tcPr>
+          <w:p>
+            <w:pPr>
+              <w:keepNext/>
+              <w:jc w:val="center"/>
+            </w:pPr>
+            <w:r>
+              <w:drawing>
+                <wp:inline distT="0" distB="0" distL="0" distR="0">
+                  <wp:extent cx="6191250" cy="4381500"/>
+                  <wp:effectExtent t="0" r="0" b="0" l="0"/>
+                  <wp:docPr id="1" name="ask" descr="Ask for a Report above the report list, with the model to use and your recent prompts." title="Ask for a Report above the report list, with the model to use and your recent prompts."/>
+                  <wp:cNvGraphicFramePr>
+                    <a:graphicFrameLocks xmlns:a="http://schemas.openxmlformats.org/drawingml/2006/main" noChangeAspect="1"/>
+                  </wp:cNvGraphicFramePr>
+                  <a:graphic xmlns:a="http://schemas.openxmlformats.org/drawingml/2006/main">
+                    <a:graphicData uri="http://schemas.openxmlformats.org/drawingml/2006/picture">
+                      <pic:pic xmlns:pic="http://schemas.openxmlformats.org/drawingml/2006/picture">
+                        <pic:nvPicPr>
+                          <pic:cNvPr id="0" name="" descr=""/>
+                          <pic:cNvPicPr>
+                            <a:picLocks noChangeAspect="1" noChangeArrowheads="1"/>
+                          </pic:cNvPicPr>
+                        </pic:nvPicPr>
+                        <pic:blipFill>
+                          <a:blip r:embed="rId33" cstate="none"/>
+                          <a:srcRect/>
+                          <a:stretch>
+                            <a:fillRect/>
+                          </a:stretch>
+                        </pic:blipFill>
+                        <pic:spPr bwMode="auto">
+                          <a:xfrm>
+                            <a:off x="0" y="0"/>
+                            <a:ext cx="6191250" cy="4381500"/>
+                          </a:xfrm>
+                          <a:prstGeom prst="rect">
+                            <a:avLst/>
+                          </a:prstGeom>
+                        </pic:spPr>
+                      </pic:pic>
+                    </a:graphicData>
+                  </a:graphic>
+                </wp:inline>
+              </w:drawing>
+            </w:r>
+          </w:p>
+        </w:tc>
+      </w:tr>
+    </w:tbl>
+    <w:p>
+      <w:pPr>
+        <w:spacing w:after="200" w:before="80"/>
+        <w:jc w:val="center"/>
+      </w:pPr>
+      <w:r>
+        <w:rPr>
+          <w:rFonts w:ascii="Arial" w:cs="Arial" w:eastAsia="Arial" w:hAnsi="Arial"/>
+          <w:b/>
+          <w:bCs/>
+          <w:color w:val="555B6E"/>
+          <w:sz w:val="17"/>
+          <w:szCs w:val="17"/>
+        </w:rPr>
+        <w:t xml:space="preserve">Figure 25. </w:t>
+      </w:r>
+      <w:r>
+        <w:rPr>
+          <w:rFonts w:ascii="Arial" w:cs="Arial" w:eastAsia="Arial" w:hAnsi="Arial"/>
+          <w:i/>
+          <w:iCs/>
+          <w:color w:val="555B6E"/>
+          <w:sz w:val="17"/>
+          <w:szCs w:val="17"/>
+        </w:rPr>
+        <w:t xml:space="preserve">Ask for a Report above the report list, with the model to use and your recent prompts.</w:t>
+      </w:r>
+    </w:p>
     <w:p>
       <w:pPr>
         <w:pStyle w:val="ListParagraph"/>
@@ -17775,6 +20463,7 @@
     </w:p>
     <w:p>
       <w:pPr>
+        <w:keepNext/>
         <w:spacing w:after="100"/>
       </w:pPr>
       <w:r>
@@ -19106,6 +21795,7 @@
     </w:p>
     <w:p>
       <w:pPr>
+        <w:keepNext/>
         <w:spacing w:after="100"/>
       </w:pPr>
       <w:r>

</xml_diff>

<commit_message>
Docs: Ask for a Report, adding images step by step
A new "Add images to a prompt" block in the Insights chapter: the three ways to add them (Add Images, drop on the panel,
paste), the thumbnails and count, what is sent and that nothing is kept. The Insights guide places it, and the step
"Connect a database from New Report" that its outline was missing; the Word copies are rebuilt.

Co-Authored-By: Claude Opus 5.5 <noreply@anthropic.com>
</commit_message>
<xml_diff>
--- a/docs/manuals/C360_Insights_User_Guide.docx
+++ b/docs/manuals/C360_Insights_User_Guide.docx
@@ -63,7 +63,7 @@
           <w:sz w:val="20"/>
           <w:szCs w:val="20"/>
         </w:rPr>
-        <w:t xml:space="preserve">10 parts, 73 topics. Built 2026-10-19 from the in-app help, so it matches what the help panel shows.</w:t>
+        <w:t xml:space="preserve">10 parts, 75 topics. Built 2026-10-22 from the in-app help, so it matches what the help panel shows.</w:t>
       </w:r>
     </w:p>
     <w:p>
@@ -371,7 +371,7 @@
           <w:sz w:val="18"/>
           <w:szCs w:val="18"/>
         </w:rPr>
-        <w:t xml:space="preserve">Report on a CSV or Excel file (Uploaded Files)  ·  Connect a database  ·  Map a dataset from a table  ·  Join tables in a dataset  ·  Add a calculated measure  ·  Build a report from a query</w:t>
+        <w:t xml:space="preserve">Report on a CSV or Excel file (Uploaded Files)  ·  Connect a database  ·  Connect a database from New Report  ·  Map a dataset from a table  ·  Join tables in a dataset  ·  Add a calculated measure  ·  Build a report from a query</w:t>
       </w:r>
     </w:p>
     <w:p>
@@ -457,7 +457,7 @@
           <w:sz w:val="18"/>
           <w:szCs w:val="18"/>
         </w:rPr>
-        <w:t xml:space="preserve">Ask for a Report  ·  Use AI in your workspace  ·  Explain This Report, with AI  ·  Change a report with a prompt, with AI</w:t>
+        <w:t xml:space="preserve">Ask for a Report  ·  Add images to a prompt  ·  Use AI in your workspace  ·  Explain This Report, with AI  ·  Change a report with a prompt, with AI</w:t>
       </w:r>
     </w:p>
     <w:p>
@@ -16168,7 +16168,7 @@
           <w:sz w:val="22"/>
           <w:szCs w:val="22"/>
         </w:rPr>
-        <w:t xml:space="preserve">Reports on a CSV or Excel file, and on a MySQL or PostgreSQL database of your own, read-only.</w:t>
+        <w:t xml:space="preserve">Reports on a CSV or Excel file, and on a MySQL, PostgreSQL or ClickHouse database of your own, read-only.</w:t>
       </w:r>
     </w:p>
     <w:p>
@@ -16607,7 +16607,7 @@
         <w:rPr>
           <w:rFonts w:ascii="Arial" w:cs="Arial" w:eastAsia="Arial" w:hAnsi="Arial"/>
         </w:rPr>
-        <w:t xml:space="preserve">Ask your database administrator for an account that holds SELECT and nothing else; the page shows the exact statements for MySQL and PostgreSQL.</w:t>
+        <w:t xml:space="preserve">Ask your database administrator for an account that holds SELECT and nothing else; the page shows the exact statements for MySQL, PostgreSQL and ClickHouse.</w:t>
       </w:r>
     </w:p>
     <w:p>
@@ -16639,7 +16639,7 @@
         <w:rPr>
           <w:rFonts w:ascii="Arial" w:cs="Arial" w:eastAsia="Arial" w:hAnsi="Arial"/>
         </w:rPr>
-        <w:t xml:space="preserve">. Give it a name, pick the engine (MySQL 5.7, MySQL 8.0 or PostgreSQL), enter the host, port, database, the schema for PostgreSQL, the user and the password, and choose SSL.</w:t>
+        <w:t xml:space="preserve">. Give it a name, pick the engine (MySQL 5.7, MySQL 8.0, PostgreSQL or ClickHouse), enter the host, port, database, the schema for PostgreSQL, the user and the password, and choose SSL.</w:t>
       </w:r>
     </w:p>
     <w:p>
@@ -16715,7 +16715,7 @@
         <w:rPr>
           <w:rFonts w:ascii="Arial" w:cs="Arial" w:eastAsia="Arial" w:hAnsi="Arial"/>
         </w:rPr>
-        <w:t xml:space="preserve">Map a dataset from a table</w:t>
+        <w:t xml:space="preserve">Connect a database from New Report</w:t>
       </w:r>
     </w:p>
     <w:p>
@@ -16741,7 +16741,7 @@
           <w:sz w:val="18"/>
           <w:szCs w:val="18"/>
         </w:rPr>
-        <w:t xml:space="preserve">Workspace administrator</w:t>
+        <w:t xml:space="preserve">Report author</w:t>
       </w:r>
     </w:p>
     <w:p>
@@ -16759,21 +16759,49 @@
         <w:rPr>
           <w:rFonts w:ascii="Arial" w:cs="Arial" w:eastAsia="Arial" w:hAnsi="Arial"/>
         </w:rPr>
-        <w:t xml:space="preserve">On the database's card, press </w:t>
-      </w:r>
-      <w:r>
-        <w:rPr>
-          <w:rFonts w:ascii="Arial" w:cs="Arial" w:eastAsia="Arial" w:hAnsi="Arial"/>
-          <w:b/>
-          <w:bCs/>
-        </w:rPr>
-        <w:t xml:space="preserve">Map a Dataset</w:t>
-      </w:r>
-      <w:r>
-        <w:rPr>
-          <w:rFonts w:ascii="Arial" w:cs="Arial" w:eastAsia="Arial" w:hAnsi="Arial"/>
-        </w:rPr>
-        <w:t xml:space="preserve">. Pick a table or view on the left; views come first.</w:t>
+        <w:t xml:space="preserve">Open Insights → Reports → </w:t>
+      </w:r>
+      <w:r>
+        <w:rPr>
+          <w:rFonts w:ascii="Arial" w:cs="Arial" w:eastAsia="Arial" w:hAnsi="Arial"/>
+          <w:b/>
+          <w:bCs/>
+        </w:rPr>
+        <w:t xml:space="preserve">New Report</w:t>
+      </w:r>
+      <w:r>
+        <w:rPr>
+          <w:rFonts w:ascii="Arial" w:cs="Arial" w:eastAsia="Arial" w:hAnsi="Arial"/>
+        </w:rPr>
+        <w:t xml:space="preserve">. Under </w:t>
+      </w:r>
+      <w:r>
+        <w:rPr>
+          <w:rFonts w:ascii="Arial" w:cs="Arial" w:eastAsia="Arial" w:hAnsi="Arial"/>
+          <w:b/>
+          <w:bCs/>
+        </w:rPr>
+        <w:t xml:space="preserve">Your Databases</w:t>
+      </w:r>
+      <w:r>
+        <w:rPr>
+          <w:rFonts w:ascii="Arial" w:cs="Arial" w:eastAsia="Arial" w:hAnsi="Arial"/>
+        </w:rPr>
+        <w:t xml:space="preserve">, press </w:t>
+      </w:r>
+      <w:r>
+        <w:rPr>
+          <w:rFonts w:ascii="Arial" w:cs="Arial" w:eastAsia="Arial" w:hAnsi="Arial"/>
+          <w:b/>
+          <w:bCs/>
+        </w:rPr>
+        <w:t xml:space="preserve">Connect a Database</w:t>
+      </w:r>
+      <w:r>
+        <w:rPr>
+          <w:rFonts w:ascii="Arial" w:cs="Arial" w:eastAsia="Arial" w:hAnsi="Arial"/>
+        </w:rPr>
+        <w:t xml:space="preserve">. A panel opens over the page.</w:t>
       </w:r>
     </w:p>
     <w:p>
@@ -16791,127 +16819,81 @@
         <w:rPr>
           <w:rFonts w:ascii="Arial" w:cs="Arial" w:eastAsia="Arial" w:hAnsi="Arial"/>
         </w:rPr>
-        <w:t xml:space="preserve">Name the dataset and describe it. Choose the </w:t>
-      </w:r>
-      <w:r>
-        <w:rPr>
-          <w:rFonts w:ascii="Arial" w:cs="Arial" w:eastAsia="Arial" w:hAnsi="Arial"/>
-          <w:b/>
-          <w:bCs/>
-        </w:rPr>
-        <w:t xml:space="preserve">Row Key</w:t>
-      </w:r>
-      <w:r>
-        <w:rPr>
-          <w:rFonts w:ascii="Arial" w:cs="Arial" w:eastAsia="Arial" w:hAnsi="Arial"/>
-        </w:rPr>
-        <w:t xml:space="preserve"> (what one row is) and the </w:t>
-      </w:r>
-      <w:r>
-        <w:rPr>
-          <w:rFonts w:ascii="Arial" w:cs="Arial" w:eastAsia="Arial" w:hAnsi="Arial"/>
-          <w:b/>
-          <w:bCs/>
-        </w:rPr>
-        <w:t xml:space="preserve">Time Field</w:t>
-      </w:r>
-      <w:r>
-        <w:rPr>
-          <w:rFonts w:ascii="Arial" w:cs="Arial" w:eastAsia="Arial" w:hAnsi="Arial"/>
-        </w:rPr>
-        <w:t xml:space="preserve"> (the date a period filter applies to).</w:t>
-      </w:r>
-    </w:p>
-    <w:p>
-      <w:pPr>
-        <w:pStyle w:val="ListParagraph"/>
-        <w:keepNext/>
+        <w:t xml:space="preserve">Fill in the same fields as above and press </w:t>
+      </w:r>
+      <w:r>
+        <w:rPr>
+          <w:rFonts w:ascii="Arial" w:cs="Arial" w:eastAsia="Arial" w:hAnsi="Arial"/>
+          <w:b/>
+          <w:bCs/>
+        </w:rPr>
+        <w:t xml:space="preserve">Test Connection</w:t>
+      </w:r>
+      <w:r>
+        <w:rPr>
+          <w:rFonts w:ascii="Arial" w:cs="Arial" w:eastAsia="Arial" w:hAnsi="Arial"/>
+        </w:rPr>
+        <w:t xml:space="preserve">. </w:t>
+      </w:r>
+      <w:r>
+        <w:rPr>
+          <w:rFonts w:ascii="Arial" w:cs="Arial" w:eastAsia="Arial" w:hAnsi="Arial"/>
+          <w:b/>
+          <w:bCs/>
+        </w:rPr>
+        <w:t xml:space="preserve">Save and Continue</w:t>
+      </w:r>
+      <w:r>
+        <w:rPr>
+          <w:rFonts w:ascii="Arial" w:cs="Arial" w:eastAsia="Arial" w:hAnsi="Arial"/>
+        </w:rPr>
+        <w:t xml:space="preserve"> is offered only once the test shows the account read-only; if it can write, the panel says what it holds and asks for an account that can only read.</w:t>
+      </w:r>
+    </w:p>
+    <w:p>
+      <w:pPr>
+        <w:pStyle w:val="ListParagraph"/>
+        <w:keepNext w:val="false"/>
         <w:keepLines/>
         <w:numPr>
           <w:ilvl w:val="0"/>
           <w:numId w:val="35"/>
         </w:numPr>
-        <w:spacing w:after="80" w:line="276"/>
-      </w:pPr>
-      <w:r>
-        <w:rPr>
-          <w:rFonts w:ascii="Arial" w:cs="Arial" w:eastAsia="Arial" w:hAnsi="Arial"/>
-        </w:rPr>
-        <w:t xml:space="preserve">For each column: tick it to keep it, give it a label, check its type and role, pick the calculations a measure allows, and set the sensitivity (</w:t>
-      </w:r>
-      <w:r>
-        <w:rPr>
-          <w:rFonts w:ascii="Arial" w:cs="Arial" w:eastAsia="Arial" w:hAnsi="Arial"/>
-          <w:b/>
-          <w:bCs/>
-        </w:rPr>
-        <w:t xml:space="preserve">Personal</w:t>
-      </w:r>
-      <w:r>
-        <w:rPr>
-          <w:rFonts w:ascii="Arial" w:cs="Arial" w:eastAsia="Arial" w:hAnsi="Arial"/>
-        </w:rPr>
-        <w:t xml:space="preserve"> is masked for readers without the right, </w:t>
-      </w:r>
-      <w:r>
-        <w:rPr>
-          <w:rFonts w:ascii="Arial" w:cs="Arial" w:eastAsia="Arial" w:hAnsi="Arial"/>
-          <w:b/>
-          <w:bCs/>
-        </w:rPr>
-        <w:t xml:space="preserve">Confidential</w:t>
-      </w:r>
-      <w:r>
-        <w:rPr>
-          <w:rFonts w:ascii="Arial" w:cs="Arial" w:eastAsia="Arial" w:hAnsi="Arial"/>
-        </w:rPr>
-        <w:t xml:space="preserve"> is hidden from everyone).</w:t>
-      </w:r>
-    </w:p>
-    <w:p>
-      <w:pPr>
-        <w:pStyle w:val="ListParagraph"/>
-        <w:keepNext w:val="false"/>
-        <w:keepLines/>
-        <w:numPr>
-          <w:ilvl w:val="0"/>
-          <w:numId w:val="35"/>
-        </w:numPr>
         <w:spacing w:after="160" w:line="276"/>
       </w:pPr>
       <w:r>
         <w:rPr>
           <w:rFonts w:ascii="Arial" w:cs="Arial" w:eastAsia="Arial" w:hAnsi="Arial"/>
         </w:rPr>
-        <w:t xml:space="preserve">Watch the preview under the fields update with your labels, then press </w:t>
-      </w:r>
-      <w:r>
-        <w:rPr>
-          <w:rFonts w:ascii="Arial" w:cs="Arial" w:eastAsia="Arial" w:hAnsi="Arial"/>
-          <w:b/>
-          <w:bCs/>
-        </w:rPr>
-        <w:t xml:space="preserve">Save Dataset</w:t>
-      </w:r>
-      <w:r>
-        <w:rPr>
-          <w:rFonts w:ascii="Arial" w:cs="Arial" w:eastAsia="Arial" w:hAnsi="Arial"/>
-        </w:rPr>
-        <w:t xml:space="preserve">. It appears in New Report under </w:t>
-      </w:r>
-      <w:r>
-        <w:rPr>
-          <w:rFonts w:ascii="Arial" w:cs="Arial" w:eastAsia="Arial" w:hAnsi="Arial"/>
-          <w:b/>
-          <w:bCs/>
-        </w:rPr>
-        <w:t xml:space="preserve">Your Databases</w:t>
-      </w:r>
-      <w:r>
-        <w:rPr>
-          <w:rFonts w:ascii="Arial" w:cs="Arial" w:eastAsia="Arial" w:hAnsi="Arial"/>
-        </w:rPr>
-        <w:t xml:space="preserve">.</w:t>
+        <w:t xml:space="preserve">Pick a table or view (search narrows the list) and press </w:t>
+      </w:r>
+      <w:r>
+        <w:rPr>
+          <w:rFonts w:ascii="Arial" w:cs="Arial" w:eastAsia="Arial" w:hAnsi="Arial"/>
+          <w:b/>
+          <w:bCs/>
+        </w:rPr>
+        <w:t xml:space="preserve">Create Report</w:t>
+      </w:r>
+      <w:r>
+        <w:rPr>
+          <w:rFonts w:ascii="Arial" w:cs="Arial" w:eastAsia="Arial" w:hAnsi="Arial"/>
+        </w:rPr>
+        <w:t xml:space="preserve">. The table becomes a dataset with every readable column, labelled from its name, the first date as its time field; the report opens in the editor. A table mapped before keeps its dataset. Or press </w:t>
+      </w:r>
+      <w:r>
+        <w:rPr>
+          <w:rFonts w:ascii="Arial" w:cs="Arial" w:eastAsia="Arial" w:hAnsi="Arial"/>
+          <w:b/>
+          <w:bCs/>
+        </w:rPr>
+        <w:t xml:space="preserve">write a query</w:t>
+      </w:r>
+      <w:r>
+        <w:rPr>
+          <w:rFonts w:ascii="Arial" w:cs="Arial" w:eastAsia="Arial" w:hAnsi="Arial"/>
+        </w:rPr>
+        <w:t xml:space="preserve"> to open the query window on the database.</w:t>
       </w:r>
     </w:p>
     <w:p>
@@ -16923,175 +16905,7 @@
         <w:rPr>
           <w:rFonts w:ascii="Arial" w:cs="Arial" w:eastAsia="Arial" w:hAnsi="Arial"/>
         </w:rPr>
-        <w:t xml:space="preserve">Join tables in a dataset</w:t>
-      </w:r>
-    </w:p>
-    <w:p>
-      <w:pPr>
-        <w:pStyle w:val="ListParagraph"/>
-        <w:keepNext/>
-        <w:keepLines/>
-        <w:numPr>
-          <w:ilvl w:val="0"/>
-          <w:numId w:val="36"/>
-        </w:numPr>
-        <w:spacing w:after="80" w:line="276"/>
-      </w:pPr>
-      <w:r>
-        <w:rPr>
-          <w:rFonts w:ascii="Arial" w:cs="Arial" w:eastAsia="Arial" w:hAnsi="Arial"/>
-        </w:rPr>
-        <w:t xml:space="preserve">On the mapping page, press </w:t>
-      </w:r>
-      <w:r>
-        <w:rPr>
-          <w:rFonts w:ascii="Arial" w:cs="Arial" w:eastAsia="Arial" w:hAnsi="Arial"/>
-          <w:b/>
-          <w:bCs/>
-        </w:rPr>
-        <w:t xml:space="preserve">Add a Join</w:t>
-      </w:r>
-      <w:r>
-        <w:rPr>
-          <w:rFonts w:ascii="Arial" w:cs="Arial" w:eastAsia="Arial" w:hAnsi="Arial"/>
-        </w:rPr>
-        <w:t xml:space="preserve">, or </w:t>
-      </w:r>
-      <w:r>
-        <w:rPr>
-          <w:rFonts w:ascii="Arial" w:cs="Arial" w:eastAsia="Arial" w:hAnsi="Arial"/>
-          <w:b/>
-          <w:bCs/>
-        </w:rPr>
-        <w:t xml:space="preserve">Join to this</w:t>
-      </w:r>
-      <w:r>
-        <w:rPr>
-          <w:rFonts w:ascii="Arial" w:cs="Arial" w:eastAsia="Arial" w:hAnsi="Arial"/>
-        </w:rPr>
-        <w:t xml:space="preserve"> on a table's card in the diagram.</w:t>
-      </w:r>
-    </w:p>
-    <w:p>
-      <w:pPr>
-        <w:pStyle w:val="ListParagraph"/>
-        <w:keepNext/>
-        <w:keepLines/>
-        <w:numPr>
-          <w:ilvl w:val="0"/>
-          <w:numId w:val="36"/>
-        </w:numPr>
-        <w:spacing w:after="80" w:line="276"/>
-      </w:pPr>
-      <w:r>
-        <w:rPr>
-          <w:rFonts w:ascii="Arial" w:cs="Arial" w:eastAsia="Arial" w:hAnsi="Arial"/>
-        </w:rPr>
-        <w:t xml:space="preserve">Choose what to join to (the base, or a table already joined), the table, and whether to keep every row (</w:t>
-      </w:r>
-      <w:r>
-        <w:rPr>
-          <w:rFonts w:ascii="Arial" w:cs="Arial" w:eastAsia="Arial" w:hAnsi="Arial"/>
-          <w:b/>
-          <w:bCs/>
-        </w:rPr>
-        <w:t xml:space="preserve">Left</w:t>
-      </w:r>
-      <w:r>
-        <w:rPr>
-          <w:rFonts w:ascii="Arial" w:cs="Arial" w:eastAsia="Arial" w:hAnsi="Arial"/>
-        </w:rPr>
-        <w:t xml:space="preserve">) or only the rows that match (</w:t>
-      </w:r>
-      <w:r>
-        <w:rPr>
-          <w:rFonts w:ascii="Arial" w:cs="Arial" w:eastAsia="Arial" w:hAnsi="Arial"/>
-          <w:b/>
-          <w:bCs/>
-        </w:rPr>
-        <w:t xml:space="preserve">Inner</w:t>
-      </w:r>
-      <w:r>
-        <w:rPr>
-          <w:rFonts w:ascii="Arial" w:cs="Arial" w:eastAsia="Arial" w:hAnsi="Arial"/>
-        </w:rPr>
-        <w:t xml:space="preserve">).</w:t>
-      </w:r>
-    </w:p>
-    <w:p>
-      <w:pPr>
-        <w:pStyle w:val="ListParagraph"/>
-        <w:keepNext/>
-        <w:keepLines/>
-        <w:numPr>
-          <w:ilvl w:val="0"/>
-          <w:numId w:val="36"/>
-        </w:numPr>
-        <w:spacing w:after="80" w:line="276"/>
-      </w:pPr>
-      <w:r>
-        <w:rPr>
-          <w:rFonts w:ascii="Arial" w:cs="Arial" w:eastAsia="Arial" w:hAnsi="Arial"/>
-        </w:rPr>
-        <w:t xml:space="preserve">Say which columns are equal; the first pair is suggested from the names. Press </w:t>
-      </w:r>
-      <w:r>
-        <w:rPr>
-          <w:rFonts w:ascii="Arial" w:cs="Arial" w:eastAsia="Arial" w:hAnsi="Arial"/>
-          <w:b/>
-          <w:bCs/>
-        </w:rPr>
-        <w:t xml:space="preserve">Check the Join</w:t>
-      </w:r>
-      <w:r>
-        <w:rPr>
-          <w:rFonts w:ascii="Arial" w:cs="Arial" w:eastAsia="Arial" w:hAnsi="Arial"/>
-        </w:rPr>
-        <w:t xml:space="preserve"> to see how many rows match and whether the join multiplies rows, then </w:t>
-      </w:r>
-      <w:r>
-        <w:rPr>
-          <w:rFonts w:ascii="Arial" w:cs="Arial" w:eastAsia="Arial" w:hAnsi="Arial"/>
-          <w:b/>
-          <w:bCs/>
-        </w:rPr>
-        <w:t xml:space="preserve">Add</w:t>
-      </w:r>
-      <w:r>
-        <w:rPr>
-          <w:rFonts w:ascii="Arial" w:cs="Arial" w:eastAsia="Arial" w:hAnsi="Arial"/>
-        </w:rPr>
-        <w:t xml:space="preserve">.</w:t>
-      </w:r>
-    </w:p>
-    <w:p>
-      <w:pPr>
-        <w:pStyle w:val="ListParagraph"/>
-        <w:keepNext w:val="false"/>
-        <w:keepLines/>
-        <w:numPr>
-          <w:ilvl w:val="0"/>
-          <w:numId w:val="36"/>
-        </w:numPr>
-        <w:spacing w:after="160" w:line="276"/>
-      </w:pPr>
-      <w:r>
-        <w:rPr>
-          <w:rFonts w:ascii="Arial" w:cs="Arial" w:eastAsia="Arial" w:hAnsi="Arial"/>
-        </w:rPr>
-        <w:t xml:space="preserve">The joined table appears as a card with the key drawn to it; its columns are fields labelled with the table's name. Up to five joins; removing one removes the joins chained to it.</w:t>
-      </w:r>
-    </w:p>
-    <w:p>
-      <w:pPr>
-        <w:pStyle w:val="Heading2"/>
-        <w:keepNext/>
-      </w:pPr>
-      <w:r>
-        <w:rPr>
-          <w:rFonts w:ascii="Arial" w:cs="Arial" w:eastAsia="Arial" w:hAnsi="Arial"/>
-        </w:rPr>
-        <w:t xml:space="preserve">Add a calculated measure</w:t>
+        <w:t xml:space="preserve">Map a dataset from a table</w:t>
       </w:r>
     </w:p>
     <w:p>
@@ -17123,305 +16937,135 @@
     <w:p>
       <w:pPr>
         <w:pStyle w:val="ListParagraph"/>
+        <w:keepNext/>
+        <w:keepLines/>
+        <w:numPr>
+          <w:ilvl w:val="0"/>
+          <w:numId w:val="36"/>
+        </w:numPr>
+        <w:spacing w:after="80" w:line="276"/>
+      </w:pPr>
+      <w:r>
+        <w:rPr>
+          <w:rFonts w:ascii="Arial" w:cs="Arial" w:eastAsia="Arial" w:hAnsi="Arial"/>
+        </w:rPr>
+        <w:t xml:space="preserve">On the database's card, press </w:t>
+      </w:r>
+      <w:r>
+        <w:rPr>
+          <w:rFonts w:ascii="Arial" w:cs="Arial" w:eastAsia="Arial" w:hAnsi="Arial"/>
+          <w:b/>
+          <w:bCs/>
+        </w:rPr>
+        <w:t xml:space="preserve">Map a Dataset</w:t>
+      </w:r>
+      <w:r>
+        <w:rPr>
+          <w:rFonts w:ascii="Arial" w:cs="Arial" w:eastAsia="Arial" w:hAnsi="Arial"/>
+        </w:rPr>
+        <w:t xml:space="preserve">. Pick a table or view on the left; views come first.</w:t>
+      </w:r>
+    </w:p>
+    <w:p>
+      <w:pPr>
+        <w:pStyle w:val="ListParagraph"/>
+        <w:keepNext/>
+        <w:keepLines/>
+        <w:numPr>
+          <w:ilvl w:val="0"/>
+          <w:numId w:val="36"/>
+        </w:numPr>
+        <w:spacing w:after="80" w:line="276"/>
+      </w:pPr>
+      <w:r>
+        <w:rPr>
+          <w:rFonts w:ascii="Arial" w:cs="Arial" w:eastAsia="Arial" w:hAnsi="Arial"/>
+        </w:rPr>
+        <w:t xml:space="preserve">Name the dataset and describe it. Choose the </w:t>
+      </w:r>
+      <w:r>
+        <w:rPr>
+          <w:rFonts w:ascii="Arial" w:cs="Arial" w:eastAsia="Arial" w:hAnsi="Arial"/>
+          <w:b/>
+          <w:bCs/>
+        </w:rPr>
+        <w:t xml:space="preserve">Row Key</w:t>
+      </w:r>
+      <w:r>
+        <w:rPr>
+          <w:rFonts w:ascii="Arial" w:cs="Arial" w:eastAsia="Arial" w:hAnsi="Arial"/>
+        </w:rPr>
+        <w:t xml:space="preserve"> (what one row is) and the </w:t>
+      </w:r>
+      <w:r>
+        <w:rPr>
+          <w:rFonts w:ascii="Arial" w:cs="Arial" w:eastAsia="Arial" w:hAnsi="Arial"/>
+          <w:b/>
+          <w:bCs/>
+        </w:rPr>
+        <w:t xml:space="preserve">Time Field</w:t>
+      </w:r>
+      <w:r>
+        <w:rPr>
+          <w:rFonts w:ascii="Arial" w:cs="Arial" w:eastAsia="Arial" w:hAnsi="Arial"/>
+        </w:rPr>
+        <w:t xml:space="preserve"> (the date a period filter applies to).</w:t>
+      </w:r>
+    </w:p>
+    <w:p>
+      <w:pPr>
+        <w:pStyle w:val="ListParagraph"/>
+        <w:keepNext/>
+        <w:keepLines/>
+        <w:numPr>
+          <w:ilvl w:val="0"/>
+          <w:numId w:val="36"/>
+        </w:numPr>
+        <w:spacing w:after="80" w:line="276"/>
+      </w:pPr>
+      <w:r>
+        <w:rPr>
+          <w:rFonts w:ascii="Arial" w:cs="Arial" w:eastAsia="Arial" w:hAnsi="Arial"/>
+        </w:rPr>
+        <w:t xml:space="preserve">For each column: tick it to keep it, give it a label, check its type and role, pick the calculations a measure allows, and set the sensitivity (</w:t>
+      </w:r>
+      <w:r>
+        <w:rPr>
+          <w:rFonts w:ascii="Arial" w:cs="Arial" w:eastAsia="Arial" w:hAnsi="Arial"/>
+          <w:b/>
+          <w:bCs/>
+        </w:rPr>
+        <w:t xml:space="preserve">Personal</w:t>
+      </w:r>
+      <w:r>
+        <w:rPr>
+          <w:rFonts w:ascii="Arial" w:cs="Arial" w:eastAsia="Arial" w:hAnsi="Arial"/>
+        </w:rPr>
+        <w:t xml:space="preserve"> is masked for readers without the right, </w:t>
+      </w:r>
+      <w:r>
+        <w:rPr>
+          <w:rFonts w:ascii="Arial" w:cs="Arial" w:eastAsia="Arial" w:hAnsi="Arial"/>
+          <w:b/>
+          <w:bCs/>
+        </w:rPr>
+        <w:t xml:space="preserve">Confidential</w:t>
+      </w:r>
+      <w:r>
+        <w:rPr>
+          <w:rFonts w:ascii="Arial" w:cs="Arial" w:eastAsia="Arial" w:hAnsi="Arial"/>
+        </w:rPr>
+        <w:t xml:space="preserve"> is hidden from everyone).</w:t>
+      </w:r>
+    </w:p>
+    <w:p>
+      <w:pPr>
+        <w:pStyle w:val="ListParagraph"/>
         <w:keepNext w:val="false"/>
         <w:keepLines/>
         <w:numPr>
           <w:ilvl w:val="0"/>
-          <w:numId w:val="37"/>
-        </w:numPr>
-        <w:spacing w:after="80" w:line="276"/>
-      </w:pPr>
-      <w:r>
-        <w:rPr>
-          <w:rFonts w:ascii="Arial" w:cs="Arial" w:eastAsia="Arial" w:hAnsi="Arial"/>
-        </w:rPr>
-        <w:t xml:space="preserve">On the database's card press </w:t>
-      </w:r>
-      <w:r>
-        <w:rPr>
-          <w:rFonts w:ascii="Arial" w:cs="Arial" w:eastAsia="Arial" w:hAnsi="Arial"/>
-          <w:b/>
-          <w:bCs/>
-        </w:rPr>
-        <w:t xml:space="preserve">Map a Dataset</w:t>
-      </w:r>
-      <w:r>
-        <w:rPr>
-          <w:rFonts w:ascii="Arial" w:cs="Arial" w:eastAsia="Arial" w:hAnsi="Arial"/>
-        </w:rPr>
-        <w:t xml:space="preserve">, or </w:t>
-      </w:r>
-      <w:r>
-        <w:rPr>
-          <w:rFonts w:ascii="Arial" w:cs="Arial" w:eastAsia="Arial" w:hAnsi="Arial"/>
-          <w:b/>
-          <w:bCs/>
-        </w:rPr>
-        <w:t xml:space="preserve">Edit Fields</w:t>
-      </w:r>
-      <w:r>
-        <w:rPr>
-          <w:rFonts w:ascii="Arial" w:cs="Arial" w:eastAsia="Arial" w:hAnsi="Arial"/>
-        </w:rPr>
-        <w:t xml:space="preserve"> beside an existing dataset.</w:t>
-      </w:r>
-    </w:p>
-    <w:p>
-      <w:pPr>
-        <w:pStyle w:val="ListParagraph"/>
-        <w:keepNext w:val="false"/>
-        <w:keepLines/>
-        <w:numPr>
-          <w:ilvl w:val="0"/>
-          <w:numId w:val="37"/>
-        </w:numPr>
-        <w:spacing w:after="80" w:line="276"/>
-      </w:pPr>
-      <w:r>
-        <w:rPr>
-          <w:rFonts w:ascii="Arial" w:cs="Arial" w:eastAsia="Arial" w:hAnsi="Arial"/>
-        </w:rPr>
-        <w:t xml:space="preserve">Mark the numbers you need as </w:t>
-      </w:r>
-      <w:r>
-        <w:rPr>
-          <w:rFonts w:ascii="Arial" w:cs="Arial" w:eastAsia="Arial" w:hAnsi="Arial"/>
-          <w:b/>
-          <w:bCs/>
-        </w:rPr>
-        <w:t xml:space="preserve">Measure</w:t>
-      </w:r>
-      <w:r>
-        <w:rPr>
-          <w:rFonts w:ascii="Arial" w:cs="Arial" w:eastAsia="Arial" w:hAnsi="Arial"/>
-        </w:rPr>
-        <w:t xml:space="preserve">.</w:t>
-      </w:r>
-    </w:p>
-    <w:p>
-      <w:pPr>
-        <w:pStyle w:val="ListParagraph"/>
-        <w:keepNext w:val="false"/>
-        <w:keepLines/>
-        <w:numPr>
-          <w:ilvl w:val="0"/>
-          <w:numId w:val="37"/>
-        </w:numPr>
-        <w:spacing w:after="80" w:line="276"/>
-      </w:pPr>
-      <w:r>
-        <w:rPr>
-          <w:rFonts w:ascii="Arial" w:cs="Arial" w:eastAsia="Arial" w:hAnsi="Arial"/>
-        </w:rPr>
-        <w:t xml:space="preserve">Under </w:t>
-      </w:r>
-      <w:r>
-        <w:rPr>
-          <w:rFonts w:ascii="Arial" w:cs="Arial" w:eastAsia="Arial" w:hAnsi="Arial"/>
-          <w:b/>
-          <w:bCs/>
-        </w:rPr>
-        <w:t xml:space="preserve">Calculated Measures</w:t>
-      </w:r>
-      <w:r>
-        <w:rPr>
-          <w:rFonts w:ascii="Arial" w:cs="Arial" w:eastAsia="Arial" w:hAnsi="Arial"/>
-        </w:rPr>
-        <w:t xml:space="preserve">, press </w:t>
-      </w:r>
-      <w:r>
-        <w:rPr>
-          <w:rFonts w:ascii="Arial" w:cs="Arial" w:eastAsia="Arial" w:hAnsi="Arial"/>
-          <w:b/>
-          <w:bCs/>
-        </w:rPr>
-        <w:t xml:space="preserve">Add a Calculated Measure</w:t>
-      </w:r>
-      <w:r>
-        <w:rPr>
-          <w:rFonts w:ascii="Arial" w:cs="Arial" w:eastAsia="Arial" w:hAnsi="Arial"/>
-        </w:rPr>
-        <w:t xml:space="preserve"> and give it a label, such as Delivered Rate.</w:t>
-      </w:r>
-    </w:p>
-    <w:p>
-      <w:pPr>
-        <w:pStyle w:val="ListParagraph"/>
-        <w:keepNext w:val="false"/>
-        <w:keepLines/>
-        <w:numPr>
-          <w:ilvl w:val="0"/>
-          <w:numId w:val="37"/>
-        </w:numPr>
-        <w:spacing w:after="80" w:line="276"/>
-      </w:pPr>
-      <w:r>
-        <w:rPr>
-          <w:rFonts w:ascii="Arial" w:cs="Arial" w:eastAsia="Arial" w:hAnsi="Arial"/>
-        </w:rPr>
-        <w:t xml:space="preserve">Pick the left side and its calculation, such as Sum of Delivered.</w:t>
-      </w:r>
-    </w:p>
-    <w:p>
-      <w:pPr>
-        <w:pStyle w:val="ListParagraph"/>
-        <w:keepNext w:val="false"/>
-        <w:keepLines/>
-        <w:numPr>
-          <w:ilvl w:val="0"/>
-          <w:numId w:val="37"/>
-        </w:numPr>
-        <w:spacing w:after="80" w:line="276"/>
-      </w:pPr>
-      <w:r>
-        <w:rPr>
-          <w:rFonts w:ascii="Arial" w:cs="Arial" w:eastAsia="Arial" w:hAnsi="Arial"/>
-        </w:rPr>
-        <w:t xml:space="preserve">Pick the operation: </w:t>
-      </w:r>
-      <w:r>
-        <w:rPr>
-          <w:rFonts w:ascii="Arial" w:cs="Arial" w:eastAsia="Arial" w:hAnsi="Arial"/>
-          <w:b/>
-          <w:bCs/>
-        </w:rPr>
-        <w:t xml:space="preserve">Divided by</w:t>
-      </w:r>
-      <w:r>
-        <w:rPr>
-          <w:rFonts w:ascii="Arial" w:cs="Arial" w:eastAsia="Arial" w:hAnsi="Arial"/>
-        </w:rPr>
-        <w:t xml:space="preserve">, </w:t>
-      </w:r>
-      <w:r>
-        <w:rPr>
-          <w:rFonts w:ascii="Arial" w:cs="Arial" w:eastAsia="Arial" w:hAnsi="Arial"/>
-          <w:b/>
-          <w:bCs/>
-        </w:rPr>
-        <w:t xml:space="preserve">Minus</w:t>
-      </w:r>
-      <w:r>
-        <w:rPr>
-          <w:rFonts w:ascii="Arial" w:cs="Arial" w:eastAsia="Arial" w:hAnsi="Arial"/>
-        </w:rPr>
-        <w:t xml:space="preserve">, </w:t>
-      </w:r>
-      <w:r>
-        <w:rPr>
-          <w:rFonts w:ascii="Arial" w:cs="Arial" w:eastAsia="Arial" w:hAnsi="Arial"/>
-          <w:b/>
-          <w:bCs/>
-        </w:rPr>
-        <w:t xml:space="preserve">Plus</w:t>
-      </w:r>
-      <w:r>
-        <w:rPr>
-          <w:rFonts w:ascii="Arial" w:cs="Arial" w:eastAsia="Arial" w:hAnsi="Arial"/>
-        </w:rPr>
-        <w:t xml:space="preserve"> or </w:t>
-      </w:r>
-      <w:r>
-        <w:rPr>
-          <w:rFonts w:ascii="Arial" w:cs="Arial" w:eastAsia="Arial" w:hAnsi="Arial"/>
-          <w:b/>
-          <w:bCs/>
-        </w:rPr>
-        <w:t xml:space="preserve">Times</w:t>
-      </w:r>
-      <w:r>
-        <w:rPr>
-          <w:rFonts w:ascii="Arial" w:cs="Arial" w:eastAsia="Arial" w:hAnsi="Arial"/>
-        </w:rPr>
-        <w:t xml:space="preserve">.</w:t>
-      </w:r>
-    </w:p>
-    <w:p>
-      <w:pPr>
-        <w:pStyle w:val="ListParagraph"/>
-        <w:keepNext w:val="false"/>
-        <w:keepLines/>
-        <w:numPr>
-          <w:ilvl w:val="0"/>
-          <w:numId w:val="37"/>
-        </w:numPr>
-        <w:spacing w:after="80" w:line="276"/>
-      </w:pPr>
-      <w:r>
-        <w:rPr>
-          <w:rFonts w:ascii="Arial" w:cs="Arial" w:eastAsia="Arial" w:hAnsi="Arial"/>
-        </w:rPr>
-        <w:t xml:space="preserve">Pick the right side: another measure, or </w:t>
-      </w:r>
-      <w:r>
-        <w:rPr>
-          <w:rFonts w:ascii="Arial" w:cs="Arial" w:eastAsia="Arial" w:hAnsi="Arial"/>
-          <w:b/>
-          <w:bCs/>
-        </w:rPr>
-        <w:t xml:space="preserve">A number…</w:t>
-      </w:r>
-      <w:r>
-        <w:rPr>
-          <w:rFonts w:ascii="Arial" w:cs="Arial" w:eastAsia="Arial" w:hAnsi="Arial"/>
-        </w:rPr>
-        <w:t xml:space="preserve"> to type a value.</w:t>
-      </w:r>
-    </w:p>
-    <w:p>
-      <w:pPr>
-        <w:pStyle w:val="ListParagraph"/>
-        <w:keepNext w:val="false"/>
-        <w:keepLines/>
-        <w:numPr>
-          <w:ilvl w:val="0"/>
-          <w:numId w:val="37"/>
-        </w:numPr>
-        <w:spacing w:after="80" w:line="276"/>
-      </w:pPr>
-      <w:r>
-        <w:rPr>
-          <w:rFonts w:ascii="Arial" w:cs="Arial" w:eastAsia="Arial" w:hAnsi="Arial"/>
-        </w:rPr>
-        <w:t xml:space="preserve">Set the </w:t>
-      </w:r>
-      <w:r>
-        <w:rPr>
-          <w:rFonts w:ascii="Arial" w:cs="Arial" w:eastAsia="Arial" w:hAnsi="Arial"/>
-          <w:b/>
-          <w:bCs/>
-        </w:rPr>
-        <w:t xml:space="preserve">Scale</w:t>
-      </w:r>
-      <w:r>
-        <w:rPr>
-          <w:rFonts w:ascii="Arial" w:cs="Arial" w:eastAsia="Arial" w:hAnsi="Arial"/>
-        </w:rPr>
-        <w:t xml:space="preserve"> (100 for a percentage) and the </w:t>
-      </w:r>
-      <w:r>
-        <w:rPr>
-          <w:rFonts w:ascii="Arial" w:cs="Arial" w:eastAsia="Arial" w:hAnsi="Arial"/>
-          <w:b/>
-          <w:bCs/>
-        </w:rPr>
-        <w:t xml:space="preserve">Format</w:t>
-      </w:r>
-      <w:r>
-        <w:rPr>
-          <w:rFonts w:ascii="Arial" w:cs="Arial" w:eastAsia="Arial" w:hAnsi="Arial"/>
-        </w:rPr>
-        <w:t xml:space="preserve">, and mark it Personal if it uses personal data. The formula is spelled out under the label as you build it.</w:t>
-      </w:r>
-    </w:p>
-    <w:p>
-      <w:pPr>
-        <w:pStyle w:val="ListParagraph"/>
-        <w:keepNext w:val="false"/>
-        <w:keepLines/>
-        <w:numPr>
-          <w:ilvl w:val="0"/>
-          <w:numId w:val="37"/>
+          <w:numId w:val="36"/>
         </w:numPr>
         <w:spacing w:after="160" w:line="276"/>
       </w:pPr>
@@ -17429,7 +17073,7 @@
         <w:rPr>
           <w:rFonts w:ascii="Arial" w:cs="Arial" w:eastAsia="Arial" w:hAnsi="Arial"/>
         </w:rPr>
-        <w:t xml:space="preserve">Press </w:t>
+        <w:t xml:space="preserve">Watch the preview under the fields update with your labels, then press </w:t>
       </w:r>
       <w:r>
         <w:rPr>
@@ -17443,29 +17087,15 @@
         <w:rPr>
           <w:rFonts w:ascii="Arial" w:cs="Arial" w:eastAsia="Arial" w:hAnsi="Arial"/>
         </w:rPr>
-        <w:t xml:space="preserve">, or </w:t>
-      </w:r>
-      <w:r>
-        <w:rPr>
-          <w:rFonts w:ascii="Arial" w:cs="Arial" w:eastAsia="Arial" w:hAnsi="Arial"/>
-          <w:b/>
-          <w:bCs/>
-        </w:rPr>
-        <w:t xml:space="preserve">Save Fields</w:t>
-      </w:r>
-      <w:r>
-        <w:rPr>
-          <w:rFonts w:ascii="Arial" w:cs="Arial" w:eastAsia="Arial" w:hAnsi="Arial"/>
-        </w:rPr>
-        <w:t xml:space="preserve"> for a dataset made from a query. Report authors find it among the measures with the calculation </w:t>
-      </w:r>
-      <w:r>
-        <w:rPr>
-          <w:rFonts w:ascii="Arial" w:cs="Arial" w:eastAsia="Arial" w:hAnsi="Arial"/>
-          <w:b/>
-          <w:bCs/>
-        </w:rPr>
-        <w:t xml:space="preserve">Calculated</w:t>
+        <w:t xml:space="preserve">. It appears in New Report under </w:t>
+      </w:r>
+      <w:r>
+        <w:rPr>
+          <w:rFonts w:ascii="Arial" w:cs="Arial" w:eastAsia="Arial" w:hAnsi="Arial"/>
+          <w:b/>
+          <w:bCs/>
+        </w:rPr>
+        <w:t xml:space="preserve">Your Databases</w:t>
       </w:r>
       <w:r>
         <w:rPr>
@@ -17483,7 +17113,175 @@
         <w:rPr>
           <w:rFonts w:ascii="Arial" w:cs="Arial" w:eastAsia="Arial" w:hAnsi="Arial"/>
         </w:rPr>
-        <w:t xml:space="preserve">Build a report from a query</w:t>
+        <w:t xml:space="preserve">Join tables in a dataset</w:t>
+      </w:r>
+    </w:p>
+    <w:p>
+      <w:pPr>
+        <w:pStyle w:val="ListParagraph"/>
+        <w:keepNext/>
+        <w:keepLines/>
+        <w:numPr>
+          <w:ilvl w:val="0"/>
+          <w:numId w:val="37"/>
+        </w:numPr>
+        <w:spacing w:after="80" w:line="276"/>
+      </w:pPr>
+      <w:r>
+        <w:rPr>
+          <w:rFonts w:ascii="Arial" w:cs="Arial" w:eastAsia="Arial" w:hAnsi="Arial"/>
+        </w:rPr>
+        <w:t xml:space="preserve">On the mapping page, press </w:t>
+      </w:r>
+      <w:r>
+        <w:rPr>
+          <w:rFonts w:ascii="Arial" w:cs="Arial" w:eastAsia="Arial" w:hAnsi="Arial"/>
+          <w:b/>
+          <w:bCs/>
+        </w:rPr>
+        <w:t xml:space="preserve">Add a Join</w:t>
+      </w:r>
+      <w:r>
+        <w:rPr>
+          <w:rFonts w:ascii="Arial" w:cs="Arial" w:eastAsia="Arial" w:hAnsi="Arial"/>
+        </w:rPr>
+        <w:t xml:space="preserve">, or </w:t>
+      </w:r>
+      <w:r>
+        <w:rPr>
+          <w:rFonts w:ascii="Arial" w:cs="Arial" w:eastAsia="Arial" w:hAnsi="Arial"/>
+          <w:b/>
+          <w:bCs/>
+        </w:rPr>
+        <w:t xml:space="preserve">Join to this</w:t>
+      </w:r>
+      <w:r>
+        <w:rPr>
+          <w:rFonts w:ascii="Arial" w:cs="Arial" w:eastAsia="Arial" w:hAnsi="Arial"/>
+        </w:rPr>
+        <w:t xml:space="preserve"> on a table's card in the diagram.</w:t>
+      </w:r>
+    </w:p>
+    <w:p>
+      <w:pPr>
+        <w:pStyle w:val="ListParagraph"/>
+        <w:keepNext/>
+        <w:keepLines/>
+        <w:numPr>
+          <w:ilvl w:val="0"/>
+          <w:numId w:val="37"/>
+        </w:numPr>
+        <w:spacing w:after="80" w:line="276"/>
+      </w:pPr>
+      <w:r>
+        <w:rPr>
+          <w:rFonts w:ascii="Arial" w:cs="Arial" w:eastAsia="Arial" w:hAnsi="Arial"/>
+        </w:rPr>
+        <w:t xml:space="preserve">Choose what to join to (the base, or a table already joined), the table, and whether to keep every row (</w:t>
+      </w:r>
+      <w:r>
+        <w:rPr>
+          <w:rFonts w:ascii="Arial" w:cs="Arial" w:eastAsia="Arial" w:hAnsi="Arial"/>
+          <w:b/>
+          <w:bCs/>
+        </w:rPr>
+        <w:t xml:space="preserve">Left</w:t>
+      </w:r>
+      <w:r>
+        <w:rPr>
+          <w:rFonts w:ascii="Arial" w:cs="Arial" w:eastAsia="Arial" w:hAnsi="Arial"/>
+        </w:rPr>
+        <w:t xml:space="preserve">) or only the rows that match (</w:t>
+      </w:r>
+      <w:r>
+        <w:rPr>
+          <w:rFonts w:ascii="Arial" w:cs="Arial" w:eastAsia="Arial" w:hAnsi="Arial"/>
+          <w:b/>
+          <w:bCs/>
+        </w:rPr>
+        <w:t xml:space="preserve">Inner</w:t>
+      </w:r>
+      <w:r>
+        <w:rPr>
+          <w:rFonts w:ascii="Arial" w:cs="Arial" w:eastAsia="Arial" w:hAnsi="Arial"/>
+        </w:rPr>
+        <w:t xml:space="preserve">).</w:t>
+      </w:r>
+    </w:p>
+    <w:p>
+      <w:pPr>
+        <w:pStyle w:val="ListParagraph"/>
+        <w:keepNext/>
+        <w:keepLines/>
+        <w:numPr>
+          <w:ilvl w:val="0"/>
+          <w:numId w:val="37"/>
+        </w:numPr>
+        <w:spacing w:after="80" w:line="276"/>
+      </w:pPr>
+      <w:r>
+        <w:rPr>
+          <w:rFonts w:ascii="Arial" w:cs="Arial" w:eastAsia="Arial" w:hAnsi="Arial"/>
+        </w:rPr>
+        <w:t xml:space="preserve">Say which columns are equal; the first pair is suggested from the names. Press </w:t>
+      </w:r>
+      <w:r>
+        <w:rPr>
+          <w:rFonts w:ascii="Arial" w:cs="Arial" w:eastAsia="Arial" w:hAnsi="Arial"/>
+          <w:b/>
+          <w:bCs/>
+        </w:rPr>
+        <w:t xml:space="preserve">Check the Join</w:t>
+      </w:r>
+      <w:r>
+        <w:rPr>
+          <w:rFonts w:ascii="Arial" w:cs="Arial" w:eastAsia="Arial" w:hAnsi="Arial"/>
+        </w:rPr>
+        <w:t xml:space="preserve"> to see how many rows match and whether the join multiplies rows, then </w:t>
+      </w:r>
+      <w:r>
+        <w:rPr>
+          <w:rFonts w:ascii="Arial" w:cs="Arial" w:eastAsia="Arial" w:hAnsi="Arial"/>
+          <w:b/>
+          <w:bCs/>
+        </w:rPr>
+        <w:t xml:space="preserve">Add</w:t>
+      </w:r>
+      <w:r>
+        <w:rPr>
+          <w:rFonts w:ascii="Arial" w:cs="Arial" w:eastAsia="Arial" w:hAnsi="Arial"/>
+        </w:rPr>
+        <w:t xml:space="preserve">.</w:t>
+      </w:r>
+    </w:p>
+    <w:p>
+      <w:pPr>
+        <w:pStyle w:val="ListParagraph"/>
+        <w:keepNext w:val="false"/>
+        <w:keepLines/>
+        <w:numPr>
+          <w:ilvl w:val="0"/>
+          <w:numId w:val="37"/>
+        </w:numPr>
+        <w:spacing w:after="160" w:line="276"/>
+      </w:pPr>
+      <w:r>
+        <w:rPr>
+          <w:rFonts w:ascii="Arial" w:cs="Arial" w:eastAsia="Arial" w:hAnsi="Arial"/>
+        </w:rPr>
+        <w:t xml:space="preserve">The joined table appears as a card with the key drawn to it; its columns are fields labelled with the table's name. Up to five joins; removing one removes the joins chained to it.</w:t>
+      </w:r>
+    </w:p>
+    <w:p>
+      <w:pPr>
+        <w:pStyle w:val="Heading2"/>
+        <w:keepNext/>
+      </w:pPr>
+      <w:r>
+        <w:rPr>
+          <w:rFonts w:ascii="Arial" w:cs="Arial" w:eastAsia="Arial" w:hAnsi="Arial"/>
+        </w:rPr>
+        <w:t xml:space="preserve">Add a calculated measure</w:t>
       </w:r>
     </w:p>
     <w:p>
@@ -17509,6 +17307,398 @@
           <w:sz w:val="18"/>
           <w:szCs w:val="18"/>
         </w:rPr>
+        <w:t xml:space="preserve">Workspace administrator</w:t>
+      </w:r>
+    </w:p>
+    <w:p>
+      <w:pPr>
+        <w:pStyle w:val="ListParagraph"/>
+        <w:keepNext w:val="false"/>
+        <w:keepLines/>
+        <w:numPr>
+          <w:ilvl w:val="0"/>
+          <w:numId w:val="38"/>
+        </w:numPr>
+        <w:spacing w:after="80" w:line="276"/>
+      </w:pPr>
+      <w:r>
+        <w:rPr>
+          <w:rFonts w:ascii="Arial" w:cs="Arial" w:eastAsia="Arial" w:hAnsi="Arial"/>
+        </w:rPr>
+        <w:t xml:space="preserve">On the database's card press </w:t>
+      </w:r>
+      <w:r>
+        <w:rPr>
+          <w:rFonts w:ascii="Arial" w:cs="Arial" w:eastAsia="Arial" w:hAnsi="Arial"/>
+          <w:b/>
+          <w:bCs/>
+        </w:rPr>
+        <w:t xml:space="preserve">Map a Dataset</w:t>
+      </w:r>
+      <w:r>
+        <w:rPr>
+          <w:rFonts w:ascii="Arial" w:cs="Arial" w:eastAsia="Arial" w:hAnsi="Arial"/>
+        </w:rPr>
+        <w:t xml:space="preserve">, or </w:t>
+      </w:r>
+      <w:r>
+        <w:rPr>
+          <w:rFonts w:ascii="Arial" w:cs="Arial" w:eastAsia="Arial" w:hAnsi="Arial"/>
+          <w:b/>
+          <w:bCs/>
+        </w:rPr>
+        <w:t xml:space="preserve">Edit Fields</w:t>
+      </w:r>
+      <w:r>
+        <w:rPr>
+          <w:rFonts w:ascii="Arial" w:cs="Arial" w:eastAsia="Arial" w:hAnsi="Arial"/>
+        </w:rPr>
+        <w:t xml:space="preserve"> beside an existing dataset.</w:t>
+      </w:r>
+    </w:p>
+    <w:p>
+      <w:pPr>
+        <w:pStyle w:val="ListParagraph"/>
+        <w:keepNext w:val="false"/>
+        <w:keepLines/>
+        <w:numPr>
+          <w:ilvl w:val="0"/>
+          <w:numId w:val="38"/>
+        </w:numPr>
+        <w:spacing w:after="80" w:line="276"/>
+      </w:pPr>
+      <w:r>
+        <w:rPr>
+          <w:rFonts w:ascii="Arial" w:cs="Arial" w:eastAsia="Arial" w:hAnsi="Arial"/>
+        </w:rPr>
+        <w:t xml:space="preserve">Mark the numbers you need as </w:t>
+      </w:r>
+      <w:r>
+        <w:rPr>
+          <w:rFonts w:ascii="Arial" w:cs="Arial" w:eastAsia="Arial" w:hAnsi="Arial"/>
+          <w:b/>
+          <w:bCs/>
+        </w:rPr>
+        <w:t xml:space="preserve">Measure</w:t>
+      </w:r>
+      <w:r>
+        <w:rPr>
+          <w:rFonts w:ascii="Arial" w:cs="Arial" w:eastAsia="Arial" w:hAnsi="Arial"/>
+        </w:rPr>
+        <w:t xml:space="preserve">.</w:t>
+      </w:r>
+    </w:p>
+    <w:p>
+      <w:pPr>
+        <w:pStyle w:val="ListParagraph"/>
+        <w:keepNext w:val="false"/>
+        <w:keepLines/>
+        <w:numPr>
+          <w:ilvl w:val="0"/>
+          <w:numId w:val="38"/>
+        </w:numPr>
+        <w:spacing w:after="80" w:line="276"/>
+      </w:pPr>
+      <w:r>
+        <w:rPr>
+          <w:rFonts w:ascii="Arial" w:cs="Arial" w:eastAsia="Arial" w:hAnsi="Arial"/>
+        </w:rPr>
+        <w:t xml:space="preserve">Under </w:t>
+      </w:r>
+      <w:r>
+        <w:rPr>
+          <w:rFonts w:ascii="Arial" w:cs="Arial" w:eastAsia="Arial" w:hAnsi="Arial"/>
+          <w:b/>
+          <w:bCs/>
+        </w:rPr>
+        <w:t xml:space="preserve">Calculated Measures</w:t>
+      </w:r>
+      <w:r>
+        <w:rPr>
+          <w:rFonts w:ascii="Arial" w:cs="Arial" w:eastAsia="Arial" w:hAnsi="Arial"/>
+        </w:rPr>
+        <w:t xml:space="preserve">, press </w:t>
+      </w:r>
+      <w:r>
+        <w:rPr>
+          <w:rFonts w:ascii="Arial" w:cs="Arial" w:eastAsia="Arial" w:hAnsi="Arial"/>
+          <w:b/>
+          <w:bCs/>
+        </w:rPr>
+        <w:t xml:space="preserve">Add a Calculated Measure</w:t>
+      </w:r>
+      <w:r>
+        <w:rPr>
+          <w:rFonts w:ascii="Arial" w:cs="Arial" w:eastAsia="Arial" w:hAnsi="Arial"/>
+        </w:rPr>
+        <w:t xml:space="preserve"> and give it a label, such as Delivered Rate.</w:t>
+      </w:r>
+    </w:p>
+    <w:p>
+      <w:pPr>
+        <w:pStyle w:val="ListParagraph"/>
+        <w:keepNext w:val="false"/>
+        <w:keepLines/>
+        <w:numPr>
+          <w:ilvl w:val="0"/>
+          <w:numId w:val="38"/>
+        </w:numPr>
+        <w:spacing w:after="80" w:line="276"/>
+      </w:pPr>
+      <w:r>
+        <w:rPr>
+          <w:rFonts w:ascii="Arial" w:cs="Arial" w:eastAsia="Arial" w:hAnsi="Arial"/>
+        </w:rPr>
+        <w:t xml:space="preserve">Pick the left side and its calculation, such as Sum of Delivered.</w:t>
+      </w:r>
+    </w:p>
+    <w:p>
+      <w:pPr>
+        <w:pStyle w:val="ListParagraph"/>
+        <w:keepNext w:val="false"/>
+        <w:keepLines/>
+        <w:numPr>
+          <w:ilvl w:val="0"/>
+          <w:numId w:val="38"/>
+        </w:numPr>
+        <w:spacing w:after="80" w:line="276"/>
+      </w:pPr>
+      <w:r>
+        <w:rPr>
+          <w:rFonts w:ascii="Arial" w:cs="Arial" w:eastAsia="Arial" w:hAnsi="Arial"/>
+        </w:rPr>
+        <w:t xml:space="preserve">Pick the operation: </w:t>
+      </w:r>
+      <w:r>
+        <w:rPr>
+          <w:rFonts w:ascii="Arial" w:cs="Arial" w:eastAsia="Arial" w:hAnsi="Arial"/>
+          <w:b/>
+          <w:bCs/>
+        </w:rPr>
+        <w:t xml:space="preserve">Divided by</w:t>
+      </w:r>
+      <w:r>
+        <w:rPr>
+          <w:rFonts w:ascii="Arial" w:cs="Arial" w:eastAsia="Arial" w:hAnsi="Arial"/>
+        </w:rPr>
+        <w:t xml:space="preserve">, </w:t>
+      </w:r>
+      <w:r>
+        <w:rPr>
+          <w:rFonts w:ascii="Arial" w:cs="Arial" w:eastAsia="Arial" w:hAnsi="Arial"/>
+          <w:b/>
+          <w:bCs/>
+        </w:rPr>
+        <w:t xml:space="preserve">Minus</w:t>
+      </w:r>
+      <w:r>
+        <w:rPr>
+          <w:rFonts w:ascii="Arial" w:cs="Arial" w:eastAsia="Arial" w:hAnsi="Arial"/>
+        </w:rPr>
+        <w:t xml:space="preserve">, </w:t>
+      </w:r>
+      <w:r>
+        <w:rPr>
+          <w:rFonts w:ascii="Arial" w:cs="Arial" w:eastAsia="Arial" w:hAnsi="Arial"/>
+          <w:b/>
+          <w:bCs/>
+        </w:rPr>
+        <w:t xml:space="preserve">Plus</w:t>
+      </w:r>
+      <w:r>
+        <w:rPr>
+          <w:rFonts w:ascii="Arial" w:cs="Arial" w:eastAsia="Arial" w:hAnsi="Arial"/>
+        </w:rPr>
+        <w:t xml:space="preserve"> or </w:t>
+      </w:r>
+      <w:r>
+        <w:rPr>
+          <w:rFonts w:ascii="Arial" w:cs="Arial" w:eastAsia="Arial" w:hAnsi="Arial"/>
+          <w:b/>
+          <w:bCs/>
+        </w:rPr>
+        <w:t xml:space="preserve">Times</w:t>
+      </w:r>
+      <w:r>
+        <w:rPr>
+          <w:rFonts w:ascii="Arial" w:cs="Arial" w:eastAsia="Arial" w:hAnsi="Arial"/>
+        </w:rPr>
+        <w:t xml:space="preserve">.</w:t>
+      </w:r>
+    </w:p>
+    <w:p>
+      <w:pPr>
+        <w:pStyle w:val="ListParagraph"/>
+        <w:keepNext w:val="false"/>
+        <w:keepLines/>
+        <w:numPr>
+          <w:ilvl w:val="0"/>
+          <w:numId w:val="38"/>
+        </w:numPr>
+        <w:spacing w:after="80" w:line="276"/>
+      </w:pPr>
+      <w:r>
+        <w:rPr>
+          <w:rFonts w:ascii="Arial" w:cs="Arial" w:eastAsia="Arial" w:hAnsi="Arial"/>
+        </w:rPr>
+        <w:t xml:space="preserve">Pick the right side: another measure, or </w:t>
+      </w:r>
+      <w:r>
+        <w:rPr>
+          <w:rFonts w:ascii="Arial" w:cs="Arial" w:eastAsia="Arial" w:hAnsi="Arial"/>
+          <w:b/>
+          <w:bCs/>
+        </w:rPr>
+        <w:t xml:space="preserve">A number…</w:t>
+      </w:r>
+      <w:r>
+        <w:rPr>
+          <w:rFonts w:ascii="Arial" w:cs="Arial" w:eastAsia="Arial" w:hAnsi="Arial"/>
+        </w:rPr>
+        <w:t xml:space="preserve"> to type a value.</w:t>
+      </w:r>
+    </w:p>
+    <w:p>
+      <w:pPr>
+        <w:pStyle w:val="ListParagraph"/>
+        <w:keepNext w:val="false"/>
+        <w:keepLines/>
+        <w:numPr>
+          <w:ilvl w:val="0"/>
+          <w:numId w:val="38"/>
+        </w:numPr>
+        <w:spacing w:after="80" w:line="276"/>
+      </w:pPr>
+      <w:r>
+        <w:rPr>
+          <w:rFonts w:ascii="Arial" w:cs="Arial" w:eastAsia="Arial" w:hAnsi="Arial"/>
+        </w:rPr>
+        <w:t xml:space="preserve">Set the </w:t>
+      </w:r>
+      <w:r>
+        <w:rPr>
+          <w:rFonts w:ascii="Arial" w:cs="Arial" w:eastAsia="Arial" w:hAnsi="Arial"/>
+          <w:b/>
+          <w:bCs/>
+        </w:rPr>
+        <w:t xml:space="preserve">Scale</w:t>
+      </w:r>
+      <w:r>
+        <w:rPr>
+          <w:rFonts w:ascii="Arial" w:cs="Arial" w:eastAsia="Arial" w:hAnsi="Arial"/>
+        </w:rPr>
+        <w:t xml:space="preserve"> (100 for a percentage) and the </w:t>
+      </w:r>
+      <w:r>
+        <w:rPr>
+          <w:rFonts w:ascii="Arial" w:cs="Arial" w:eastAsia="Arial" w:hAnsi="Arial"/>
+          <w:b/>
+          <w:bCs/>
+        </w:rPr>
+        <w:t xml:space="preserve">Format</w:t>
+      </w:r>
+      <w:r>
+        <w:rPr>
+          <w:rFonts w:ascii="Arial" w:cs="Arial" w:eastAsia="Arial" w:hAnsi="Arial"/>
+        </w:rPr>
+        <w:t xml:space="preserve">, and mark it Personal if it uses personal data. The formula is spelled out under the label as you build it.</w:t>
+      </w:r>
+    </w:p>
+    <w:p>
+      <w:pPr>
+        <w:pStyle w:val="ListParagraph"/>
+        <w:keepNext w:val="false"/>
+        <w:keepLines/>
+        <w:numPr>
+          <w:ilvl w:val="0"/>
+          <w:numId w:val="38"/>
+        </w:numPr>
+        <w:spacing w:after="160" w:line="276"/>
+      </w:pPr>
+      <w:r>
+        <w:rPr>
+          <w:rFonts w:ascii="Arial" w:cs="Arial" w:eastAsia="Arial" w:hAnsi="Arial"/>
+        </w:rPr>
+        <w:t xml:space="preserve">Press </w:t>
+      </w:r>
+      <w:r>
+        <w:rPr>
+          <w:rFonts w:ascii="Arial" w:cs="Arial" w:eastAsia="Arial" w:hAnsi="Arial"/>
+          <w:b/>
+          <w:bCs/>
+        </w:rPr>
+        <w:t xml:space="preserve">Save Dataset</w:t>
+      </w:r>
+      <w:r>
+        <w:rPr>
+          <w:rFonts w:ascii="Arial" w:cs="Arial" w:eastAsia="Arial" w:hAnsi="Arial"/>
+        </w:rPr>
+        <w:t xml:space="preserve">, or </w:t>
+      </w:r>
+      <w:r>
+        <w:rPr>
+          <w:rFonts w:ascii="Arial" w:cs="Arial" w:eastAsia="Arial" w:hAnsi="Arial"/>
+          <w:b/>
+          <w:bCs/>
+        </w:rPr>
+        <w:t xml:space="preserve">Save Fields</w:t>
+      </w:r>
+      <w:r>
+        <w:rPr>
+          <w:rFonts w:ascii="Arial" w:cs="Arial" w:eastAsia="Arial" w:hAnsi="Arial"/>
+        </w:rPr>
+        <w:t xml:space="preserve"> for a dataset made from a query. Report authors find it among the measures with the calculation </w:t>
+      </w:r>
+      <w:r>
+        <w:rPr>
+          <w:rFonts w:ascii="Arial" w:cs="Arial" w:eastAsia="Arial" w:hAnsi="Arial"/>
+          <w:b/>
+          <w:bCs/>
+        </w:rPr>
+        <w:t xml:space="preserve">Calculated</w:t>
+      </w:r>
+      <w:r>
+        <w:rPr>
+          <w:rFonts w:ascii="Arial" w:cs="Arial" w:eastAsia="Arial" w:hAnsi="Arial"/>
+        </w:rPr>
+        <w:t xml:space="preserve">.</w:t>
+      </w:r>
+    </w:p>
+    <w:p>
+      <w:pPr>
+        <w:pStyle w:val="Heading2"/>
+        <w:keepNext/>
+      </w:pPr>
+      <w:r>
+        <w:rPr>
+          <w:rFonts w:ascii="Arial" w:cs="Arial" w:eastAsia="Arial" w:hAnsi="Arial"/>
+        </w:rPr>
+        <w:t xml:space="preserve">Build a report from a query</w:t>
+      </w:r>
+    </w:p>
+    <w:p>
+      <w:pPr>
+        <w:keepNext/>
+        <w:spacing w:after="100"/>
+      </w:pPr>
+      <w:r>
+        <w:rPr>
+          <w:rFonts w:ascii="Arial" w:cs="Arial" w:eastAsia="Arial" w:hAnsi="Arial"/>
+          <w:b/>
+          <w:bCs/>
+          <w:color w:val="555B6E"/>
+          <w:sz w:val="18"/>
+          <w:szCs w:val="18"/>
+        </w:rPr>
+        <w:t xml:space="preserve">Who: </w:t>
+      </w:r>
+      <w:r>
+        <w:rPr>
+          <w:rFonts w:ascii="Arial" w:cs="Arial" w:eastAsia="Arial" w:hAnsi="Arial"/>
+          <w:color w:val="555B6E"/>
+          <w:sz w:val="18"/>
+          <w:szCs w:val="18"/>
+        </w:rPr>
         <w:t xml:space="preserve">Anyone who can build reports</w:t>
       </w:r>
     </w:p>
@@ -17519,7 +17709,7 @@
         <w:keepLines/>
         <w:numPr>
           <w:ilvl w:val="0"/>
-          <w:numId w:val="38"/>
+          <w:numId w:val="39"/>
         </w:numPr>
         <w:spacing w:after="80" w:line="276"/>
       </w:pPr>
@@ -17565,7 +17755,7 @@
         <w:keepLines/>
         <w:numPr>
           <w:ilvl w:val="0"/>
-          <w:numId w:val="38"/>
+          <w:numId w:val="39"/>
         </w:numPr>
         <w:spacing w:after="80" w:line="276"/>
       </w:pPr>
@@ -17619,7 +17809,7 @@
         <w:keepLines/>
         <w:numPr>
           <w:ilvl w:val="0"/>
-          <w:numId w:val="38"/>
+          <w:numId w:val="39"/>
         </w:numPr>
         <w:spacing w:after="80" w:line="276"/>
       </w:pPr>
@@ -17645,7 +17835,7 @@
         <w:keepLines/>
         <w:numPr>
           <w:ilvl w:val="0"/>
-          <w:numId w:val="38"/>
+          <w:numId w:val="39"/>
         </w:numPr>
         <w:spacing w:after="80" w:line="276"/>
       </w:pPr>
@@ -17677,7 +17867,7 @@
         <w:keepLines/>
         <w:numPr>
           <w:ilvl w:val="0"/>
-          <w:numId w:val="38"/>
+          <w:numId w:val="39"/>
         </w:numPr>
         <w:spacing w:after="80" w:line="276"/>
       </w:pPr>
@@ -17709,7 +17899,7 @@
         <w:keepLines/>
         <w:numPr>
           <w:ilvl w:val="0"/>
-          <w:numId w:val="38"/>
+          <w:numId w:val="39"/>
         </w:numPr>
         <w:spacing w:after="160" w:line="276"/>
       </w:pPr>
@@ -17974,7 +18164,7 @@
         <w:keepLines/>
         <w:numPr>
           <w:ilvl w:val="0"/>
-          <w:numId w:val="39"/>
+          <w:numId w:val="40"/>
         </w:numPr>
         <w:spacing w:after="80" w:line="276"/>
       </w:pPr>
@@ -18000,7 +18190,7 @@
         <w:keepLines/>
         <w:numPr>
           <w:ilvl w:val="0"/>
-          <w:numId w:val="39"/>
+          <w:numId w:val="40"/>
         </w:numPr>
         <w:spacing w:after="80" w:line="276"/>
       </w:pPr>
@@ -18054,7 +18244,7 @@
         <w:keepLines/>
         <w:numPr>
           <w:ilvl w:val="0"/>
-          <w:numId w:val="39"/>
+          <w:numId w:val="40"/>
         </w:numPr>
         <w:spacing w:after="80" w:line="276"/>
       </w:pPr>
@@ -18100,7 +18290,7 @@
         <w:keepLines/>
         <w:numPr>
           <w:ilvl w:val="0"/>
-          <w:numId w:val="39"/>
+          <w:numId w:val="40"/>
         </w:numPr>
         <w:spacing w:after="80" w:line="276"/>
       </w:pPr>
@@ -18154,7 +18344,7 @@
         <w:keepLines/>
         <w:numPr>
           <w:ilvl w:val="0"/>
-          <w:numId w:val="39"/>
+          <w:numId w:val="40"/>
         </w:numPr>
         <w:spacing w:after="80" w:line="276"/>
       </w:pPr>
@@ -18236,7 +18426,7 @@
         <w:keepLines/>
         <w:numPr>
           <w:ilvl w:val="0"/>
-          <w:numId w:val="39"/>
+          <w:numId w:val="40"/>
         </w:numPr>
         <w:spacing w:after="80" w:line="276"/>
       </w:pPr>
@@ -18262,7 +18452,7 @@
         <w:keepLines/>
         <w:numPr>
           <w:ilvl w:val="0"/>
-          <w:numId w:val="39"/>
+          <w:numId w:val="40"/>
         </w:numPr>
         <w:spacing w:after="80" w:line="276"/>
       </w:pPr>
@@ -18280,7 +18470,7 @@
         <w:keepLines/>
         <w:numPr>
           <w:ilvl w:val="0"/>
-          <w:numId w:val="39"/>
+          <w:numId w:val="40"/>
         </w:numPr>
         <w:spacing w:after="160" w:line="276"/>
       </w:pPr>
@@ -18465,7 +18655,7 @@
         <w:keepLines/>
         <w:numPr>
           <w:ilvl w:val="0"/>
-          <w:numId w:val="40"/>
+          <w:numId w:val="41"/>
         </w:numPr>
         <w:spacing w:after="80" w:line="276"/>
       </w:pPr>
@@ -18497,7 +18687,7 @@
         <w:keepLines/>
         <w:numPr>
           <w:ilvl w:val="0"/>
-          <w:numId w:val="40"/>
+          <w:numId w:val="41"/>
         </w:numPr>
         <w:spacing w:after="80" w:line="276"/>
       </w:pPr>
@@ -18529,7 +18719,7 @@
         <w:keepLines/>
         <w:numPr>
           <w:ilvl w:val="0"/>
-          <w:numId w:val="40"/>
+          <w:numId w:val="41"/>
         </w:numPr>
         <w:spacing w:after="160" w:line="276"/>
       </w:pPr>
@@ -18573,7 +18763,7 @@
         <w:keepLines/>
         <w:numPr>
           <w:ilvl w:val="0"/>
-          <w:numId w:val="41"/>
+          <w:numId w:val="42"/>
         </w:numPr>
         <w:spacing w:after="80" w:line="276"/>
       </w:pPr>
@@ -18605,7 +18795,7 @@
         <w:keepLines/>
         <w:numPr>
           <w:ilvl w:val="0"/>
-          <w:numId w:val="41"/>
+          <w:numId w:val="42"/>
         </w:numPr>
         <w:spacing w:after="80" w:line="276"/>
       </w:pPr>
@@ -18637,7 +18827,7 @@
         <w:keepLines/>
         <w:numPr>
           <w:ilvl w:val="0"/>
-          <w:numId w:val="41"/>
+          <w:numId w:val="42"/>
         </w:numPr>
         <w:spacing w:after="160" w:line="276"/>
       </w:pPr>
@@ -18675,7 +18865,7 @@
         <w:keepLines/>
         <w:numPr>
           <w:ilvl w:val="0"/>
-          <w:numId w:val="42"/>
+          <w:numId w:val="43"/>
         </w:numPr>
         <w:spacing w:after="80" w:line="276"/>
       </w:pPr>
@@ -18707,7 +18897,7 @@
         <w:keepLines/>
         <w:numPr>
           <w:ilvl w:val="0"/>
-          <w:numId w:val="42"/>
+          <w:numId w:val="43"/>
         </w:numPr>
         <w:spacing w:after="80" w:line="276"/>
       </w:pPr>
@@ -18767,7 +18957,7 @@
         <w:keepLines/>
         <w:numPr>
           <w:ilvl w:val="0"/>
-          <w:numId w:val="42"/>
+          <w:numId w:val="43"/>
         </w:numPr>
         <w:spacing w:after="160" w:line="276"/>
       </w:pPr>
@@ -18805,7 +18995,7 @@
         <w:keepLines/>
         <w:numPr>
           <w:ilvl w:val="0"/>
-          <w:numId w:val="43"/>
+          <w:numId w:val="44"/>
         </w:numPr>
         <w:spacing w:after="80" w:line="276"/>
       </w:pPr>
@@ -18823,7 +19013,7 @@
         <w:keepLines/>
         <w:numPr>
           <w:ilvl w:val="0"/>
-          <w:numId w:val="43"/>
+          <w:numId w:val="44"/>
         </w:numPr>
         <w:spacing w:after="80" w:line="276"/>
       </w:pPr>
@@ -18841,7 +19031,7 @@
         <w:keepLines/>
         <w:numPr>
           <w:ilvl w:val="0"/>
-          <w:numId w:val="43"/>
+          <w:numId w:val="44"/>
         </w:numPr>
         <w:spacing w:after="80" w:line="276"/>
       </w:pPr>
@@ -18859,7 +19049,7 @@
         <w:keepLines/>
         <w:numPr>
           <w:ilvl w:val="0"/>
-          <w:numId w:val="43"/>
+          <w:numId w:val="44"/>
         </w:numPr>
         <w:spacing w:after="160" w:line="276"/>
       </w:pPr>
@@ -18889,7 +19079,7 @@
         <w:keepLines/>
         <w:numPr>
           <w:ilvl w:val="0"/>
-          <w:numId w:val="44"/>
+          <w:numId w:val="45"/>
         </w:numPr>
         <w:spacing w:after="80" w:line="276"/>
       </w:pPr>
@@ -18907,7 +19097,7 @@
         <w:keepLines/>
         <w:numPr>
           <w:ilvl w:val="0"/>
-          <w:numId w:val="44"/>
+          <w:numId w:val="45"/>
         </w:numPr>
         <w:spacing w:after="80" w:line="276"/>
       </w:pPr>
@@ -18967,7 +19157,7 @@
         <w:keepLines/>
         <w:numPr>
           <w:ilvl w:val="0"/>
-          <w:numId w:val="44"/>
+          <w:numId w:val="45"/>
         </w:numPr>
         <w:spacing w:after="80" w:line="276"/>
       </w:pPr>
@@ -18999,7 +19189,7 @@
         <w:keepLines/>
         <w:numPr>
           <w:ilvl w:val="0"/>
-          <w:numId w:val="44"/>
+          <w:numId w:val="45"/>
         </w:numPr>
         <w:spacing w:after="160" w:line="276"/>
       </w:pPr>
@@ -19029,7 +19219,7 @@
         <w:keepLines/>
         <w:numPr>
           <w:ilvl w:val="0"/>
-          <w:numId w:val="45"/>
+          <w:numId w:val="46"/>
         </w:numPr>
         <w:spacing w:after="80" w:line="276"/>
       </w:pPr>
@@ -19061,7 +19251,7 @@
         <w:keepLines/>
         <w:numPr>
           <w:ilvl w:val="0"/>
-          <w:numId w:val="45"/>
+          <w:numId w:val="46"/>
         </w:numPr>
         <w:spacing w:after="80" w:line="276"/>
       </w:pPr>
@@ -19135,7 +19325,7 @@
         <w:keepLines/>
         <w:numPr>
           <w:ilvl w:val="0"/>
-          <w:numId w:val="45"/>
+          <w:numId w:val="46"/>
         </w:numPr>
         <w:spacing w:after="160" w:line="276"/>
       </w:pPr>
@@ -19272,7 +19462,7 @@
         <w:keepLines/>
         <w:numPr>
           <w:ilvl w:val="0"/>
-          <w:numId w:val="46"/>
+          <w:numId w:val="47"/>
         </w:numPr>
         <w:spacing w:after="80" w:line="276"/>
       </w:pPr>
@@ -19304,7 +19494,7 @@
         <w:keepLines/>
         <w:numPr>
           <w:ilvl w:val="0"/>
-          <w:numId w:val="46"/>
+          <w:numId w:val="47"/>
         </w:numPr>
         <w:spacing w:after="80" w:line="276"/>
       </w:pPr>
@@ -19322,7 +19512,7 @@
         <w:keepLines/>
         <w:numPr>
           <w:ilvl w:val="0"/>
-          <w:numId w:val="46"/>
+          <w:numId w:val="47"/>
         </w:numPr>
         <w:spacing w:after="80" w:line="276"/>
       </w:pPr>
@@ -19354,7 +19544,7 @@
         <w:keepLines/>
         <w:numPr>
           <w:ilvl w:val="0"/>
-          <w:numId w:val="46"/>
+          <w:numId w:val="47"/>
         </w:numPr>
         <w:spacing w:after="160" w:line="276"/>
       </w:pPr>
@@ -19505,7 +19695,7 @@
         <w:keepLines/>
         <w:numPr>
           <w:ilvl w:val="0"/>
-          <w:numId w:val="47"/>
+          <w:numId w:val="48"/>
         </w:numPr>
         <w:spacing w:after="80" w:line="276"/>
       </w:pPr>
@@ -19537,7 +19727,7 @@
         <w:keepLines/>
         <w:numPr>
           <w:ilvl w:val="0"/>
-          <w:numId w:val="47"/>
+          <w:numId w:val="48"/>
         </w:numPr>
         <w:spacing w:after="80" w:line="276"/>
       </w:pPr>
@@ -19569,7 +19759,7 @@
         <w:keepLines/>
         <w:numPr>
           <w:ilvl w:val="0"/>
-          <w:numId w:val="47"/>
+          <w:numId w:val="48"/>
         </w:numPr>
         <w:spacing w:after="160" w:line="276"/>
       </w:pPr>
@@ -19706,7 +19896,7 @@
         <w:keepLines/>
         <w:numPr>
           <w:ilvl w:val="0"/>
-          <w:numId w:val="48"/>
+          <w:numId w:val="49"/>
         </w:numPr>
         <w:spacing w:after="80" w:line="276"/>
       </w:pPr>
@@ -19738,7 +19928,7 @@
         <w:keepLines/>
         <w:numPr>
           <w:ilvl w:val="0"/>
-          <w:numId w:val="48"/>
+          <w:numId w:val="49"/>
         </w:numPr>
         <w:spacing w:after="160" w:line="276"/>
       </w:pPr>
@@ -19768,7 +19958,7 @@
         <w:keepLines/>
         <w:numPr>
           <w:ilvl w:val="0"/>
-          <w:numId w:val="49"/>
+          <w:numId w:val="50"/>
         </w:numPr>
         <w:spacing w:after="80" w:line="276"/>
       </w:pPr>
@@ -19800,7 +19990,7 @@
         <w:keepLines/>
         <w:numPr>
           <w:ilvl w:val="0"/>
-          <w:numId w:val="49"/>
+          <w:numId w:val="50"/>
         </w:numPr>
         <w:spacing w:after="80" w:line="276"/>
       </w:pPr>
@@ -19860,7 +20050,7 @@
         <w:keepLines/>
         <w:numPr>
           <w:ilvl w:val="0"/>
-          <w:numId w:val="49"/>
+          <w:numId w:val="50"/>
         </w:numPr>
         <w:spacing w:after="160" w:line="276"/>
       </w:pPr>
@@ -19904,7 +20094,7 @@
         <w:keepLines/>
         <w:numPr>
           <w:ilvl w:val="0"/>
-          <w:numId w:val="50"/>
+          <w:numId w:val="51"/>
         </w:numPr>
         <w:spacing w:after="80" w:line="276"/>
       </w:pPr>
@@ -19922,7 +20112,7 @@
         <w:keepLines/>
         <w:numPr>
           <w:ilvl w:val="0"/>
-          <w:numId w:val="50"/>
+          <w:numId w:val="51"/>
         </w:numPr>
         <w:spacing w:after="80" w:line="276"/>
       </w:pPr>
@@ -19982,7 +20172,7 @@
         <w:keepLines/>
         <w:numPr>
           <w:ilvl w:val="0"/>
-          <w:numId w:val="50"/>
+          <w:numId w:val="51"/>
         </w:numPr>
         <w:spacing w:after="160" w:line="276"/>
       </w:pPr>
@@ -20026,7 +20216,7 @@
         <w:keepLines/>
         <w:numPr>
           <w:ilvl w:val="0"/>
-          <w:numId w:val="51"/>
+          <w:numId w:val="52"/>
         </w:numPr>
         <w:spacing w:after="80" w:line="276"/>
       </w:pPr>
@@ -20072,7 +20262,7 @@
         <w:keepLines/>
         <w:numPr>
           <w:ilvl w:val="0"/>
-          <w:numId w:val="51"/>
+          <w:numId w:val="52"/>
         </w:numPr>
         <w:spacing w:after="80" w:line="276"/>
       </w:pPr>
@@ -20104,7 +20294,7 @@
         <w:keepLines/>
         <w:numPr>
           <w:ilvl w:val="0"/>
-          <w:numId w:val="51"/>
+          <w:numId w:val="52"/>
         </w:numPr>
         <w:spacing w:after="160" w:line="276"/>
       </w:pPr>
@@ -20314,7 +20504,7 @@
         <w:keepLines/>
         <w:numPr>
           <w:ilvl w:val="0"/>
-          <w:numId w:val="52"/>
+          <w:numId w:val="53"/>
         </w:numPr>
         <w:spacing w:after="80" w:line="276"/>
       </w:pPr>
@@ -20332,7 +20522,7 @@
         <w:keepLines/>
         <w:numPr>
           <w:ilvl w:val="0"/>
-          <w:numId w:val="52"/>
+          <w:numId w:val="53"/>
         </w:numPr>
         <w:spacing w:after="80" w:line="276"/>
       </w:pPr>
@@ -20364,7 +20554,7 @@
         <w:keepLines/>
         <w:numPr>
           <w:ilvl w:val="0"/>
-          <w:numId w:val="52"/>
+          <w:numId w:val="53"/>
         </w:numPr>
         <w:spacing w:after="80" w:line="276"/>
       </w:pPr>
@@ -20438,7 +20628,7 @@
         <w:keepLines/>
         <w:numPr>
           <w:ilvl w:val="0"/>
-          <w:numId w:val="52"/>
+          <w:numId w:val="53"/>
         </w:numPr>
         <w:spacing w:after="160" w:line="276"/>
       </w:pPr>
@@ -20458,7 +20648,7 @@
         <w:rPr>
           <w:rFonts w:ascii="Arial" w:cs="Arial" w:eastAsia="Arial" w:hAnsi="Arial"/>
         </w:rPr>
-        <w:t xml:space="preserve">Use AI in your workspace</w:t>
+        <w:t xml:space="preserve">Add images to a prompt</w:t>
       </w:r>
     </w:p>
     <w:p>
@@ -20484,7 +20674,7 @@
           <w:sz w:val="18"/>
           <w:szCs w:val="18"/>
         </w:rPr>
-        <w:t xml:space="preserve">Workspace administrator</w:t>
+        <w:t xml:space="preserve">Anyone who can build reports</w:t>
       </w:r>
     </w:p>
     <w:p>
@@ -20494,7 +20684,7 @@
         <w:keepLines/>
         <w:numPr>
           <w:ilvl w:val="0"/>
-          <w:numId w:val="53"/>
+          <w:numId w:val="54"/>
         </w:numPr>
         <w:spacing w:after="80" w:line="276"/>
       </w:pPr>
@@ -20502,21 +20692,7 @@
         <w:rPr>
           <w:rFonts w:ascii="Arial" w:cs="Arial" w:eastAsia="Arial" w:hAnsi="Arial"/>
         </w:rPr>
-        <w:t xml:space="preserve">Open Settings → AI Assistant. </w:t>
-      </w:r>
-      <w:r>
-        <w:rPr>
-          <w:rFonts w:ascii="Arial" w:cs="Arial" w:eastAsia="Arial" w:hAnsi="Arial"/>
-          <w:b/>
-          <w:bCs/>
-        </w:rPr>
-        <w:t xml:space="preserve">Use AI in Reports</w:t>
-      </w:r>
-      <w:r>
-        <w:rPr>
-          <w:rFonts w:ascii="Arial" w:cs="Arial" w:eastAsia="Arial" w:hAnsi="Arial"/>
-        </w:rPr>
-        <w:t xml:space="preserve"> is on by default; switch it off to hide every AI feature and keep every prompt inside CEP.</w:t>
+        <w:t xml:space="preserve">In Insights → Reports, write your prompt in the Ask for a Report box. Say what the image is for: "Build this table from the screenshot", "A chart like this sketch, by month".</w:t>
       </w:r>
     </w:p>
     <w:p>
@@ -20526,7 +20702,7 @@
         <w:keepLines/>
         <w:numPr>
           <w:ilvl w:val="0"/>
-          <w:numId w:val="53"/>
+          <w:numId w:val="54"/>
         </w:numPr>
         <w:spacing w:after="80" w:line="276"/>
       </w:pPr>
@@ -20534,49 +20710,21 @@
         <w:rPr>
           <w:rFonts w:ascii="Arial" w:cs="Arial" w:eastAsia="Arial" w:hAnsi="Arial"/>
         </w:rPr>
-        <w:t xml:space="preserve">For each provider, allow or disallow it with its switch, or press </w:t>
-      </w:r>
-      <w:r>
-        <w:rPr>
-          <w:rFonts w:ascii="Arial" w:cs="Arial" w:eastAsia="Arial" w:hAnsi="Arial"/>
-          <w:b/>
-          <w:bCs/>
-        </w:rPr>
-        <w:t xml:space="preserve">Use Your Own Key</w:t>
-      </w:r>
-      <w:r>
-        <w:rPr>
-          <w:rFonts w:ascii="Arial" w:cs="Arial" w:eastAsia="Arial" w:hAnsi="Arial"/>
-        </w:rPr>
-        <w:t xml:space="preserve"> (or </w:t>
-      </w:r>
-      <w:r>
-        <w:rPr>
-          <w:rFonts w:ascii="Arial" w:cs="Arial" w:eastAsia="Arial" w:hAnsi="Arial"/>
-          <w:b/>
-          <w:bCs/>
-        </w:rPr>
-        <w:t xml:space="preserve">Add Your Own Key</w:t>
-      </w:r>
-      <w:r>
-        <w:rPr>
-          <w:rFonts w:ascii="Arial" w:cs="Arial" w:eastAsia="Arial" w:hAnsi="Arial"/>
-        </w:rPr>
-        <w:t xml:space="preserve"> when the platform does not offer it) to enter the workspace's own key and the two models, then </w:t>
-      </w:r>
-      <w:r>
-        <w:rPr>
-          <w:rFonts w:ascii="Arial" w:cs="Arial" w:eastAsia="Arial" w:hAnsi="Arial"/>
-          <w:b/>
-          <w:bCs/>
-        </w:rPr>
-        <w:t xml:space="preserve">Check Connection</w:t>
-      </w:r>
-      <w:r>
-        <w:rPr>
-          <w:rFonts w:ascii="Arial" w:cs="Arial" w:eastAsia="Arial" w:hAnsi="Arial"/>
-        </w:rPr>
-        <w:t xml:space="preserve">. The workspace's key wins over the platform's, and prompts on it are not counted against the plan.</w:t>
+        <w:t xml:space="preserve">Add up to three images, whichever way is handiest: press </w:t>
+      </w:r>
+      <w:r>
+        <w:rPr>
+          <w:rFonts w:ascii="Arial" w:cs="Arial" w:eastAsia="Arial" w:hAnsi="Arial"/>
+          <w:b/>
+          <w:bCs/>
+        </w:rPr>
+        <w:t xml:space="preserve">Add Images</w:t>
+      </w:r>
+      <w:r>
+        <w:rPr>
+          <w:rFonts w:ascii="Arial" w:cs="Arial" w:eastAsia="Arial" w:hAnsi="Arial"/>
+        </w:rPr>
+        <w:t xml:space="preserve"> under the box and choose the files; or drag them from your computer and drop them anywhere on the Ask for a Report panel (its border lights up while you drag); or copy an image, such as a screenshot, and paste it into the box with Ctrl+V.</w:t>
       </w:r>
     </w:p>
     <w:p>
@@ -20586,23 +20734,15 @@
         <w:keepLines/>
         <w:numPr>
           <w:ilvl w:val="0"/>
-          <w:numId w:val="53"/>
+          <w:numId w:val="54"/>
         </w:numPr>
         <w:spacing w:after="80" w:line="276"/>
       </w:pPr>
       <w:r>
         <w:rPr>
           <w:rFonts w:ascii="Arial" w:cs="Arial" w:eastAsia="Arial" w:hAnsi="Arial"/>
-          <w:b/>
-          <w:bCs/>
-        </w:rPr>
-        <w:t xml:space="preserve">Explain This Report</w:t>
-      </w:r>
-      <w:r>
-        <w:rPr>
-          <w:rFonts w:ascii="Arial" w:cs="Arial" w:eastAsia="Arial" w:hAnsi="Arial"/>
-        </w:rPr>
-        <w:t xml:space="preserve"> decides whether a report's totals may be sent to the model; personal-data fields are never sent.</w:t>
+        </w:rPr>
+        <w:t xml:space="preserve">Check the thumbnails under the box. The line beside Add Images counts them ("2 of 3"); remove one with its ✕. Once there are three, Add Images is greyed out.</w:t>
       </w:r>
     </w:p>
     <w:p>
@@ -20612,23 +20752,43 @@
         <w:keepLines/>
         <w:numPr>
           <w:ilvl w:val="0"/>
-          <w:numId w:val="53"/>
+          <w:numId w:val="54"/>
         </w:numPr>
         <w:spacing w:after="160" w:line="276"/>
       </w:pPr>
       <w:r>
         <w:rPr>
           <w:rFonts w:ascii="Arial" w:cs="Arial" w:eastAsia="Arial" w:hAnsi="Arial"/>
-          <w:b/>
-          <w:bCs/>
-        </w:rPr>
-        <w:t xml:space="preserve">AI Prompts This Month</w:t>
-      </w:r>
-      <w:r>
-        <w:rPr>
-          <w:rFonts w:ascii="Arial" w:cs="Arial" w:eastAsia="Arial" w:hAnsi="Arial"/>
-        </w:rPr>
-        <w:t xml:space="preserve"> shows the count against the plan.</w:t>
+        </w:rPr>
+        <w:t xml:space="preserve">Press </w:t>
+      </w:r>
+      <w:r>
+        <w:rPr>
+          <w:rFonts w:ascii="Arial" w:cs="Arial" w:eastAsia="Arial" w:hAnsi="Arial"/>
+          <w:b/>
+          <w:bCs/>
+        </w:rPr>
+        <w:t xml:space="preserve">Generate Report</w:t>
+      </w:r>
+      <w:r>
+        <w:rPr>
+          <w:rFonts w:ascii="Arial" w:cs="Arial" w:eastAsia="Arial" w:hAnsi="Arial"/>
+        </w:rPr>
+        <w:t xml:space="preserve"> (or Ctrl+Enter). The images go to the model with your prompt and the field names. They stay in the box, so </w:t>
+      </w:r>
+      <w:r>
+        <w:rPr>
+          <w:rFonts w:ascii="Arial" w:cs="Arial" w:eastAsia="Arial" w:hAnsi="Arial"/>
+          <w:b/>
+          <w:bCs/>
+        </w:rPr>
+        <w:t xml:space="preserve">Try Again</w:t>
+      </w:r>
+      <w:r>
+        <w:rPr>
+          <w:rFonts w:ascii="Arial" w:cs="Arial" w:eastAsia="Arial" w:hAnsi="Arial"/>
+        </w:rPr>
+        <w:t xml:space="preserve"> sends them again.</w:t>
       </w:r>
     </w:p>
     <w:p>
@@ -20638,16 +20798,8 @@
       <w:r>
         <w:rPr>
           <w:rFonts w:ascii="Arial" w:cs="Arial" w:eastAsia="Arial" w:hAnsi="Arial"/>
-          <w:b/>
-          <w:bCs/>
-        </w:rPr>
-        <w:t xml:space="preserve">Write It for Me</w:t>
-      </w:r>
-      <w:r>
-        <w:rPr>
-          <w:rFonts w:ascii="Arial" w:cs="Arial" w:eastAsia="Arial" w:hAnsi="Arial"/>
-        </w:rPr>
-        <w:t xml:space="preserve"> in the query window is described in Part 6, Build a report from a query.</w:t>
+        </w:rPr>
+        <w:t xml:space="preserve">The images may be PNG, JPEG, GIF or WebP; a large one is scaled down in your browser before it is sent, and each may be up to 3.75 MB after that. Another kind of file is refused with a note under the box. The images are not kept: only your prompt is saved with the draft. Good images to send are a hand sketch of the table or chart you want, or a screenshot of a spreadsheet or of a report from another tool to rebuild here.</w:t>
       </w:r>
     </w:p>
     <w:p>
@@ -20659,17 +20811,43 @@
         <w:rPr>
           <w:rFonts w:ascii="Arial" w:cs="Arial" w:eastAsia="Arial" w:hAnsi="Arial"/>
         </w:rPr>
-        <w:t xml:space="preserve">Explain This Report, with AI</w:t>
-      </w:r>
-    </w:p>
-    <w:p>
-      <w:pPr>
-        <w:pStyle w:val="ListParagraph"/>
+        <w:t xml:space="preserve">Use AI in your workspace</w:t>
+      </w:r>
+    </w:p>
+    <w:p>
+      <w:pPr>
         <w:keepNext/>
-        <w:keepLines/>
-        <w:numPr>
-          <w:ilvl w:val="0"/>
-          <w:numId w:val="54"/>
+        <w:spacing w:after="100"/>
+      </w:pPr>
+      <w:r>
+        <w:rPr>
+          <w:rFonts w:ascii="Arial" w:cs="Arial" w:eastAsia="Arial" w:hAnsi="Arial"/>
+          <w:b/>
+          <w:bCs/>
+          <w:color w:val="555B6E"/>
+          <w:sz w:val="18"/>
+          <w:szCs w:val="18"/>
+        </w:rPr>
+        <w:t xml:space="preserve">Who: </w:t>
+      </w:r>
+      <w:r>
+        <w:rPr>
+          <w:rFonts w:ascii="Arial" w:cs="Arial" w:eastAsia="Arial" w:hAnsi="Arial"/>
+          <w:color w:val="555B6E"/>
+          <w:sz w:val="18"/>
+          <w:szCs w:val="18"/>
+        </w:rPr>
+        <w:t xml:space="preserve">Workspace administrator</w:t>
+      </w:r>
+    </w:p>
+    <w:p>
+      <w:pPr>
+        <w:pStyle w:val="ListParagraph"/>
+        <w:keepNext/>
+        <w:keepLines/>
+        <w:numPr>
+          <w:ilvl w:val="0"/>
+          <w:numId w:val="55"/>
         </w:numPr>
         <w:spacing w:after="80" w:line="276"/>
       </w:pPr>
@@ -20677,22 +20855,94 @@
         <w:rPr>
           <w:rFonts w:ascii="Arial" w:cs="Arial" w:eastAsia="Arial" w:hAnsi="Arial"/>
         </w:rPr>
-        <w:t xml:space="preserve">Open a report and press </w:t>
-      </w:r>
-      <w:r>
-        <w:rPr>
-          <w:rFonts w:ascii="Arial" w:cs="Arial" w:eastAsia="Arial" w:hAnsi="Arial"/>
-          <w:b/>
-          <w:bCs/>
-        </w:rPr>
-        <w:t xml:space="preserve">Explain</w:t>
-      </w:r>
-      <w:r>
-        <w:rPr>
-          <w:rFonts w:ascii="Arial" w:cs="Arial" w:eastAsia="Arial" w:hAnsi="Arial"/>
-        </w:rPr>
-        <w:t xml:space="preserve">. The button is there when the platform allows it and the workspace's </w:t>
-      </w:r>
+        <w:t xml:space="preserve">Open Settings → AI Assistant. </w:t>
+      </w:r>
+      <w:r>
+        <w:rPr>
+          <w:rFonts w:ascii="Arial" w:cs="Arial" w:eastAsia="Arial" w:hAnsi="Arial"/>
+          <w:b/>
+          <w:bCs/>
+        </w:rPr>
+        <w:t xml:space="preserve">Use AI in Reports</w:t>
+      </w:r>
+      <w:r>
+        <w:rPr>
+          <w:rFonts w:ascii="Arial" w:cs="Arial" w:eastAsia="Arial" w:hAnsi="Arial"/>
+        </w:rPr>
+        <w:t xml:space="preserve"> is on by default; switch it off to hide every AI feature and keep every prompt inside CEP.</w:t>
+      </w:r>
+    </w:p>
+    <w:p>
+      <w:pPr>
+        <w:pStyle w:val="ListParagraph"/>
+        <w:keepNext/>
+        <w:keepLines/>
+        <w:numPr>
+          <w:ilvl w:val="0"/>
+          <w:numId w:val="55"/>
+        </w:numPr>
+        <w:spacing w:after="80" w:line="276"/>
+      </w:pPr>
+      <w:r>
+        <w:rPr>
+          <w:rFonts w:ascii="Arial" w:cs="Arial" w:eastAsia="Arial" w:hAnsi="Arial"/>
+        </w:rPr>
+        <w:t xml:space="preserve">For each provider, allow or disallow it with its switch, or press </w:t>
+      </w:r>
+      <w:r>
+        <w:rPr>
+          <w:rFonts w:ascii="Arial" w:cs="Arial" w:eastAsia="Arial" w:hAnsi="Arial"/>
+          <w:b/>
+          <w:bCs/>
+        </w:rPr>
+        <w:t xml:space="preserve">Use Your Own Key</w:t>
+      </w:r>
+      <w:r>
+        <w:rPr>
+          <w:rFonts w:ascii="Arial" w:cs="Arial" w:eastAsia="Arial" w:hAnsi="Arial"/>
+        </w:rPr>
+        <w:t xml:space="preserve"> (or </w:t>
+      </w:r>
+      <w:r>
+        <w:rPr>
+          <w:rFonts w:ascii="Arial" w:cs="Arial" w:eastAsia="Arial" w:hAnsi="Arial"/>
+          <w:b/>
+          <w:bCs/>
+        </w:rPr>
+        <w:t xml:space="preserve">Add Your Own Key</w:t>
+      </w:r>
+      <w:r>
+        <w:rPr>
+          <w:rFonts w:ascii="Arial" w:cs="Arial" w:eastAsia="Arial" w:hAnsi="Arial"/>
+        </w:rPr>
+        <w:t xml:space="preserve"> when the platform does not offer it) to enter the workspace's own key and the two models, then </w:t>
+      </w:r>
+      <w:r>
+        <w:rPr>
+          <w:rFonts w:ascii="Arial" w:cs="Arial" w:eastAsia="Arial" w:hAnsi="Arial"/>
+          <w:b/>
+          <w:bCs/>
+        </w:rPr>
+        <w:t xml:space="preserve">Check Connection</w:t>
+      </w:r>
+      <w:r>
+        <w:rPr>
+          <w:rFonts w:ascii="Arial" w:cs="Arial" w:eastAsia="Arial" w:hAnsi="Arial"/>
+        </w:rPr>
+        <w:t xml:space="preserve">. The workspace's key wins over the platform's, and prompts on it are not counted against the plan.</w:t>
+      </w:r>
+    </w:p>
+    <w:p>
+      <w:pPr>
+        <w:pStyle w:val="ListParagraph"/>
+        <w:keepNext/>
+        <w:keepLines/>
+        <w:numPr>
+          <w:ilvl w:val="0"/>
+          <w:numId w:val="55"/>
+        </w:numPr>
+        <w:spacing w:after="80" w:line="276"/>
+      </w:pPr>
       <w:r>
         <w:rPr>
           <w:rFonts w:ascii="Arial" w:cs="Arial" w:eastAsia="Arial" w:hAnsi="Arial"/>
@@ -20705,25 +20955,7 @@
         <w:rPr>
           <w:rFonts w:ascii="Arial" w:cs="Arial" w:eastAsia="Arial" w:hAnsi="Arial"/>
         </w:rPr>
-        <w:t xml:space="preserve"> switch is on (Settings → AI Assistant).</w:t>
-      </w:r>
-    </w:p>
-    <w:p>
-      <w:pPr>
-        <w:pStyle w:val="ListParagraph"/>
-        <w:keepNext/>
-        <w:keepLines/>
-        <w:numPr>
-          <w:ilvl w:val="0"/>
-          <w:numId w:val="54"/>
-        </w:numPr>
-        <w:spacing w:after="80" w:line="276"/>
-      </w:pPr>
-      <w:r>
-        <w:rPr>
-          <w:rFonts w:ascii="Arial" w:cs="Arial" w:eastAsia="Arial" w:hAnsi="Arial"/>
-        </w:rPr>
-        <w:t xml:space="preserve">A panel above the rows says what they show in a few sentences, with the main points and what the rows cannot tell. The model reads the report's name, its columns and up to 100 of the rows you see; masked personal data is left out.</w:t>
+        <w:t xml:space="preserve"> decides whether a report's totals may be sent to the model; personal-data fields are never sent.</w:t>
       </w:r>
     </w:p>
     <w:p>
@@ -20733,15 +20965,42 @@
         <w:keepLines/>
         <w:numPr>
           <w:ilvl w:val="0"/>
-          <w:numId w:val="54"/>
+          <w:numId w:val="55"/>
         </w:numPr>
         <w:spacing w:after="160" w:line="276"/>
       </w:pPr>
       <w:r>
         <w:rPr>
           <w:rFonts w:ascii="Arial" w:cs="Arial" w:eastAsia="Arial" w:hAnsi="Arial"/>
-        </w:rPr>
-        <w:t xml:space="preserve">Each explanation counts as one prompt. Check the figures before you act on them.</w:t>
+          <w:b/>
+          <w:bCs/>
+        </w:rPr>
+        <w:t xml:space="preserve">AI Prompts This Month</w:t>
+      </w:r>
+      <w:r>
+        <w:rPr>
+          <w:rFonts w:ascii="Arial" w:cs="Arial" w:eastAsia="Arial" w:hAnsi="Arial"/>
+        </w:rPr>
+        <w:t xml:space="preserve"> shows the count against the plan.</w:t>
+      </w:r>
+    </w:p>
+    <w:p>
+      <w:pPr>
+        <w:spacing w:after="120" w:line="276"/>
+      </w:pPr>
+      <w:r>
+        <w:rPr>
+          <w:rFonts w:ascii="Arial" w:cs="Arial" w:eastAsia="Arial" w:hAnsi="Arial"/>
+          <w:b/>
+          <w:bCs/>
+        </w:rPr>
+        <w:t xml:space="preserve">Write It for Me</w:t>
+      </w:r>
+      <w:r>
+        <w:rPr>
+          <w:rFonts w:ascii="Arial" w:cs="Arial" w:eastAsia="Arial" w:hAnsi="Arial"/>
+        </w:rPr>
+        <w:t xml:space="preserve"> in the query window is described in Part 6, Build a report from a query.</w:t>
       </w:r>
     </w:p>
     <w:p>
@@ -20753,6 +21012,100 @@
         <w:rPr>
           <w:rFonts w:ascii="Arial" w:cs="Arial" w:eastAsia="Arial" w:hAnsi="Arial"/>
         </w:rPr>
+        <w:t xml:space="preserve">Explain This Report, with AI</w:t>
+      </w:r>
+    </w:p>
+    <w:p>
+      <w:pPr>
+        <w:pStyle w:val="ListParagraph"/>
+        <w:keepNext/>
+        <w:keepLines/>
+        <w:numPr>
+          <w:ilvl w:val="0"/>
+          <w:numId w:val="56"/>
+        </w:numPr>
+        <w:spacing w:after="80" w:line="276"/>
+      </w:pPr>
+      <w:r>
+        <w:rPr>
+          <w:rFonts w:ascii="Arial" w:cs="Arial" w:eastAsia="Arial" w:hAnsi="Arial"/>
+        </w:rPr>
+        <w:t xml:space="preserve">Open a report and press </w:t>
+      </w:r>
+      <w:r>
+        <w:rPr>
+          <w:rFonts w:ascii="Arial" w:cs="Arial" w:eastAsia="Arial" w:hAnsi="Arial"/>
+          <w:b/>
+          <w:bCs/>
+        </w:rPr>
+        <w:t xml:space="preserve">Explain</w:t>
+      </w:r>
+      <w:r>
+        <w:rPr>
+          <w:rFonts w:ascii="Arial" w:cs="Arial" w:eastAsia="Arial" w:hAnsi="Arial"/>
+        </w:rPr>
+        <w:t xml:space="preserve">. The button is there when the platform allows it and the workspace's </w:t>
+      </w:r>
+      <w:r>
+        <w:rPr>
+          <w:rFonts w:ascii="Arial" w:cs="Arial" w:eastAsia="Arial" w:hAnsi="Arial"/>
+          <w:b/>
+          <w:bCs/>
+        </w:rPr>
+        <w:t xml:space="preserve">Explain This Report</w:t>
+      </w:r>
+      <w:r>
+        <w:rPr>
+          <w:rFonts w:ascii="Arial" w:cs="Arial" w:eastAsia="Arial" w:hAnsi="Arial"/>
+        </w:rPr>
+        <w:t xml:space="preserve"> switch is on (Settings → AI Assistant).</w:t>
+      </w:r>
+    </w:p>
+    <w:p>
+      <w:pPr>
+        <w:pStyle w:val="ListParagraph"/>
+        <w:keepNext/>
+        <w:keepLines/>
+        <w:numPr>
+          <w:ilvl w:val="0"/>
+          <w:numId w:val="56"/>
+        </w:numPr>
+        <w:spacing w:after="80" w:line="276"/>
+      </w:pPr>
+      <w:r>
+        <w:rPr>
+          <w:rFonts w:ascii="Arial" w:cs="Arial" w:eastAsia="Arial" w:hAnsi="Arial"/>
+        </w:rPr>
+        <w:t xml:space="preserve">A panel above the rows says what they show in a few sentences, with the main points and what the rows cannot tell. The model reads the report's name, its columns and up to 100 of the rows you see; masked personal data is left out.</w:t>
+      </w:r>
+    </w:p>
+    <w:p>
+      <w:pPr>
+        <w:pStyle w:val="ListParagraph"/>
+        <w:keepNext w:val="false"/>
+        <w:keepLines/>
+        <w:numPr>
+          <w:ilvl w:val="0"/>
+          <w:numId w:val="56"/>
+        </w:numPr>
+        <w:spacing w:after="160" w:line="276"/>
+      </w:pPr>
+      <w:r>
+        <w:rPr>
+          <w:rFonts w:ascii="Arial" w:cs="Arial" w:eastAsia="Arial" w:hAnsi="Arial"/>
+        </w:rPr>
+        <w:t xml:space="preserve">Each explanation counts as one prompt. Check the figures before you act on them.</w:t>
+      </w:r>
+    </w:p>
+    <w:p>
+      <w:pPr>
+        <w:pStyle w:val="Heading2"/>
+        <w:keepNext/>
+      </w:pPr>
+      <w:r>
+        <w:rPr>
+          <w:rFonts w:ascii="Arial" w:cs="Arial" w:eastAsia="Arial" w:hAnsi="Arial"/>
+        </w:rPr>
         <w:t xml:space="preserve">Change a report with a prompt, with AI</w:t>
       </w:r>
     </w:p>
@@ -20763,7 +21116,7 @@
         <w:keepLines/>
         <w:numPr>
           <w:ilvl w:val="0"/>
-          <w:numId w:val="55"/>
+          <w:numId w:val="57"/>
         </w:numPr>
         <w:spacing w:after="80" w:line="276"/>
       </w:pPr>
@@ -20795,7 +21148,7 @@
         <w:keepLines/>
         <w:numPr>
           <w:ilvl w:val="0"/>
-          <w:numId w:val="55"/>
+          <w:numId w:val="57"/>
         </w:numPr>
         <w:spacing w:after="80" w:line="276"/>
       </w:pPr>
@@ -20841,7 +21194,7 @@
         <w:keepLines/>
         <w:numPr>
           <w:ilvl w:val="0"/>
-          <w:numId w:val="55"/>
+          <w:numId w:val="57"/>
         </w:numPr>
         <w:spacing w:after="160" w:line="276"/>
       </w:pPr>
@@ -20918,7 +21271,7 @@
         <w:keepLines/>
         <w:numPr>
           <w:ilvl w:val="0"/>
-          <w:numId w:val="56"/>
+          <w:numId w:val="58"/>
         </w:numPr>
         <w:spacing w:after="80" w:line="276"/>
       </w:pPr>
@@ -20950,7 +21303,7 @@
         <w:keepLines/>
         <w:numPr>
           <w:ilvl w:val="0"/>
-          <w:numId w:val="56"/>
+          <w:numId w:val="58"/>
         </w:numPr>
         <w:spacing w:after="80" w:line="276"/>
       </w:pPr>
@@ -20996,7 +21349,7 @@
         <w:keepLines/>
         <w:numPr>
           <w:ilvl w:val="0"/>
-          <w:numId w:val="56"/>
+          <w:numId w:val="58"/>
         </w:numPr>
         <w:spacing w:after="80" w:line="276"/>
       </w:pPr>
@@ -21042,7 +21395,7 @@
         <w:keepLines/>
         <w:numPr>
           <w:ilvl w:val="0"/>
-          <w:numId w:val="56"/>
+          <w:numId w:val="58"/>
         </w:numPr>
         <w:spacing w:after="160" w:line="276"/>
       </w:pPr>
@@ -21086,7 +21439,7 @@
         <w:keepLines/>
         <w:numPr>
           <w:ilvl w:val="0"/>
-          <w:numId w:val="57"/>
+          <w:numId w:val="59"/>
         </w:numPr>
         <w:spacing w:after="80" w:line="276"/>
       </w:pPr>
@@ -21118,7 +21471,7 @@
         <w:keepLines/>
         <w:numPr>
           <w:ilvl w:val="0"/>
-          <w:numId w:val="57"/>
+          <w:numId w:val="59"/>
         </w:numPr>
         <w:spacing w:after="80" w:line="276"/>
       </w:pPr>
@@ -21150,7 +21503,7 @@
         <w:keepLines/>
         <w:numPr>
           <w:ilvl w:val="0"/>
-          <w:numId w:val="57"/>
+          <w:numId w:val="59"/>
         </w:numPr>
         <w:spacing w:after="80" w:line="276"/>
       </w:pPr>
@@ -21182,7 +21535,7 @@
         <w:keepLines/>
         <w:numPr>
           <w:ilvl w:val="0"/>
-          <w:numId w:val="57"/>
+          <w:numId w:val="59"/>
         </w:numPr>
         <w:spacing w:after="160" w:line="276"/>
       </w:pPr>
@@ -21234,7 +21587,7 @@
         <w:keepLines/>
         <w:numPr>
           <w:ilvl w:val="0"/>
-          <w:numId w:val="58"/>
+          <w:numId w:val="60"/>
         </w:numPr>
         <w:spacing w:after="80" w:line="276"/>
       </w:pPr>
@@ -21280,7 +21633,7 @@
         <w:keepLines/>
         <w:numPr>
           <w:ilvl w:val="0"/>
-          <w:numId w:val="58"/>
+          <w:numId w:val="60"/>
         </w:numPr>
         <w:spacing w:after="80" w:line="276"/>
       </w:pPr>
@@ -21312,7 +21665,7 @@
         <w:keepLines/>
         <w:numPr>
           <w:ilvl w:val="0"/>
-          <w:numId w:val="58"/>
+          <w:numId w:val="60"/>
         </w:numPr>
         <w:spacing w:after="80" w:line="276"/>
       </w:pPr>
@@ -21358,7 +21711,7 @@
         <w:keepLines/>
         <w:numPr>
           <w:ilvl w:val="0"/>
-          <w:numId w:val="58"/>
+          <w:numId w:val="60"/>
         </w:numPr>
         <w:spacing w:after="160" w:line="276"/>
       </w:pPr>
@@ -21402,7 +21755,7 @@
         <w:keepLines/>
         <w:numPr>
           <w:ilvl w:val="0"/>
-          <w:numId w:val="59"/>
+          <w:numId w:val="61"/>
         </w:numPr>
         <w:spacing w:after="80" w:line="276"/>
       </w:pPr>
@@ -21448,7 +21801,7 @@
         <w:keepLines/>
         <w:numPr>
           <w:ilvl w:val="0"/>
-          <w:numId w:val="59"/>
+          <w:numId w:val="61"/>
         </w:numPr>
         <w:spacing w:after="80" w:line="276"/>
       </w:pPr>
@@ -21480,7 +21833,7 @@
         <w:keepLines/>
         <w:numPr>
           <w:ilvl w:val="0"/>
-          <w:numId w:val="59"/>
+          <w:numId w:val="61"/>
         </w:numPr>
         <w:spacing w:after="80" w:line="276"/>
       </w:pPr>
@@ -21498,7 +21851,7 @@
         <w:keepLines/>
         <w:numPr>
           <w:ilvl w:val="0"/>
-          <w:numId w:val="59"/>
+          <w:numId w:val="61"/>
         </w:numPr>
         <w:spacing w:after="160" w:line="276"/>
       </w:pPr>
@@ -21550,7 +21903,7 @@
         <w:keepLines/>
         <w:numPr>
           <w:ilvl w:val="0"/>
-          <w:numId w:val="60"/>
+          <w:numId w:val="62"/>
         </w:numPr>
         <w:spacing w:after="80" w:line="276"/>
       </w:pPr>
@@ -21582,7 +21935,7 @@
         <w:keepLines/>
         <w:numPr>
           <w:ilvl w:val="0"/>
-          <w:numId w:val="60"/>
+          <w:numId w:val="62"/>
         </w:numPr>
         <w:spacing w:after="80" w:line="276"/>
       </w:pPr>
@@ -21656,7 +22009,7 @@
         <w:keepLines/>
         <w:numPr>
           <w:ilvl w:val="0"/>
-          <w:numId w:val="60"/>
+          <w:numId w:val="62"/>
         </w:numPr>
         <w:spacing w:after="80" w:line="276"/>
       </w:pPr>
@@ -21702,7 +22055,7 @@
         <w:keepLines/>
         <w:numPr>
           <w:ilvl w:val="0"/>
-          <w:numId w:val="60"/>
+          <w:numId w:val="62"/>
         </w:numPr>
         <w:spacing w:after="80" w:line="276"/>
       </w:pPr>
@@ -21720,7 +22073,7 @@
         <w:keepLines/>
         <w:numPr>
           <w:ilvl w:val="0"/>
-          <w:numId w:val="60"/>
+          <w:numId w:val="62"/>
         </w:numPr>
         <w:spacing w:after="160" w:line="276"/>
       </w:pPr>
@@ -22306,7 +22659,7 @@
         <w:keepLines/>
         <w:numPr>
           <w:ilvl w:val="0"/>
-          <w:numId w:val="61"/>
+          <w:numId w:val="63"/>
         </w:numPr>
         <w:spacing w:after="80" w:line="276"/>
       </w:pPr>
@@ -22366,7 +22719,7 @@
         <w:keepLines/>
         <w:numPr>
           <w:ilvl w:val="0"/>
-          <w:numId w:val="61"/>
+          <w:numId w:val="63"/>
         </w:numPr>
         <w:spacing w:after="80" w:line="276"/>
       </w:pPr>
@@ -22384,7 +22737,7 @@
         <w:keepLines/>
         <w:numPr>
           <w:ilvl w:val="0"/>
-          <w:numId w:val="61"/>
+          <w:numId w:val="63"/>
         </w:numPr>
         <w:spacing w:after="160" w:line="276"/>
       </w:pPr>
@@ -22428,7 +22781,7 @@
         <w:keepLines/>
         <w:numPr>
           <w:ilvl w:val="0"/>
-          <w:numId w:val="62"/>
+          <w:numId w:val="64"/>
         </w:numPr>
         <w:spacing w:after="80" w:line="276"/>
       </w:pPr>
@@ -22474,7 +22827,7 @@
         <w:keepLines/>
         <w:numPr>
           <w:ilvl w:val="0"/>
-          <w:numId w:val="62"/>
+          <w:numId w:val="64"/>
         </w:numPr>
         <w:spacing w:after="80" w:line="276"/>
       </w:pPr>
@@ -22534,7 +22887,7 @@
         <w:keepLines/>
         <w:numPr>
           <w:ilvl w:val="0"/>
-          <w:numId w:val="62"/>
+          <w:numId w:val="64"/>
         </w:numPr>
         <w:spacing w:after="160" w:line="276"/>
       </w:pPr>
@@ -22625,7 +22978,7 @@
         <w:keepLines/>
         <w:numPr>
           <w:ilvl w:val="0"/>
-          <w:numId w:val="63"/>
+          <w:numId w:val="65"/>
         </w:numPr>
         <w:spacing w:after="80" w:line="276"/>
       </w:pPr>
@@ -22657,7 +23010,7 @@
         <w:keepLines/>
         <w:numPr>
           <w:ilvl w:val="0"/>
-          <w:numId w:val="63"/>
+          <w:numId w:val="65"/>
         </w:numPr>
         <w:spacing w:after="80" w:line="276"/>
       </w:pPr>
@@ -22703,7 +23056,7 @@
         <w:keepLines/>
         <w:numPr>
           <w:ilvl w:val="0"/>
-          <w:numId w:val="63"/>
+          <w:numId w:val="65"/>
         </w:numPr>
         <w:spacing w:after="160" w:line="276"/>
       </w:pPr>
@@ -23604,13 +23957,13 @@
     </w:lvlOverride>
   </w:num>
   <w:num w:numId="39">
-    <w:abstractNumId w:val="3"/>
+    <w:abstractNumId w:val="2"/>
     <w:lvlOverride w:ilvl="0">
       <w:startOverride w:val="1"/>
     </w:lvlOverride>
   </w:num>
   <w:num w:numId="40">
-    <w:abstractNumId w:val="2"/>
+    <w:abstractNumId w:val="3"/>
     <w:lvlOverride w:ilvl="0">
       <w:startOverride w:val="1"/>
     </w:lvlOverride>
@@ -23748,6 +24101,18 @@
     </w:lvlOverride>
   </w:num>
   <w:num w:numId="63">
+    <w:abstractNumId w:val="2"/>
+    <w:lvlOverride w:ilvl="0">
+      <w:startOverride w:val="1"/>
+    </w:lvlOverride>
+  </w:num>
+  <w:num w:numId="64">
+    <w:abstractNumId w:val="2"/>
+    <w:lvlOverride w:ilvl="0">
+      <w:startOverride w:val="1"/>
+    </w:lvlOverride>
+  </w:num>
+  <w:num w:numId="65">
     <w:abstractNumId w:val="2"/>
     <w:lvlOverride w:ilvl="0">
       <w:startOverride w:val="1"/>

</xml_diff>

<commit_message>
Ask for a Report: one prompt box with a drop target, and up to five images
The images, the prompt and a bar with the paperclip, the count, the counter, the model and Generate Report now sit in one
box (docs/mockups/ask-for-report-composer.html, option A). Files dragged anywhere over the panel show "Drop images here"
on the box; dropping, the paperclip and pasting all add them. The limit is five images in the browser and on the server,
and a sixth is left out with a note that names it. The help and its Word copies describe the new box.

Co-Authored-By: Claude Opus 5.5 <noreply@anthropic.com>
</commit_message>
<xml_diff>
--- a/docs/manuals/C360_Insights_User_Guide.docx
+++ b/docs/manuals/C360_Insights_User_Guide.docx
@@ -20530,7 +20530,7 @@
         <w:rPr>
           <w:rFonts w:ascii="Arial" w:cs="Arial" w:eastAsia="Arial" w:hAnsi="Arial"/>
         </w:rPr>
-        <w:t xml:space="preserve">Write what you want to see in your own words, pick a model beside Generate, and press </w:t>
+        <w:t xml:space="preserve">Write what you want to see in your own words, pick a model at the bottom of the box, and press </w:t>
       </w:r>
       <w:r>
         <w:rPr>
@@ -20710,21 +20710,21 @@
         <w:rPr>
           <w:rFonts w:ascii="Arial" w:cs="Arial" w:eastAsia="Arial" w:hAnsi="Arial"/>
         </w:rPr>
-        <w:t xml:space="preserve">Add up to three images, whichever way is handiest: press </w:t>
-      </w:r>
-      <w:r>
-        <w:rPr>
-          <w:rFonts w:ascii="Arial" w:cs="Arial" w:eastAsia="Arial" w:hAnsi="Arial"/>
-          <w:b/>
-          <w:bCs/>
-        </w:rPr>
-        <w:t xml:space="preserve">Add Images</w:t>
-      </w:r>
-      <w:r>
-        <w:rPr>
-          <w:rFonts w:ascii="Arial" w:cs="Arial" w:eastAsia="Arial" w:hAnsi="Arial"/>
-        </w:rPr>
-        <w:t xml:space="preserve"> under the box and choose the files; or drag them from your computer and drop them anywhere on the Ask for a Report panel (its border lights up while you drag); or copy an image, such as a screenshot, and paste it into the box with Ctrl+V.</w:t>
+        <w:t xml:space="preserve">Add up to five images, whichever way is handiest: drag them from your computer onto the Ask for a Report panel and let go when the box shows </w:t>
+      </w:r>
+      <w:r>
+        <w:rPr>
+          <w:rFonts w:ascii="Arial" w:cs="Arial" w:eastAsia="Arial" w:hAnsi="Arial"/>
+          <w:b/>
+          <w:bCs/>
+        </w:rPr>
+        <w:t xml:space="preserve">Drop images here</w:t>
+      </w:r>
+      <w:r>
+        <w:rPr>
+          <w:rFonts w:ascii="Arial" w:cs="Arial" w:eastAsia="Arial" w:hAnsi="Arial"/>
+        </w:rPr>
+        <w:t xml:space="preserve">; or press the paperclip at the bottom left of the box and choose the files; or copy an image, such as a screenshot, and paste it into the box with Ctrl+V.</w:t>
       </w:r>
     </w:p>
     <w:p>
@@ -20742,7 +20742,7 @@
         <w:rPr>
           <w:rFonts w:ascii="Arial" w:cs="Arial" w:eastAsia="Arial" w:hAnsi="Arial"/>
         </w:rPr>
-        <w:t xml:space="preserve">Check the thumbnails under the box. The line beside Add Images counts them ("2 of 3"); remove one with its ✕. Once there are three, Add Images is greyed out.</w:t>
+        <w:t xml:space="preserve">Check the thumbnails at the top of the box, each with its file name. The count beside the paperclip says how many there are ("2 of 5"); remove one with its ✕. Once there are five, the paperclip is greyed out, and a sixth image is left out with a note under the box.</w:t>
       </w:r>
     </w:p>
     <w:p>

</xml_diff>

<commit_message>
Report Databases: a read-only account is optional, by a global parameter
insights.report_db_read_only_required (Back-office -> Global parameters -> Insights, yes/no, Yes by default). Yes keeps the
rule: an account that can write is saved but refused until it holds SELECT only. No uses it: Test Connection reads "! Can
write ... Allowed here", Save and Continue is offered, the card shows the warning in amber, and the database can be mapped and
queried. Either way C360 opens every session read-only and runs SELECT only; only the check on the account's grants becomes
optional. A change takes effect within a minute; a connection refused earlier is used once it is tested again.

Patch 0076 adds the parameter (Yes); applied to both databases. Help: Report Databases and the Global parameters table; the
manuals and the Insights guide rebuilt.

Co-Authored-By: Claude Opus 5.5 <noreply@anthropic.com>
</commit_message>
<xml_diff>
--- a/docs/manuals/C360_Insights_User_Guide.docx
+++ b/docs/manuals/C360_Insights_User_Guide.docx
@@ -16940,7 +16940,35 @@
         <w:rPr>
           <w:rFonts w:ascii="Arial" w:cs="Arial" w:eastAsia="Arial" w:hAnsi="Arial"/>
         </w:rPr>
-        <w:t xml:space="preserve">. Four facts come back: reached and the version, what the account can read, whether it is read-only, and the server's time zone. A ✕ on the read-only line names what the account holds beyond SELECT; have the account fixed before mapping anything.</w:t>
+        <w:t xml:space="preserve">. Four facts come back: reached and the version, what the account can read, whether it is read-only, and the server's time zone. A ✕ on the read-only line names what the account holds beyond SELECT; have the account fixed before mapping anything. Where your platform does not require a read-only account (the global parameter </w:t>
+      </w:r>
+      <w:r>
+        <w:rPr>
+          <w:rFonts w:ascii="Arial" w:cs="Arial" w:eastAsia="Arial" w:hAnsi="Arial"/>
+          <w:b/>
+          <w:bCs/>
+        </w:rPr>
+        <w:t xml:space="preserve">insights.report_db_read_only_required</w:t>
+      </w:r>
+      <w:r>
+        <w:rPr>
+          <w:rFonts w:ascii="Arial" w:cs="Arial" w:eastAsia="Arial" w:hAnsi="Arial"/>
+        </w:rPr>
+        <w:t xml:space="preserve"> set to No), the line reads </w:t>
+      </w:r>
+      <w:r>
+        <w:rPr>
+          <w:rFonts w:ascii="Arial" w:cs="Arial" w:eastAsia="Arial" w:hAnsi="Arial"/>
+          <w:b/>
+          <w:bCs/>
+        </w:rPr>
+        <w:t xml:space="preserve">! Can write</w:t>
+      </w:r>
+      <w:r>
+        <w:rPr>
+          <w:rFonts w:ascii="Arial" w:cs="Arial" w:eastAsia="Arial" w:hAnsi="Arial"/>
+        </w:rPr>
+        <w:t xml:space="preserve"> instead and the connection is used as it is.</w:t>
       </w:r>
     </w:p>
     <w:p>
@@ -17345,7 +17373,7 @@
         <w:rPr>
           <w:rFonts w:ascii="Arial" w:cs="Arial" w:eastAsia="Arial" w:hAnsi="Arial"/>
         </w:rPr>
-        <w:t xml:space="preserve"> is offered only once the test shows the account read-only; if it can write, the panel says what it holds and asks for an account that can only read.</w:t>
+        <w:t xml:space="preserve"> is offered once the test passes: the account read-only, or, where read-only is not required, able to write (the panel warns). Where read-only is required and the account can write, the panel says what it holds and asks for an account that can only read.</w:t>
       </w:r>
     </w:p>
     <w:p>

</xml_diff>

<commit_message>
Ask for a Report: Excel workbooks and CSV files as documents
Beside PDF, Word, text and Markdown, a report's spec may now be an Excel workbook (.xlsx, .xlsm) or a CSV file, by paperclip,
drop or paste. A workbook is read with openpyxl (the uploads' reader) sheet by sheet: the values, not the formulas, rows
tab-separated, empty rows left out, 500 rows and 60 columns a sheet at most with a line saying how many rows were left out;
CSV goes as text. An old .xls is refused with "save it as .xlsx", a damaged or protected workbook in words. The note to the model
says a spreadsheet's rows show the layout and the kind of values wanted, never numbers to copy: the report runs on the catalogue's
data. The box shows Excel (XLS) and CSV tiles and names them in its hints. Help and the guides updated.

Co-Authored-By: Claude Opus 5.5 <noreply@anthropic.com>
</commit_message>
<xml_diff>
--- a/docs/manuals/C360_Insights_User_Guide.docx
+++ b/docs/manuals/C360_Insights_User_Guide.docx
@@ -21489,7 +21489,7 @@
         <w:rPr>
           <w:rFonts w:ascii="Arial" w:cs="Arial" w:eastAsia="Arial" w:hAnsi="Arial"/>
         </w:rPr>
-        <w:t xml:space="preserve">Add up to three documents (the report's spec as a PDF, a Word .docx, a text or a Markdown file) and up to five images (PNG, JPEG, GIF or WebP), whichever way is handiest: drag them from your computer onto the Ask for a Report panel and let go when the box shows </w:t>
+        <w:t xml:space="preserve">Add up to three documents (the report's spec as a PDF, a Word .docx, an Excel .xlsx, a CSV, a text or a Markdown file) and up to five images (PNG, JPEG, GIF or WebP), whichever way is handiest: drag them from your computer onto the Ask for a Report panel and let go when the box shows </w:t>
       </w:r>
       <w:r>
         <w:rPr>
@@ -21578,7 +21578,7 @@
         <w:rPr>
           <w:rFonts w:ascii="Arial" w:cs="Arial" w:eastAsia="Arial" w:hAnsi="Arial"/>
         </w:rPr>
-        <w:t xml:space="preserve">A document may be up to 10 MB, PDFs up to 100 pages together, and the documents and images up to 20 MB together. An old Word file (.doc) needs saving as .docx first. A large image is scaled down in your browser before it is sent. Another kind of file is refused with a note under the box. Documents and images are not kept: only your prompt is saved with the draft. The prompt itself may run to 100,000 characters (about 25,000 words); the counter under the box appears from 90,000. A longer spec goes in as a document.</w:t>
+        <w:t xml:space="preserve">A document may be up to 10 MB, PDFs up to 100 pages together, and the documents and images up to 20 MB together. An old Word file (.doc) or Excel file (.xls) needs saving as .docx or .xlsx first. An Excel workbook is read sheet by sheet (the values, not the formulas), up to 500 rows a sheet; the model reads its rows for the layout and the kind of values you want, and the report itself always runs on your data in Insights. A large image is scaled down in your browser before it is sent. Another kind of file is refused with a note under the box. Documents and images are not kept: only your prompt is saved with the draft. The prompt itself may run to 100,000 characters (about 25,000 words); the counter under the box appears from 90,000. A longer spec goes in as a document.</w:t>
       </w:r>
     </w:p>
     <w:p>

</xml_diff>